<commit_message>
feat(manual): enforce textbook chapter contract
</commit_message>
<xml_diff>
--- a/manuals/tools/dist/tools-engineering-design-manual.docx
+++ b/manuals/tools/dist/tools-engineering-design-manual.docx
@@ -56,13 +56,19 @@
         <w:t xml:space="preserve"> </w:t>
       </w:r>
       <w:r>
-        <w:t xml:space="preserve">the stable calculation-pathway registry remains empty. Release remains blocked</w:t>
-      </w:r>
-      <w:r>
-        <w:t xml:space="preserve"> </w:t>
-      </w:r>
-      <w:r>
-        <w:t xml:space="preserve">by TOOLS-D3 through TOOLS-D9. Generated HTML, LaTeX, PDF, and DOCX artifacts</w:t>
+        <w:t xml:space="preserve">the stable calculation-pathway registry remains empty. The required textbook</w:t>
+      </w:r>
+      <w:r>
+        <w:t xml:space="preserve"> </w:t>
+      </w:r>
+      <w:r>
+        <w:t xml:space="preserve">chapter contract is qualified, but no exemplar chapter is registered. Release</w:t>
+      </w:r>
+      <w:r>
+        <w:t xml:space="preserve"> </w:t>
+      </w:r>
+      <w:r>
+        <w:t xml:space="preserve">remains blocked by TOOLS-D4 through TOOLS-D9. Generated HTML, LaTeX, PDF, and DOCX artifacts</w:t>
       </w:r>
       <w:r>
         <w:t xml:space="preserve"> </w:t>
@@ -418,7 +424,7 @@
         <w:t xml:space="preserve"> </w:t>
       </w:r>
       <w:r>
-        <w:t xml:space="preserve">Those pathways remain empty and blocked pending TOOLS-D3 through TOOLS-D9.</w:t>
+        <w:t xml:space="preserve">Those pathways remain empty and blocked pending TOOLS-D4 through TOOLS-D9.</w:t>
       </w:r>
     </w:p>
     <w:bookmarkEnd w:id="25"/>
@@ -529,13 +535,13 @@
         <w:pStyle w:val="BodyText"/>
       </w:pPr>
       <w:r>
-        <w:t xml:space="preserve">At this baseline, 3,434 modules are classified: 808 conservative calculation</w:t>
-      </w:r>
-      <w:r>
-        <w:t xml:space="preserve"> </w:t>
-      </w:r>
-      <w:r>
-        <w:t xml:space="preserve">candidates and 2,626 non-calculation modules. One legacy JavaScript file has a</w:t>
+        <w:t xml:space="preserve">At this baseline, 3,437 modules are classified: 808 conservative calculation</w:t>
+      </w:r>
+      <w:r>
+        <w:t xml:space="preserve"> </w:t>
+      </w:r>
+      <w:r>
+        <w:t xml:space="preserve">candidates and 2,629 non-calculation modules. One legacy JavaScript file has a</w:t>
       </w:r>
       <w:r>
         <w:t xml:space="preserve"> </w:t>
@@ -765,7 +771,13 @@
         <w:t xml:space="preserve"> </w:t>
       </w:r>
       <w:r>
-        <w:t xml:space="preserve">TOOLS-D3 owns stable equation-to-code identities that survive file movement.</w:t>
+        <w:t xml:space="preserve">TOOLS-D3 owns the structural chapter contract; TOOLS-D4 owns exemplar</w:t>
+      </w:r>
+      <w:r>
+        <w:t xml:space="preserve"> </w:t>
+      </w:r>
+      <w:r>
+        <w:t xml:space="preserve">registration and stable equation-to-code identities that survive file movement.</w:t>
       </w:r>
     </w:p>
     <w:bookmarkEnd w:id="28"/>
@@ -1027,22 +1039,13 @@
         <w:t xml:space="preserve"> </w:t>
       </w:r>
       <w:r>
-        <w:t xml:space="preserve">change makes</w:t>
-      </w:r>
-      <w:r>
-        <w:t xml:space="preserve"> </w:t>
-      </w:r>
-      <w:r>
-        <w:rPr>
-          <w:rStyle w:val="VerbatimChar"/>
-        </w:rPr>
-        <w:t xml:space="preserve">--check</w:t>
-      </w:r>
-      <w:r>
-        <w:t xml:space="preserve"> </w:t>
-      </w:r>
-      <w:r>
-        <w:t xml:space="preserve">fail until the manifest is regenerated and reviewed. A</w:t>
+        <w:t xml:space="preserve">change makes inventory check mode fail until the manifest is regenerated and</w:t>
+      </w:r>
+      <w:r>
+        <w:t xml:space="preserve"> </w:t>
+      </w:r>
+      <w:r>
+        <w:t xml:space="preserve">reviewed. A</w:t>
       </w:r>
       <w:r>
         <w:t xml:space="preserve"> </w:t>
@@ -1444,7 +1447,7 @@
     </w:p>
     <w:bookmarkEnd w:id="37"/>
     <w:bookmarkEnd w:id="38"/>
-    <w:bookmarkStart w:id="44" w:name="references"/>
+    <w:bookmarkStart w:id="39" w:name="references"/>
     <w:p>
       <w:pPr>
         <w:pStyle w:val="Heading1"/>
@@ -1453,8 +1456,744 @@
         <w:t xml:space="preserve">References</w:t>
       </w:r>
     </w:p>
-    <w:bookmarkStart w:id="43" w:name="refs"/>
-    <w:bookmarkStart w:id="40" w:name="ref-pandoc-manual"/>
+    <w:bookmarkEnd w:id="39"/>
+    <w:bookmarkStart w:id="51" w:name="required-textbook-chapter-contract"/>
+    <w:p>
+      <w:pPr>
+        <w:pStyle w:val="Heading1"/>
+      </w:pPr>
+      <w:r>
+        <w:t xml:space="preserve">Required Textbook Chapter Contract</w:t>
+      </w:r>
+    </w:p>
+    <w:bookmarkStart w:id="40" w:name="outcome-and-authority-1"/>
+    <w:p>
+      <w:pPr>
+        <w:pStyle w:val="Heading2"/>
+      </w:pPr>
+      <w:r>
+        <w:t xml:space="preserve">Outcome and Authority</w:t>
+      </w:r>
+    </w:p>
+    <w:p>
+      <w:pPr>
+        <w:pStyle w:val="FirstParagraph"/>
+      </w:pPr>
+      <w:r>
+        <w:t xml:space="preserve">TOOLS-D3 defines the public structure that every calculation-level textbook</w:t>
+      </w:r>
+      <w:r>
+        <w:t xml:space="preserve"> </w:t>
+      </w:r>
+      <w:r>
+        <w:t xml:space="preserve">chapter must satisfy before registration. The contract is structural and</w:t>
+      </w:r>
+      <w:r>
+        <w:t xml:space="preserve"> </w:t>
+      </w:r>
+      <w:r>
+        <w:t xml:space="preserve">traceability-focused: passing it does not approve an equation, implementation,</w:t>
+      </w:r>
+      <w:r>
+        <w:t xml:space="preserve"> </w:t>
+      </w:r>
+      <w:r>
+        <w:t xml:space="preserve">dataset, artifact, license, or engineering use. The registry is intentionally</w:t>
+      </w:r>
+      <w:r>
+        <w:t xml:space="preserve"> </w:t>
+      </w:r>
+      <w:r>
+        <w:t xml:space="preserve">empty until TOOLS-D4 supplies reviewed exemplar chapters.</w:t>
+      </w:r>
+    </w:p>
+    <w:p>
+      <w:pPr>
+        <w:pStyle w:val="BodyText"/>
+      </w:pPr>
+      <w:r>
+        <w:t xml:space="preserve">Two version identifiers are fixed:</w:t>
+      </w:r>
+    </w:p>
+    <w:p>
+      <w:pPr>
+        <w:pStyle w:val="Compact"/>
+        <w:numPr>
+          <w:ilvl w:val="0"/>
+          <w:numId w:val="1001"/>
+        </w:numPr>
+      </w:pPr>
+      <w:r>
+        <w:t xml:space="preserve">Contract:</w:t>
+      </w:r>
+      <w:r>
+        <w:t xml:space="preserve"> </w:t>
+      </w:r>
+      <w:r>
+        <w:rPr>
+          <w:rStyle w:val="VerbatimChar"/>
+        </w:rPr>
+        <w:t xml:space="preserve">tools-textbook-chapter-contract/1.0.0</w:t>
+      </w:r>
+    </w:p>
+    <w:p>
+      <w:pPr>
+        <w:pStyle w:val="Compact"/>
+        <w:numPr>
+          <w:ilvl w:val="0"/>
+          <w:numId w:val="1001"/>
+        </w:numPr>
+      </w:pPr>
+      <w:r>
+        <w:t xml:space="preserve">Registry:</w:t>
+      </w:r>
+      <w:r>
+        <w:t xml:space="preserve"> </w:t>
+      </w:r>
+      <w:r>
+        <w:rPr>
+          <w:rStyle w:val="VerbatimChar"/>
+        </w:rPr>
+        <w:t xml:space="preserve">tools-textbook-chapter-registry/1.0.0</w:t>
+      </w:r>
+    </w:p>
+    <w:p>
+      <w:pPr>
+        <w:pStyle w:val="FirstParagraph"/>
+      </w:pPr>
+      <w:r>
+        <w:t xml:space="preserve">Their repository-owned JSON Schemas allow external consumers to validate shape</w:t>
+      </w:r>
+      <w:r>
+        <w:t xml:space="preserve"> </w:t>
+      </w:r>
+      <w:r>
+        <w:t xml:space="preserve">without importing producer code. The Python consumer then applies stricter</w:t>
+      </w:r>
+      <w:r>
+        <w:t xml:space="preserve"> </w:t>
+      </w:r>
+      <w:r>
+        <w:t xml:space="preserve">invariants for normalized paths, ordering, uniqueness, authority state, and QMD</w:t>
+      </w:r>
+      <w:r>
+        <w:t xml:space="preserve"> </w:t>
+      </w:r>
+      <w:r>
+        <w:t xml:space="preserve">content.</w:t>
+      </w:r>
+    </w:p>
+    <w:bookmarkEnd w:id="40"/>
+    <w:bookmarkStart w:id="41" w:name="required-chapter-anatomy"/>
+    <w:p>
+      <w:pPr>
+        <w:pStyle w:val="Heading2"/>
+      </w:pPr>
+      <w:r>
+        <w:t xml:space="preserve">Required Chapter Anatomy</w:t>
+      </w:r>
+    </w:p>
+    <w:p>
+      <w:pPr>
+        <w:pStyle w:val="FirstParagraph"/>
+      </w:pPr>
+      <w:r>
+        <w:t xml:space="preserve">Fourteen ordered sections are mandatory. A registered chapter must present,</w:t>
+      </w:r>
+      <w:r>
+        <w:t xml:space="preserve"> </w:t>
+      </w:r>
+      <w:r>
+        <w:t xml:space="preserve">in order: Purpose and Scope; Design by Contract; Coordinates, Frames, and Time;</w:t>
+      </w:r>
+      <w:r>
+        <w:t xml:space="preserve"> </w:t>
+      </w:r>
+      <w:r>
+        <w:t xml:space="preserve">Units and Dimensions; Derivation and Assumptions; Algorithm; Implementation</w:t>
+      </w:r>
+      <w:r>
+        <w:t xml:space="preserve"> </w:t>
+      </w:r>
+      <w:r>
+        <w:t xml:space="preserve">Symbols; Error and Failure Semantics; Uncertainty and Sensitivity; Verification</w:t>
+      </w:r>
+      <w:r>
+        <w:t xml:space="preserve"> </w:t>
+      </w:r>
+      <w:r>
+        <w:t xml:space="preserve">and Validation; Limits and Applicability; Worked Examples; References and</w:t>
+      </w:r>
+      <w:r>
+        <w:t xml:space="preserve"> </w:t>
+      </w:r>
+      <w:r>
+        <w:t xml:space="preserve">Provenance; and Revision History.</w:t>
+      </w:r>
+    </w:p>
+    <w:p>
+      <w:pPr>
+        <w:pStyle w:val="BodyText"/>
+      </w:pPr>
+      <w:r>
+        <w:t xml:space="preserve">The contract also declares mandatory third-level headings. For example, Design</w:t>
+      </w:r>
+      <w:r>
+        <w:t xml:space="preserve"> </w:t>
+      </w:r>
+      <w:r>
+        <w:t xml:space="preserve">by Contract requires Preconditions, Postconditions, and Invariants. Coordinates</w:t>
+      </w:r>
+      <w:r>
+        <w:t xml:space="preserve"> </w:t>
+      </w:r>
+      <w:r>
+        <w:t xml:space="preserve">requires frame, handedness, and time declarations. Verification and Validation</w:t>
+      </w:r>
+      <w:r>
+        <w:t xml:space="preserve"> </w:t>
+      </w:r>
+      <w:r>
+        <w:t xml:space="preserve">requires test evidence and acceptance criteria. Exact ordered headings remove</w:t>
+      </w:r>
+      <w:r>
+        <w:t xml:space="preserve"> </w:t>
+      </w:r>
+      <w:r>
+        <w:t xml:space="preserve">format-dependent inference and make an omitted obligation a deterministic</w:t>
+      </w:r>
+      <w:r>
+        <w:t xml:space="preserve"> </w:t>
+      </w:r>
+      <w:r>
+        <w:t xml:space="preserve">failure.</w:t>
+      </w:r>
+    </w:p>
+    <w:bookmarkEnd w:id="41"/>
+    <w:bookmarkStart w:id="42" w:name="registration-and-traceability"/>
+    <w:p>
+      <w:pPr>
+        <w:pStyle w:val="Heading2"/>
+      </w:pPr>
+      <w:r>
+        <w:t xml:space="preserve">Registration and Traceability</w:t>
+      </w:r>
+    </w:p>
+    <w:p>
+      <w:pPr>
+        <w:pStyle w:val="FirstParagraph"/>
+      </w:pPr>
+      <w:r>
+        <w:t xml:space="preserve">Each registered chapter has one stable chapter ID and one normalized QMD path.</w:t>
+      </w:r>
+      <w:r>
+        <w:t xml:space="preserve"> </w:t>
+      </w:r>
+      <w:r>
+        <w:t xml:space="preserve">Its descriptor binds the chapter version and provisional authority to an owner,</w:t>
+      </w:r>
+      <w:r>
+        <w:t xml:space="preserve"> </w:t>
+      </w:r>
+      <w:r>
+        <w:t xml:space="preserve">review owner, stable calculation IDs, module IDs, verification tests, source</w:t>
+      </w:r>
+      <w:r>
+        <w:t xml:space="preserve"> </w:t>
+      </w:r>
+      <w:r>
+        <w:t xml:space="preserve">citations, explicit limitations, and revision history. All traceability arrays</w:t>
+      </w:r>
+      <w:r>
+        <w:t xml:space="preserve"> </w:t>
+      </w:r>
+      <w:r>
+        <w:t xml:space="preserve">are non-empty, unique, and sorted; duplicate chapter IDs or paths are rejected.</w:t>
+      </w:r>
+    </w:p>
+    <w:p>
+      <w:pPr>
+        <w:pStyle w:val="BodyText"/>
+      </w:pPr>
+      <w:r>
+        <w:t xml:space="preserve">An</w:t>
+      </w:r>
+      <w:r>
+        <w:t xml:space="preserve"> </w:t>
+      </w:r>
+      <w:r>
+        <w:rPr>
+          <w:rStyle w:val="VerbatimChar"/>
+        </w:rPr>
+        <w:t xml:space="preserve">approved</w:t>
+      </w:r>
+      <w:r>
+        <w:t xml:space="preserve"> </w:t>
+      </w:r>
+      <w:r>
+        <w:t xml:space="preserve">chapter claim is unsupported by this D3 contract because later</w:t>
+      </w:r>
+      <w:r>
+        <w:t xml:space="preserve"> </w:t>
+      </w:r>
+      <w:r>
+        <w:t xml:space="preserve">subepics own page, accessibility, publication, and human-review evidence. D3</w:t>
+      </w:r>
+      <w:r>
+        <w:t xml:space="preserve"> </w:t>
+      </w:r>
+      <w:r>
+        <w:t xml:space="preserve">accepts only</w:t>
+      </w:r>
+      <w:r>
+        <w:t xml:space="preserve"> </w:t>
+      </w:r>
+      <w:r>
+        <w:rPr>
+          <w:rStyle w:val="VerbatimChar"/>
+        </w:rPr>
+        <w:t xml:space="preserve">provisional</w:t>
+      </w:r>
+      <w:r>
+        <w:t xml:space="preserve"> </w:t>
+      </w:r>
+      <w:r>
+        <w:t xml:space="preserve">and</w:t>
+      </w:r>
+      <w:r>
+        <w:t xml:space="preserve"> </w:t>
+      </w:r>
+      <w:r>
+        <w:rPr>
+          <w:rStyle w:val="VerbatimChar"/>
+        </w:rPr>
+        <w:t xml:space="preserve">verified-unapproved</w:t>
+      </w:r>
+      <w:r>
+        <w:t xml:space="preserve"> </w:t>
+      </w:r>
+      <w:r>
+        <w:t xml:space="preserve">chapter descriptors. The</w:t>
+      </w:r>
+      <w:r>
+        <w:t xml:space="preserve"> </w:t>
+      </w:r>
+      <w:r>
+        <w:t xml:space="preserve">manual and every generated representation therefore remain</w:t>
+      </w:r>
+      <w:r>
+        <w:t xml:space="preserve"> </w:t>
+      </w:r>
+      <w:r>
+        <w:rPr>
+          <w:rStyle w:val="VerbatimChar"/>
+        </w:rPr>
+        <w:t xml:space="preserve">generated-unapproved</w:t>
+      </w:r>
+      <w:r>
+        <w:t xml:space="preserve">.</w:t>
+      </w:r>
+    </w:p>
+    <w:bookmarkEnd w:id="42"/>
+    <w:bookmarkStart w:id="43" w:name="linter-algorithm-and-evidence"/>
+    <w:p>
+      <w:pPr>
+        <w:pStyle w:val="Heading2"/>
+      </w:pPr>
+      <w:r>
+        <w:t xml:space="preserve">Linter Algorithm and Evidence</w:t>
+      </w:r>
+    </w:p>
+    <w:p>
+      <w:pPr>
+        <w:pStyle w:val="FirstParagraph"/>
+      </w:pPr>
+      <w:r>
+        <w:t xml:space="preserve">The linter loads the contract and registry through strict typed consumers,</w:t>
+      </w:r>
+      <w:r>
+        <w:t xml:space="preserve"> </w:t>
+      </w:r>
+      <w:r>
+        <w:t xml:space="preserve">resolves each registered path beneath</w:t>
+      </w:r>
+      <w:r>
+        <w:t xml:space="preserve"> </w:t>
+      </w:r>
+      <w:r>
+        <w:rPr>
+          <w:rStyle w:val="VerbatimChar"/>
+        </w:rPr>
+        <w:t xml:space="preserve">manuals/tools/chapters</w:t>
+      </w:r>
+      <w:r>
+        <w:t xml:space="preserve">, decodes UTF-8,</w:t>
+      </w:r>
+      <w:r>
+        <w:t xml:space="preserve"> </w:t>
+      </w:r>
+      <w:r>
+        <w:t xml:space="preserve">and rejects forbidden placeholder or private-source tokens. It extracts level-2</w:t>
+      </w:r>
+      <w:r>
+        <w:t xml:space="preserve"> </w:t>
+      </w:r>
+      <w:r>
+        <w:t xml:space="preserve">and level-3 headings, compares them with the exact ordered contract, and checks</w:t>
+      </w:r>
+      <w:r>
+        <w:t xml:space="preserve"> </w:t>
+      </w:r>
+      <w:r>
+        <w:t xml:space="preserve">that every required section has governed body content.</w:t>
+      </w:r>
+    </w:p>
+    <w:p>
+      <w:pPr>
+        <w:pStyle w:val="BodyText"/>
+      </w:pPr>
+      <w:r>
+        <w:t xml:space="preserve">For normalized chapter text</w:t>
+      </w:r>
+      <w:r>
+        <w:t xml:space="preserve"> </w:t>
+      </w:r>
+      <m:oMath>
+        <m:r>
+          <m:t>T</m:t>
+        </m:r>
+      </m:oMath>
+      <w:r>
+        <w:t xml:space="preserve"> </w:t>
+      </w:r>
+      <w:r>
+        <w:t xml:space="preserve">and ordered section blocks</w:t>
+      </w:r>
+      <w:r>
+        <w:t xml:space="preserve"> </w:t>
+      </w:r>
+      <m:oMath>
+        <m:sSub>
+          <m:e>
+            <m:r>
+              <m:t>S</m:t>
+            </m:r>
+          </m:e>
+          <m:sub>
+            <m:r>
+              <m:t>i</m:t>
+            </m:r>
+          </m:sub>
+        </m:sSub>
+      </m:oMath>
+      <w:r>
+        <w:t xml:space="preserve">, the linter</w:t>
+      </w:r>
+      <w:r>
+        <w:t xml:space="preserve"> </w:t>
+      </w:r>
+      <w:r>
+        <w:t xml:space="preserve">records deterministic evidence as</w:t>
+      </w:r>
+    </w:p>
+    <w:p>
+      <w:pPr>
+        <w:pStyle w:val="BodyText"/>
+      </w:pPr>
+      <m:oMathPara>
+        <m:oMathParaPr>
+          <m:jc m:val="center"/>
+        </m:oMathParaPr>
+        <m:oMath>
+          <m:sSub>
+            <m:e>
+              <m:r>
+                <m:t>h</m:t>
+              </m:r>
+            </m:e>
+            <m:sub>
+              <m:r>
+                <m:t>T</m:t>
+              </m:r>
+            </m:sub>
+          </m:sSub>
+          <m:r>
+            <m:rPr>
+              <m:sty m:val="p"/>
+            </m:rPr>
+            <m:t>=</m:t>
+          </m:r>
+          <m:r>
+            <m:rPr>
+              <m:sty m:val="p"/>
+            </m:rPr>
+            <m:t>SHA256</m:t>
+          </m:r>
+          <m:r>
+            <m:rPr>
+              <m:sty m:val="p"/>
+            </m:rPr>
+            <m:t>(</m:t>
+          </m:r>
+          <m:r>
+            <m:rPr>
+              <m:sty m:val="p"/>
+            </m:rPr>
+            <m:t>LF</m:t>
+          </m:r>
+          <m:r>
+            <m:rPr>
+              <m:sty m:val="p"/>
+            </m:rPr>
+            <m:t>(</m:t>
+          </m:r>
+          <m:r>
+            <m:t>T</m:t>
+          </m:r>
+          <m:r>
+            <m:rPr>
+              <m:sty m:val="p"/>
+            </m:rPr>
+            <m:t>)</m:t>
+          </m:r>
+          <m:r>
+            <m:rPr>
+              <m:sty m:val="p"/>
+            </m:rPr>
+            <m:t>)</m:t>
+          </m:r>
+          <m:r>
+            <m:rPr>
+              <m:sty m:val="p"/>
+            </m:rPr>
+            <m:t>,</m:t>
+          </m:r>
+          <m:r>
+            <m:t>  </m:t>
+          </m:r>
+          <m:sSub>
+            <m:e>
+              <m:r>
+                <m:t>h</m:t>
+              </m:r>
+            </m:e>
+            <m:sub>
+              <m:r>
+                <m:t>i</m:t>
+              </m:r>
+            </m:sub>
+          </m:sSub>
+          <m:r>
+            <m:rPr>
+              <m:sty m:val="p"/>
+            </m:rPr>
+            <m:t>=</m:t>
+          </m:r>
+          <m:r>
+            <m:rPr>
+              <m:sty m:val="p"/>
+            </m:rPr>
+            <m:t>SHA256</m:t>
+          </m:r>
+          <m:r>
+            <m:rPr>
+              <m:sty m:val="p"/>
+            </m:rPr>
+            <m:t>(</m:t>
+          </m:r>
+          <m:r>
+            <m:rPr>
+              <m:sty m:val="p"/>
+            </m:rPr>
+            <m:t>LF</m:t>
+          </m:r>
+          <m:r>
+            <m:rPr>
+              <m:sty m:val="p"/>
+            </m:rPr>
+            <m:t>(</m:t>
+          </m:r>
+          <m:sSub>
+            <m:e>
+              <m:r>
+                <m:t>S</m:t>
+              </m:r>
+            </m:e>
+            <m:sub>
+              <m:r>
+                <m:t>i</m:t>
+              </m:r>
+            </m:sub>
+          </m:sSub>
+          <m:r>
+            <m:rPr>
+              <m:sty m:val="p"/>
+            </m:rPr>
+            <m:t>)</m:t>
+          </m:r>
+          <m:r>
+            <m:rPr>
+              <m:sty m:val="p"/>
+            </m:rPr>
+            <m:t>)</m:t>
+          </m:r>
+          <m:r>
+            <m:rPr>
+              <m:sty m:val="p"/>
+            </m:rPr>
+            <m:t>.</m:t>
+          </m:r>
+        </m:oMath>
+      </m:oMathPara>
+    </w:p>
+    <w:p>
+      <w:pPr>
+        <w:pStyle w:val="FirstParagraph"/>
+      </w:pPr>
+      <w:r>
+        <w:t xml:space="preserve">These hashes detect byte-level content drift while remaining independent of</w:t>
+      </w:r>
+      <w:r>
+        <w:t xml:space="preserve"> </w:t>
+      </w:r>
+      <w:r>
+        <w:t xml:space="preserve">Windows or POSIX checkout line endings. They are lint evidence, not scientific</w:t>
+      </w:r>
+      <w:r>
+        <w:t xml:space="preserve"> </w:t>
+      </w:r>
+      <w:r>
+        <w:t xml:space="preserve">approval or an immutable publication digest.</w:t>
+      </w:r>
+    </w:p>
+    <w:bookmarkEnd w:id="43"/>
+    <w:bookmarkStart w:id="44" w:name="failure-and-ownership-boundaries"/>
+    <w:p>
+      <w:pPr>
+        <w:pStyle w:val="Heading2"/>
+      </w:pPr>
+      <w:r>
+        <w:t xml:space="preserve">Failure and Ownership Boundaries</w:t>
+      </w:r>
+    </w:p>
+    <w:p>
+      <w:pPr>
+        <w:pStyle w:val="FirstParagraph"/>
+      </w:pPr>
+      <w:r>
+        <w:t xml:space="preserve">Missing files, invalid UTF-8, unsafe paths, unknown fields or versions, duplicate</w:t>
+      </w:r>
+      <w:r>
+        <w:t xml:space="preserve"> </w:t>
+      </w:r>
+      <w:r>
+        <w:t xml:space="preserve">identities, unsorted traceability, missing or reordered headings, empty governed</w:t>
+      </w:r>
+      <w:r>
+        <w:t xml:space="preserve"> </w:t>
+      </w:r>
+      <w:r>
+        <w:t xml:space="preserve">content, placeholders, private-source references, unsupported status promotion,</w:t>
+      </w:r>
+      <w:r>
+        <w:t xml:space="preserve"> </w:t>
+      </w:r>
+      <w:r>
+        <w:t xml:space="preserve">and stale generated artifacts all fail closed. The linter does not synthesize</w:t>
+      </w:r>
+      <w:r>
+        <w:t xml:space="preserve"> </w:t>
+      </w:r>
+      <w:r>
+        <w:t xml:space="preserve">equations, units, sources, examples, tests, or limitations.</w:t>
+      </w:r>
+    </w:p>
+    <w:p>
+      <w:pPr>
+        <w:pStyle w:val="BodyText"/>
+      </w:pPr>
+      <w:r>
+        <w:t xml:space="preserve">TOOLS-D4 owns exemplar chapter registration. TOOLS-D5 expands phased module</w:t>
+      </w:r>
+      <w:r>
+        <w:t xml:space="preserve"> </w:t>
+      </w:r>
+      <w:r>
+        <w:t xml:space="preserve">coverage, TOOLS-D6 owns executable freshness, TOOLS-D7 owns rendered and</w:t>
+      </w:r>
+      <w:r>
+        <w:t xml:space="preserve"> </w:t>
+      </w:r>
+      <w:r>
+        <w:t xml:space="preserve">accessibility review, and TOOLS-D8 owns immutable public projection and human</w:t>
+      </w:r>
+      <w:r>
+        <w:t xml:space="preserve"> </w:t>
+      </w:r>
+      <w:r>
+        <w:t xml:space="preserve">approval.</w:t>
+      </w:r>
+    </w:p>
+    <w:bookmarkEnd w:id="44"/>
+    <w:bookmarkStart w:id="50" w:name="consumer-workflow"/>
+    <w:p>
+      <w:pPr>
+        <w:pStyle w:val="Heading2"/>
+      </w:pPr>
+      <w:r>
+        <w:t xml:space="preserve">Consumer Workflow</w:t>
+      </w:r>
+    </w:p>
+    <w:p>
+      <w:pPr>
+        <w:pStyle w:val="FirstParagraph"/>
+      </w:pPr>
+      <w:r>
+        <w:t xml:space="preserve">Authors edit only canonical QMD and the machine-readable chapter registry. Run</w:t>
+      </w:r>
+      <w:r>
+        <w:t xml:space="preserve"> </w:t>
+      </w:r>
+      <w:r>
+        <w:t xml:space="preserve">these commands in order:</w:t>
+      </w:r>
+    </w:p>
+    <w:p>
+      <w:pPr>
+        <w:pStyle w:val="SourceCode"/>
+      </w:pPr>
+      <w:r>
+        <w:rPr>
+          <w:rStyle w:val="VerbatimChar"/>
+        </w:rPr>
+        <w:t xml:space="preserve">python -m scripts.lint_tools_textbook_chapters</w:t>
+      </w:r>
+      <w:r>
+        <w:br/>
+      </w:r>
+      <w:r>
+        <w:rPr>
+          <w:rStyle w:val="VerbatimChar"/>
+        </w:rPr>
+        <w:t xml:space="preserve">python -m scripts.render_tools_design_manual --render</w:t>
+      </w:r>
+    </w:p>
+    <w:p>
+      <w:pPr>
+        <w:pStyle w:val="FirstParagraph"/>
+      </w:pPr>
+      <w:r>
+        <w:t xml:space="preserve">They regenerate and check all four representations. The combined governance,</w:t>
+      </w:r>
+      <w:r>
+        <w:t xml:space="preserve"> </w:t>
+      </w:r>
+      <w:r>
+        <w:t xml:space="preserve">inventory, chapter, and artifact freshness gates must pass before review.</w:t>
+      </w:r>
+    </w:p>
+    <w:bookmarkStart w:id="49" w:name="refs"/>
+    <w:bookmarkStart w:id="46" w:name="ref-pandoc-manual"/>
     <w:p>
       <w:pPr>
         <w:pStyle w:val="Bibliography"/>
@@ -1478,7 +2217,7 @@
       <w:r>
         <w:t xml:space="preserve"> </w:t>
       </w:r>
-      <w:hyperlink r:id="rId39">
+      <w:hyperlink r:id="rId45">
         <w:r>
           <w:rPr>
             <w:rStyle w:val="Hyperlink"/>
@@ -1490,8 +2229,8 @@
         <w:t xml:space="preserve">.</w:t>
       </w:r>
     </w:p>
-    <w:bookmarkEnd w:id="40"/>
-    <w:bookmarkStart w:id="42" w:name="ref-quarto-guide"/>
+    <w:bookmarkEnd w:id="46"/>
+    <w:bookmarkStart w:id="48" w:name="ref-quarto-guide"/>
     <w:p>
       <w:pPr>
         <w:pStyle w:val="Bibliography"/>
@@ -1515,7 +2254,7 @@
       <w:r>
         <w:t xml:space="preserve"> </w:t>
       </w:r>
-      <w:hyperlink r:id="rId41">
+      <w:hyperlink r:id="rId47">
         <w:r>
           <w:rPr>
             <w:rStyle w:val="Hyperlink"/>
@@ -1527,9 +2266,10 @@
         <w:t xml:space="preserve">.</w:t>
       </w:r>
     </w:p>
-    <w:bookmarkEnd w:id="42"/>
-    <w:bookmarkEnd w:id="43"/>
-    <w:bookmarkEnd w:id="44"/>
+    <w:bookmarkEnd w:id="48"/>
+    <w:bookmarkEnd w:id="49"/>
+    <w:bookmarkEnd w:id="50"/>
+    <w:bookmarkEnd w:id="51"/>
     <w:sectPr>
       <w:headerReference r:id="rId9" w:type="default"/>
       <w:footerReference r:id="rId10" w:type="default"/>
@@ -1845,6 +2585,109 @@
       </w:pPr>
     </w:lvl>
   </w:abstractNum>
+  <w:abstractNum w:abstractNumId="991">
+    <w:nsid w:val="0000A991"/>
+    <w:multiLevelType w:val="multilevel"/>
+    <w:lvl w:ilvl="0">
+      <w:numFmt w:val="bullet"/>
+      <w:lvlText w:val=""/>
+      <w:lvlJc w:val="left"/>
+      <w:pPr>
+        <w:ind w:left="720" w:hanging="360"/>
+      </w:pPr>
+      <w:rPr>
+        <w:rFonts w:ascii="Symbol" w:hAnsi="Symbol" w:cs="Symbol" w:hint="default"/>
+      </w:rPr>
+    </w:lvl>
+    <w:lvl w:ilvl="1">
+      <w:numFmt w:val="bullet"/>
+      <w:lvlText w:val="o"/>
+      <w:lvlJc w:val="left"/>
+      <w:pPr>
+        <w:ind w:left="1440" w:hanging="360"/>
+      </w:pPr>
+      <w:rPr>
+        <w:rFonts w:ascii="Courier New" w:hAnsi="Courier New" w:cs="Courier New" w:hint="default"/>
+      </w:rPr>
+    </w:lvl>
+    <w:lvl w:ilvl="2">
+      <w:numFmt w:val="bullet"/>
+      <w:lvlText w:val=""/>
+      <w:lvlJc w:val="left"/>
+      <w:pPr>
+        <w:ind w:left="2160" w:hanging="360"/>
+      </w:pPr>
+      <w:rPr>
+        <w:rFonts w:ascii="Wingdings" w:hAnsi="Wingdings" w:cs="Wingdings" w:hint="default"/>
+      </w:rPr>
+    </w:lvl>
+    <w:lvl w:ilvl="3">
+      <w:numFmt w:val="bullet"/>
+      <w:lvlText w:val=""/>
+      <w:lvlJc w:val="left"/>
+      <w:pPr>
+        <w:ind w:left="2880" w:hanging="360"/>
+      </w:pPr>
+      <w:rPr>
+        <w:rFonts w:ascii="Symbol" w:hAnsi="Symbol" w:cs="Symbol" w:hint="default"/>
+      </w:rPr>
+    </w:lvl>
+    <w:lvl w:ilvl="4">
+      <w:numFmt w:val="bullet"/>
+      <w:lvlText w:val="o"/>
+      <w:lvlJc w:val="left"/>
+      <w:pPr>
+        <w:ind w:left="3600" w:hanging="360"/>
+      </w:pPr>
+      <w:rPr>
+        <w:rFonts w:ascii="Courier New" w:hAnsi="Courier New" w:cs="Courier New" w:hint="default"/>
+      </w:rPr>
+    </w:lvl>
+    <w:lvl w:ilvl="5">
+      <w:numFmt w:val="bullet"/>
+      <w:lvlText w:val=""/>
+      <w:lvlJc w:val="left"/>
+      <w:pPr>
+        <w:ind w:left="4320" w:hanging="360"/>
+      </w:pPr>
+      <w:rPr>
+        <w:rFonts w:ascii="Wingdings" w:hAnsi="Wingdings" w:cs="Wingdings" w:hint="default"/>
+      </w:rPr>
+    </w:lvl>
+    <w:lvl w:ilvl="6">
+      <w:numFmt w:val="bullet"/>
+      <w:lvlText w:val=""/>
+      <w:lvlJc w:val="left"/>
+      <w:pPr>
+        <w:ind w:left="5040" w:hanging="360"/>
+      </w:pPr>
+      <w:rPr>
+        <w:rFonts w:ascii="Symbol" w:hAnsi="Symbol" w:cs="Symbol" w:hint="default"/>
+      </w:rPr>
+    </w:lvl>
+    <w:lvl w:ilvl="7">
+      <w:numFmt w:val="bullet"/>
+      <w:lvlText w:val="o"/>
+      <w:lvlJc w:val="left"/>
+      <w:pPr>
+        <w:ind w:left="5760" w:hanging="360"/>
+      </w:pPr>
+      <w:rPr>
+        <w:rFonts w:ascii="Courier New" w:hAnsi="Courier New" w:cs="Courier New" w:hint="default"/>
+      </w:rPr>
+    </w:lvl>
+    <w:lvl w:ilvl="8">
+      <w:numFmt w:val="bullet"/>
+      <w:lvlText w:val=""/>
+      <w:lvlJc w:val="left"/>
+      <w:pPr>
+        <w:ind w:left="6480" w:hanging="360"/>
+      </w:pPr>
+      <w:rPr>
+        <w:rFonts w:ascii="Wingdings" w:hAnsi="Wingdings" w:cs="Wingdings" w:hint="default"/>
+      </w:rPr>
+    </w:lvl>
+  </w:abstractNum>
   <w:num w:numId="1">
     <w:abstractNumId w:val="8"/>
   </w:num>
@@ -1874,6 +2717,9 @@
   </w:num>
   <w:num w:numId="1000">
     <w:abstractNumId w:val="990"/>
+  </w:num>
+  <w:num w:numId="1001">
+    <w:abstractNumId w:val="991"/>
   </w:num>
 </w:numbering>
 </file>

</xml_diff>

<commit_message>
feat(docs): add D4 exemplar manuals
</commit_message>
<xml_diff>
--- a/manuals/tools/dist/tools-engineering-design-manual.docx
+++ b/manuals/tools/dist/tools-engineering-design-manual.docx
@@ -50,37 +50,49 @@
         <w:t xml:space="preserve"> </w:t>
       </w:r>
       <w:r>
-        <w:t xml:space="preserve">denominator, but all detected calculation candidates remain provisional and</w:t>
-      </w:r>
-      <w:r>
-        <w:t xml:space="preserve"> </w:t>
-      </w:r>
-      <w:r>
-        <w:t xml:space="preserve">the stable calculation-pathway registry remains empty. The required textbook</w:t>
-      </w:r>
-      <w:r>
-        <w:t xml:space="preserve"> </w:t>
-      </w:r>
-      <w:r>
-        <w:t xml:space="preserve">chapter contract is qualified, but no exemplar chapter is registered. Release</w:t>
-      </w:r>
-      <w:r>
-        <w:t xml:space="preserve"> </w:t>
-      </w:r>
-      <w:r>
-        <w:t xml:space="preserve">remains blocked by TOOLS-D4 through TOOLS-D9. Generated HTML, LaTeX, PDF, and DOCX artifacts</w:t>
-      </w:r>
-      <w:r>
-        <w:t xml:space="preserve"> </w:t>
-      </w:r>
-      <w:r>
-        <w:t xml:space="preserve">are reproducible engineering records under TOOLS-D2, but none is approved for</w:t>
-      </w:r>
-      <w:r>
-        <w:t xml:space="preserve"> </w:t>
-      </w:r>
-      <w:r>
-        <w:t xml:space="preserve">publication or engineering use.</w:t>
+        <w:t xml:space="preserve">denominator. TOOLS-D4 registers one model-conditioned D-plane calculation and</w:t>
+      </w:r>
+      <w:r>
+        <w:t xml:space="preserve"> </w:t>
+      </w:r>
+      <w:r>
+        <w:t xml:space="preserve">one swing/Rate-of-Closure textbook exemplar with exact source, consumer, test,</w:t>
+      </w:r>
+      <w:r>
+        <w:t xml:space="preserve"> </w:t>
+      </w:r>
+      <w:r>
+        <w:t xml:space="preserve">fixture, equation, unit, and limitation traceability. The markerless-mocap</w:t>
+      </w:r>
+      <w:r>
+        <w:t xml:space="preserve"> </w:t>
+      </w:r>
+      <w:r>
+        <w:t xml:space="preserve">exemplar remains explicitly blocked because its authority PR is unmerged and no</w:t>
+      </w:r>
+      <w:r>
+        <w:t xml:space="preserve"> </w:t>
+      </w:r>
+      <w:r>
+        <w:t xml:space="preserve">markerless module exists on this exact source base. Release remains blocked by</w:t>
+      </w:r>
+      <w:r>
+        <w:t xml:space="preserve"> </w:t>
+      </w:r>
+      <w:r>
+        <w:t xml:space="preserve">TOOLS-D5 through TOOLS-D9 and outstanding D4 approvals. Generated HTML, LaTeX,</w:t>
+      </w:r>
+      <w:r>
+        <w:t xml:space="preserve"> </w:t>
+      </w:r>
+      <w:r>
+        <w:t xml:space="preserve">PDF, and DOCX artifacts are reproducible engineering records under TOOLS-D2,</w:t>
+      </w:r>
+      <w:r>
+        <w:t xml:space="preserve"> </w:t>
+      </w:r>
+      <w:r>
+        <w:t xml:space="preserve">but none is approved for publication or engineering use.</w:t>
       </w:r>
     </w:p>
     <w:bookmarkEnd w:id="19"/>
@@ -424,7 +436,31 @@
         <w:t xml:space="preserve"> </w:t>
       </w:r>
       <w:r>
-        <w:t xml:space="preserve">Those pathways remain empty and blocked pending TOOLS-D4 through TOOLS-D9.</w:t>
+        <w:t xml:space="preserve">TOOLS-D4 registers one model-conditioned D-plane exemplar with explicit</w:t>
+      </w:r>
+      <w:r>
+        <w:t xml:space="preserve"> </w:t>
+      </w:r>
+      <w:r>
+        <w:t xml:space="preserve">equation-to-code-to-test evidence while retaining review-required inventory</w:t>
+      </w:r>
+      <w:r>
+        <w:t xml:space="preserve"> </w:t>
+      </w:r>
+      <w:r>
+        <w:t xml:space="preserve">authority. The markerless-mocap exemplar remains fail-closed because its source</w:t>
+      </w:r>
+      <w:r>
+        <w:t xml:space="preserve"> </w:t>
+      </w:r>
+      <w:r>
+        <w:t xml:space="preserve">dependency is unmerged. Expansion, executable freshness, review, publication,</w:t>
+      </w:r>
+      <w:r>
+        <w:t xml:space="preserve"> </w:t>
+      </w:r>
+      <w:r>
+        <w:t xml:space="preserve">and human approval remain blocked under TOOLS-D5 through TOOLS-D9.</w:t>
       </w:r>
     </w:p>
     <w:bookmarkEnd w:id="25"/>
@@ -535,13 +571,13 @@
         <w:pStyle w:val="BodyText"/>
       </w:pPr>
       <w:r>
-        <w:t xml:space="preserve">At this baseline, 3,437 modules are classified: 808 conservative calculation</w:t>
-      </w:r>
-      <w:r>
-        <w:t xml:space="preserve"> </w:t>
-      </w:r>
-      <w:r>
-        <w:t xml:space="preserve">candidates and 2,629 non-calculation modules. One legacy JavaScript file has a</w:t>
+        <w:t xml:space="preserve">At this baseline, 3,439 modules are classified: 808 conservative calculation</w:t>
+      </w:r>
+      <w:r>
+        <w:t xml:space="preserve"> </w:t>
+      </w:r>
+      <w:r>
+        <w:t xml:space="preserve">candidates and 2,631 non-calculation modules. One legacy JavaScript file has a</w:t>
       </w:r>
       <w:r>
         <w:t xml:space="preserve"> </w:t>
@@ -1214,7 +1250,7 @@
       <w:r>
         <w:drawing>
           <wp:inline>
-            <wp:extent cx="4754880" cy="2318004"/>
+            <wp:extent cx="4160520" cy="2028253"/>
             <wp:effectExtent b="0" l="0" r="0" t="0"/>
             <wp:docPr descr="Deterministic rendering pathway." title="" id="33" name="Picture"/>
             <a:graphic>
@@ -1235,7 +1271,7 @@
                   <pic:spPr bwMode="auto">
                     <a:xfrm>
                       <a:off x="0" y="0"/>
-                      <a:ext cx="4754880" cy="2318004"/>
+                      <a:ext cx="4160520" cy="2028253"/>
                     </a:xfrm>
                     <a:prstGeom prst="rect">
                       <a:avLst/>
@@ -1456,8 +1492,28 @@
         <w:t xml:space="preserve">References</w:t>
       </w:r>
     </w:p>
+    <w:p>
+      <w:pPr>
+        <w:pStyle w:val="FirstParagraph"/>
+      </w:pPr>
+      <w:r>
+        <w:t xml:space="preserve">The cited Pandoc and Quarto records are resolved from the governed bibliography</w:t>
+      </w:r>
+      <w:r>
+        <w:t xml:space="preserve"> </w:t>
+      </w:r>
+      <w:r>
+        <w:t xml:space="preserve">declared by the pinned toolchain contract; an unresolved citation fails the</w:t>
+      </w:r>
+      <w:r>
+        <w:t xml:space="preserve"> </w:t>
+      </w:r>
+      <w:r>
+        <w:t xml:space="preserve">qualified render.</w:t>
+      </w:r>
+    </w:p>
     <w:bookmarkEnd w:id="39"/>
-    <w:bookmarkStart w:id="51" w:name="required-textbook-chapter-contract"/>
+    <w:bookmarkStart w:id="46" w:name="required-textbook-chapter-contract"/>
     <w:p>
       <w:pPr>
         <w:pStyle w:val="Heading1"/>
@@ -1498,13 +1554,19 @@
         <w:t xml:space="preserve"> </w:t>
       </w:r>
       <w:r>
-        <w:t xml:space="preserve">dataset, artifact, license, or engineering use. The registry is intentionally</w:t>
-      </w:r>
-      <w:r>
-        <w:t xml:space="preserve"> </w:t>
-      </w:r>
-      <w:r>
-        <w:t xml:space="preserve">empty until TOOLS-D4 supplies reviewed exemplar chapters.</w:t>
+        <w:t xml:space="preserve">dataset, artifact, license, or engineering use. TOOLS-D4 now registers one</w:t>
+      </w:r>
+      <w:r>
+        <w:t xml:space="preserve"> </w:t>
+      </w:r>
+      <w:r>
+        <w:t xml:space="preserve">verified-unapproved swing and Rate-of-Closure exemplar; missing markerless</w:t>
+      </w:r>
+      <w:r>
+        <w:t xml:space="preserve"> </w:t>
+      </w:r>
+      <w:r>
+        <w:t xml:space="preserve">authority remains an explicit blocker rather than an inferred calculation.</w:t>
       </w:r>
     </w:p>
     <w:p>
@@ -2113,7 +2175,13 @@
         <w:pStyle w:val="BodyText"/>
       </w:pPr>
       <w:r>
-        <w:t xml:space="preserve">TOOLS-D4 owns exemplar chapter registration. TOOLS-D5 expands phased module</w:t>
+        <w:t xml:space="preserve">TOOLS-D4 owns exemplar chapter registration and its fail-closed dependency</w:t>
+      </w:r>
+      <w:r>
+        <w:t xml:space="preserve"> </w:t>
+      </w:r>
+      <w:r>
+        <w:t xml:space="preserve">coverage. TOOLS-D5 expands phased module</w:t>
       </w:r>
       <w:r>
         <w:t xml:space="preserve"> </w:t>
@@ -2135,7 +2203,7 @@
       </w:r>
     </w:p>
     <w:bookmarkEnd w:id="44"/>
-    <w:bookmarkStart w:id="50" w:name="consumer-workflow"/>
+    <w:bookmarkStart w:id="45" w:name="consumer-workflow"/>
     <w:p>
       <w:pPr>
         <w:pStyle w:val="Heading2"/>
@@ -2160,40 +2228,4329 @@
     </w:p>
     <w:p>
       <w:pPr>
-        <w:pStyle w:val="SourceCode"/>
+        <w:pStyle w:val="Compact"/>
+        <w:numPr>
+          <w:ilvl w:val="0"/>
+          <w:numId w:val="1002"/>
+        </w:numPr>
       </w:pPr>
       <w:r>
         <w:rPr>
           <w:rStyle w:val="VerbatimChar"/>
         </w:rPr>
-        <w:t xml:space="preserve">python -m scripts.lint_tools_textbook_chapters</w:t>
-      </w:r>
-      <w:r>
-        <w:br/>
+        <w:t xml:space="preserve">python -m</w:t>
+      </w:r>
+      <w:r>
+        <w:t xml:space="preserve"> </w:t>
       </w:r>
       <w:r>
         <w:rPr>
           <w:rStyle w:val="VerbatimChar"/>
         </w:rPr>
-        <w:t xml:space="preserve">python -m scripts.render_tools_design_manual --render</w:t>
+        <w:t xml:space="preserve">scripts.lint_tools_textbook_chapters</w:t>
       </w:r>
     </w:p>
     <w:p>
       <w:pPr>
+        <w:pStyle w:val="Compact"/>
+        <w:numPr>
+          <w:ilvl w:val="0"/>
+          <w:numId w:val="1002"/>
+        </w:numPr>
+      </w:pPr>
+      <w:r>
+        <w:rPr>
+          <w:rStyle w:val="VerbatimChar"/>
+        </w:rPr>
+        <w:t xml:space="preserve">python -m</w:t>
+      </w:r>
+      <w:r>
+        <w:t xml:space="preserve"> </w:t>
+      </w:r>
+      <w:r>
+        <w:rPr>
+          <w:rStyle w:val="VerbatimChar"/>
+        </w:rPr>
+        <w:t xml:space="preserve">scripts.check_tools_exemplars</w:t>
+      </w:r>
+    </w:p>
+    <w:p>
+      <w:pPr>
+        <w:pStyle w:val="Compact"/>
+        <w:numPr>
+          <w:ilvl w:val="0"/>
+          <w:numId w:val="1002"/>
+        </w:numPr>
+      </w:pPr>
+      <w:r>
+        <w:rPr>
+          <w:rStyle w:val="VerbatimChar"/>
+        </w:rPr>
+        <w:t xml:space="preserve">python -m</w:t>
+      </w:r>
+      <w:r>
+        <w:t xml:space="preserve"> </w:t>
+      </w:r>
+      <w:r>
+        <w:rPr>
+          <w:rStyle w:val="VerbatimChar"/>
+        </w:rPr>
+        <w:t xml:space="preserve">scripts.render_tools_design_manual</w:t>
+      </w:r>
+      <w:r>
+        <w:t xml:space="preserve"> </w:t>
+      </w:r>
+      <w:r>
+        <w:rPr>
+          <w:rStyle w:val="VerbatimChar"/>
+        </w:rPr>
+        <w:t xml:space="preserve">--render</w:t>
+      </w:r>
+    </w:p>
+    <w:p>
+      <w:r>
+        <w:br w:type="page"/>
+      </w:r>
+    </w:p>
+    <w:bookmarkEnd w:id="45"/>
+    <w:bookmarkEnd w:id="46"/>
+    <w:bookmarkStart w:id="97" w:name="swing-rate-of-closure-d-plane-exemplar"/>
+    <w:p>
+      <w:pPr>
+        <w:pStyle w:val="Heading1"/>
+      </w:pPr>
+      <w:r>
+        <w:t xml:space="preserve">Swing and Rate-of-Closure D-Plane Geometry</w:t>
+      </w:r>
+    </w:p>
+    <w:bookmarkStart w:id="47" w:name="purpose-and-scope"/>
+    <w:p>
+      <w:pPr>
+        <w:pStyle w:val="Heading2"/>
+      </w:pPr>
+      <w:r>
+        <w:t xml:space="preserve">Purpose and Scope</w:t>
+      </w:r>
+    </w:p>
+    <w:p>
+      <w:pPr>
         <w:pStyle w:val="FirstParagraph"/>
       </w:pPr>
       <w:r>
-        <w:t xml:space="preserve">They regenerate and check all four representations. The combined governance,</w:t>
-      </w:r>
-      <w:r>
-        <w:t xml:space="preserve"> </w:t>
-      </w:r>
-      <w:r>
-        <w:t xml:space="preserve">inventory, chapter, and artifact freshness gates must pass before review.</w:t>
+        <w:t xml:space="preserve">This governed exemplar explains how</w:t>
+      </w:r>
+      <w:r>
+        <w:t xml:space="preserve"> </w:t>
+      </w:r>
+      <w:r>
+        <w:rPr>
+          <w:rStyle w:val="VerbatimChar"/>
+        </w:rPr>
+        <w:t xml:space="preserve">swing_sim</w:t>
+      </w:r>
+      <w:r>
+        <w:t xml:space="preserve"> </w:t>
+      </w:r>
+      <w:r>
+        <w:t xml:space="preserve">computes frame-explicit</w:t>
+      </w:r>
+      <w:r>
+        <w:t xml:space="preserve"> </w:t>
+      </w:r>
+      <w:r>
+        <w:t xml:space="preserve">three-dimensional D-plane geometry and how Rate of Closure supplies three</w:t>
+      </w:r>
+      <w:r>
+        <w:t xml:space="preserve"> </w:t>
+      </w:r>
+      <w:r>
+        <w:t xml:space="preserve">distinct rigid-body velocity points to that calculation. It is for developers,</w:t>
+      </w:r>
+      <w:r>
+        <w:t xml:space="preserve"> </w:t>
+      </w:r>
+      <w:r>
+        <w:t xml:space="preserve">scientific reviewers, and integrators who need to reproduce the equations and</w:t>
+      </w:r>
+      <w:r>
+        <w:t xml:space="preserve"> </w:t>
+      </w:r>
+      <w:r>
+        <w:t xml:space="preserve">follow every value into code and tests. It covers geometric direction</w:t>
+      </w:r>
+      <w:r>
+        <w:t xml:space="preserve"> </w:t>
+      </w:r>
+      <w:r>
+        <w:t xml:space="preserve">relationships only. It does not predict ball launch, spin magnitude,</w:t>
+      </w:r>
+      <w:r>
+        <w:t xml:space="preserve"> </w:t>
+      </w:r>
+      <w:r>
+        <w:t xml:space="preserve">aerodynamic flight, player outcome, equipment quality, or an operating</w:t>
+      </w:r>
+      <w:r>
+        <w:t xml:space="preserve"> </w:t>
+      </w:r>
+      <w:r>
+        <w:t xml:space="preserve">decision. The calculation and rendered artifacts are verified-unapproved.</w:t>
       </w:r>
     </w:p>
-    <w:bookmarkStart w:id="49" w:name="refs"/>
-    <w:bookmarkStart w:id="46" w:name="ref-pandoc-manual"/>
+    <w:bookmarkEnd w:id="47"/>
+    <w:bookmarkStart w:id="51" w:name="design-by-contract"/>
+    <w:p>
+      <w:pPr>
+        <w:pStyle w:val="Heading2"/>
+      </w:pPr>
+      <w:r>
+        <w:t xml:space="preserve">Design by Contract</w:t>
+      </w:r>
+    </w:p>
+    <w:bookmarkStart w:id="48" w:name="preconditions"/>
+    <w:p>
+      <w:pPr>
+        <w:pStyle w:val="Heading3"/>
+      </w:pPr>
+      <w:r>
+        <w:t xml:space="preserve">Preconditions</w:t>
+      </w:r>
+    </w:p>
+    <w:p>
+      <w:pPr>
+        <w:pStyle w:val="FirstParagraph"/>
+      </w:pPr>
+      <w:r>
+        <w:rPr>
+          <w:rStyle w:val="VerbatimChar"/>
+        </w:rPr>
+        <w:t xml:space="preserve">analyze_dplane</w:t>
+      </w:r>
+      <w:r>
+        <w:t xml:space="preserve"> </w:t>
+      </w:r>
+      <w:r>
+        <w:t xml:space="preserve">accepts travel, face-normal, target, and up vectors with</w:t>
+      </w:r>
+      <w:r>
+        <w:t xml:space="preserve"> </w:t>
+      </w:r>
+      <w:r>
+        <w:t xml:space="preserve">exactly three finite components. Face normal, target, and up must each have</w:t>
+      </w:r>
+      <w:r>
+        <w:t xml:space="preserve"> </w:t>
+      </w:r>
+      <w:r>
+        <w:t xml:space="preserve">Euclidean norm greater than</w:t>
+      </w:r>
+      <w:r>
+        <w:t xml:space="preserve"> </w:t>
+      </w:r>
+      <m:oMath>
+        <m:sSup>
+          <m:e>
+            <m:r>
+              <m:t>10</m:t>
+            </m:r>
+          </m:e>
+          <m:sup>
+            <m:r>
+              <m:rPr>
+                <m:sty m:val="p"/>
+              </m:rPr>
+              <m:t>−</m:t>
+            </m:r>
+            <m:r>
+              <m:t>12</m:t>
+            </m:r>
+          </m:sup>
+        </m:sSup>
+      </m:oMath>
+      <w:r>
+        <w:t xml:space="preserve">. Target and up must be orthogonal to</w:t>
+      </w:r>
+      <w:r>
+        <w:t xml:space="preserve"> </w:t>
+      </w:r>
+      <w:r>
+        <w:t xml:space="preserve">absolute dot product</w:t>
+      </w:r>
+      <w:r>
+        <w:t xml:space="preserve"> </w:t>
+      </w:r>
+      <m:oMath>
+        <m:sSup>
+          <m:e>
+            <m:r>
+              <m:t>10</m:t>
+            </m:r>
+          </m:e>
+          <m:sup>
+            <m:r>
+              <m:rPr>
+                <m:sty m:val="p"/>
+              </m:rPr>
+              <m:t>−</m:t>
+            </m:r>
+            <m:r>
+              <m:t>10</m:t>
+            </m:r>
+          </m:sup>
+        </m:sSup>
+      </m:oMath>
+      <w:r>
+        <w:t xml:space="preserve">. The Rate-of-Closure adapter additionally</w:t>
+      </w:r>
+      <w:r>
+        <w:t xml:space="preserve"> </w:t>
+      </w:r>
+      <w:r>
+        <w:t xml:space="preserve">requires a typed</w:t>
+      </w:r>
+      <w:r>
+        <w:t xml:space="preserve"> </w:t>
+      </w:r>
+      <w:r>
+        <w:rPr>
+          <w:rStyle w:val="VerbatimChar"/>
+        </w:rPr>
+        <w:t xml:space="preserve">SimulationRun</w:t>
+      </w:r>
+      <w:r>
+        <w:t xml:space="preserve"> </w:t>
+      </w:r>
+      <w:r>
+        <w:t xml:space="preserve">with increasing sample times and internally</w:t>
+      </w:r>
+      <w:r>
+        <w:t xml:space="preserve"> </w:t>
+      </w:r>
+      <w:r>
+        <w:t xml:space="preserve">consistent pose, twist, club, scenario, and inspection-event records.</w:t>
+      </w:r>
+    </w:p>
+    <w:bookmarkEnd w:id="48"/>
+    <w:bookmarkStart w:id="49" w:name="postconditions"/>
+    <w:p>
+      <w:pPr>
+        <w:pStyle w:val="Heading3"/>
+      </w:pPr>
+      <w:r>
+        <w:t xml:space="preserve">Postconditions</w:t>
+      </w:r>
+    </w:p>
+    <w:p>
+      <w:pPr>
+        <w:pStyle w:val="FirstParagraph"/>
+      </w:pPr>
+      <w:r>
+        <w:t xml:space="preserve">Every available direction is normalized and every angle is in degrees. Spin</w:t>
+      </w:r>
+      <w:r>
+        <w:t xml:space="preserve"> </w:t>
+      </w:r>
+      <w:r>
+        <w:t xml:space="preserve">loft is the principal angle on</w:t>
+      </w:r>
+      <w:r>
+        <w:t xml:space="preserve"> </w:t>
+      </w:r>
+      <m:oMath>
+        <m:r>
+          <m:rPr>
+            <m:sty m:val="p"/>
+          </m:rPr>
+          <m:t>[</m:t>
+        </m:r>
+        <m:r>
+          <m:t>0</m:t>
+        </m:r>
+        <m:r>
+          <m:rPr>
+            <m:sty m:val="p"/>
+          </m:rPr>
+          <m:t>,</m:t>
+        </m:r>
+        <m:r>
+          <m:t>180</m:t>
+        </m:r>
+        <m:r>
+          <m:rPr>
+            <m:sty m:val="p"/>
+          </m:rPr>
+          <m:t>]</m:t>
+        </m:r>
+      </m:oMath>
+      <w:r>
+        <w:t xml:space="preserve">. A defined D-plane supplies a unit</w:t>
+      </w:r>
+      <w:r>
+        <w:t xml:space="preserve"> </w:t>
+      </w:r>
+      <w:r>
+        <w:t xml:space="preserve">normal perpendicular to travel and face. Zero, parallel, antiparallel, and</w:t>
+      </w:r>
+      <w:r>
+        <w:t xml:space="preserve"> </w:t>
+      </w:r>
+      <w:r>
+        <w:t xml:space="preserve">unprojectable states return explicit status or null fields; they never invent a</w:t>
+      </w:r>
+      <w:r>
+        <w:t xml:space="preserve"> </w:t>
+      </w:r>
+      <w:r>
+        <w:t xml:space="preserve">plane, horizontal heading, or face-to-path result.</w:t>
+      </w:r>
+    </w:p>
+    <w:bookmarkEnd w:id="49"/>
+    <w:bookmarkStart w:id="50" w:name="invariants"/>
+    <w:p>
+      <w:pPr>
+        <w:pStyle w:val="Heading3"/>
+      </w:pPr>
+      <w:r>
+        <w:t xml:space="preserve">Invariants</w:t>
+      </w:r>
+    </w:p>
+    <w:p>
+      <w:pPr>
+        <w:pStyle w:val="FirstParagraph"/>
+      </w:pPr>
+      <w:r>
+        <w:t xml:space="preserve">A common proper rotation of travel, face, target, and up preserves spin loft,</w:t>
+      </w:r>
+      <w:r>
+        <w:t xml:space="preserve"> </w:t>
+      </w:r>
+      <w:r>
+        <w:t xml:space="preserve">planar spin loft, face-to-path, and intrinsic tilt. Reflecting the right axis</w:t>
+      </w:r>
+      <w:r>
+        <w:t xml:space="preserve"> </w:t>
+      </w:r>
+      <w:r>
+        <w:t xml:space="preserve">reverses signed horizontal relationships while preserving spin loft.</w:t>
+      </w:r>
+      <w:r>
+        <w:t xml:space="preserve"> </w:t>
+      </w:r>
+      <w:r>
+        <w:t xml:space="preserve">Multiplying a nonzero travel vector by a positive scalar does not change the</w:t>
+      </w:r>
+      <w:r>
+        <w:t xml:space="preserve"> </w:t>
+      </w:r>
+      <w:r>
+        <w:t xml:space="preserve">geometry because only direction enters the method.</w:t>
+      </w:r>
+    </w:p>
+    <w:bookmarkEnd w:id="50"/>
+    <w:bookmarkEnd w:id="51"/>
+    <w:bookmarkStart w:id="56" w:name="coordinates-frames-and-time"/>
+    <w:p>
+      <w:pPr>
+        <w:pStyle w:val="Heading2"/>
+      </w:pPr>
+      <w:r>
+        <w:t xml:space="preserve">Coordinates, Frames, and Time</w:t>
+      </w:r>
+    </w:p>
+    <w:bookmarkStart w:id="53" w:name="coordinate-frames"/>
+    <w:p>
+      <w:pPr>
+        <w:pStyle w:val="Heading3"/>
+      </w:pPr>
+      <w:r>
+        <w:t xml:space="preserve">Coordinate Frames</w:t>
+      </w:r>
+    </w:p>
+    <w:p>
+      <w:pPr>
+        <w:pStyle w:val="FirstParagraph"/>
+      </w:pPr>
+      <w:bookmarkStart w:id="52" w:name="dplane-coordinate-frame"/>
+      <w:bookmarkEnd w:id="52"/>
+    </w:p>
+    <w:p>
+      <w:pPr>
+        <w:pStyle w:val="BodyText"/>
+      </w:pPr>
+      <w:r>
+        <w:t xml:space="preserve">The default application frame is</w:t>
+      </w:r>
+      <w:r>
+        <w:t xml:space="preserve"> </w:t>
+      </w:r>
+      <w:r>
+        <w:rPr>
+          <w:rStyle w:val="VerbatimChar"/>
+        </w:rPr>
+        <w:t xml:space="preserve">app_frame:x_target,y_up,z_right</w:t>
+      </w:r>
+      <w:r>
+        <w:t xml:space="preserve">. Let</w:t>
+      </w:r>
+      <w:r>
+        <w:t xml:space="preserve"> </w:t>
+      </w:r>
+      <m:oMath>
+        <m:acc>
+          <m:accPr>
+            <m:chr m:val="̂"/>
+          </m:accPr>
+          <m:e>
+            <m:r>
+              <m:rPr>
+                <m:sty m:val="b"/>
+              </m:rPr>
+              <m:t>t</m:t>
+            </m:r>
+          </m:e>
+        </m:acc>
+      </m:oMath>
+      <w:r>
+        <w:t xml:space="preserve"> </w:t>
+      </w:r>
+      <w:r>
+        <w:t xml:space="preserve">be target and</w:t>
+      </w:r>
+      <w:r>
+        <w:t xml:space="preserve"> </w:t>
+      </w:r>
+      <m:oMath>
+        <m:acc>
+          <m:accPr>
+            <m:chr m:val="̂"/>
+          </m:accPr>
+          <m:e>
+            <m:r>
+              <m:rPr>
+                <m:sty m:val="b"/>
+              </m:rPr>
+              <m:t>u</m:t>
+            </m:r>
+          </m:e>
+        </m:acc>
+      </m:oMath>
+      <w:r>
+        <w:t xml:space="preserve"> </w:t>
+      </w:r>
+      <w:r>
+        <w:t xml:space="preserve">be up. The implementation constructs right as</w:t>
+      </w:r>
+    </w:p>
+    <w:p>
+      <w:pPr>
+        <w:pStyle w:val="BodyText"/>
+      </w:pPr>
+      <m:oMathPara>
+        <m:oMathParaPr>
+          <m:jc m:val="center"/>
+        </m:oMathParaPr>
+        <m:oMath>
+          <m:acc>
+            <m:accPr>
+              <m:chr m:val="̂"/>
+            </m:accPr>
+            <m:e>
+              <m:r>
+                <m:rPr>
+                  <m:sty m:val="b"/>
+                </m:rPr>
+                <m:t>r</m:t>
+              </m:r>
+            </m:e>
+          </m:acc>
+          <m:r>
+            <m:rPr>
+              <m:sty m:val="p"/>
+            </m:rPr>
+            <m:t>=</m:t>
+          </m:r>
+          <m:f>
+            <m:fPr>
+              <m:type m:val="bar"/>
+            </m:fPr>
+            <m:num>
+              <m:acc>
+                <m:accPr>
+                  <m:chr m:val="̂"/>
+                </m:accPr>
+                <m:e>
+                  <m:r>
+                    <m:rPr>
+                      <m:sty m:val="b"/>
+                    </m:rPr>
+                    <m:t>t</m:t>
+                  </m:r>
+                </m:e>
+              </m:acc>
+              <m:r>
+                <m:rPr>
+                  <m:sty m:val="p"/>
+                </m:rPr>
+                <m:t>×</m:t>
+              </m:r>
+              <m:acc>
+                <m:accPr>
+                  <m:chr m:val="̂"/>
+                </m:accPr>
+                <m:e>
+                  <m:r>
+                    <m:rPr>
+                      <m:sty m:val="b"/>
+                    </m:rPr>
+                    <m:t>u</m:t>
+                  </m:r>
+                </m:e>
+              </m:acc>
+            </m:num>
+            <m:den>
+              <m:d>
+                <m:dPr>
+                  <m:begChr m:val="‖"/>
+                  <m:sepChr m:val=""/>
+                  <m:endChr m:val="‖"/>
+                  <m:grow/>
+                </m:dPr>
+                <m:e>
+                  <m:acc>
+                    <m:accPr>
+                      <m:chr m:val="̂"/>
+                    </m:accPr>
+                    <m:e>
+                      <m:r>
+                        <m:rPr>
+                          <m:sty m:val="b"/>
+                        </m:rPr>
+                        <m:t>t</m:t>
+                      </m:r>
+                    </m:e>
+                  </m:acc>
+                  <m:r>
+                    <m:rPr>
+                      <m:sty m:val="p"/>
+                    </m:rPr>
+                    <m:t>×</m:t>
+                  </m:r>
+                  <m:acc>
+                    <m:accPr>
+                      <m:chr m:val="̂"/>
+                    </m:accPr>
+                    <m:e>
+                      <m:r>
+                        <m:rPr>
+                          <m:sty m:val="b"/>
+                        </m:rPr>
+                        <m:t>u</m:t>
+                      </m:r>
+                    </m:e>
+                  </m:acc>
+                </m:e>
+              </m:d>
+            </m:den>
+          </m:f>
+          <m:r>
+            <m:rPr>
+              <m:sty m:val="p"/>
+            </m:rPr>
+            <m:t>.</m:t>
+          </m:r>
+        </m:oMath>
+      </m:oMathPara>
+    </w:p>
+    <w:p>
+      <w:pPr>
+        <w:pStyle w:val="FirstParagraph"/>
+      </w:pPr>
+      <w:r>
+        <w:t xml:space="preserve">Rate of Closure interpolates the inspection-event rigid transform and twist,</w:t>
+      </w:r>
+      <w:r>
+        <w:t xml:space="preserve"> </w:t>
+      </w:r>
+      <w:r>
+        <w:t xml:space="preserve">then expresses reference, face-center, and contact vectors in this same frame.</w:t>
+      </w:r>
+    </w:p>
+    <w:bookmarkEnd w:id="53"/>
+    <w:bookmarkStart w:id="54" w:name="axis-and-handedness"/>
+    <w:p>
+      <w:pPr>
+        <w:pStyle w:val="Heading3"/>
+      </w:pPr>
+      <w:r>
+        <w:t xml:space="preserve">Axis and Handedness</w:t>
+      </w:r>
+    </w:p>
+    <w:p>
+      <w:pPr>
+        <w:pStyle w:val="FirstParagraph"/>
+      </w:pPr>
+      <w:r>
+        <w:t xml:space="preserve">Positive path and face headings rotate from target toward right. Elevation is</w:t>
+      </w:r>
+      <w:r>
+        <w:t xml:space="preserve"> </w:t>
+      </w:r>
+      <w:r>
+        <w:t xml:space="preserve">positive toward up. Target-times-up fixes the sign of right; reversing the</w:t>
+      </w:r>
+      <w:r>
+        <w:t xml:space="preserve"> </w:t>
+      </w:r>
+      <w:r>
+        <w:t xml:space="preserve">cross-product order would reverse every signed horizontal result. The D-plane</w:t>
+      </w:r>
+      <w:r>
+        <w:t xml:space="preserve"> </w:t>
+      </w:r>
+      <w:r>
+        <w:t xml:space="preserve">normal is travel-times-face, so its orientation also depends on declared order.</w:t>
+      </w:r>
+    </w:p>
+    <w:bookmarkEnd w:id="54"/>
+    <w:bookmarkStart w:id="55" w:name="time-convention"/>
+    <w:p>
+      <w:pPr>
+        <w:pStyle w:val="Heading3"/>
+      </w:pPr>
+      <w:r>
+        <w:t xml:space="preserve">Time Convention</w:t>
+      </w:r>
+    </w:p>
+    <w:p>
+      <w:pPr>
+        <w:pStyle w:val="FirstParagraph"/>
+      </w:pPr>
+      <w:r>
+        <w:t xml:space="preserve">The geometry is instantaneous and has no integration clock. Rate of Closure</w:t>
+      </w:r>
+      <w:r>
+        <w:t xml:space="preserve"> </w:t>
+      </w:r>
+      <w:r>
+        <w:t xml:space="preserve">evaluates it at</w:t>
+      </w:r>
+      <w:r>
+        <w:t xml:space="preserve"> </w:t>
+      </w:r>
+      <w:r>
+        <w:rPr>
+          <w:rStyle w:val="VerbatimChar"/>
+        </w:rPr>
+        <w:t xml:space="preserve">inspection_time_s</w:t>
+      </w:r>
+      <w:r>
+        <w:t xml:space="preserve">. Pose and twist are interpolated to that</w:t>
+      </w:r>
+      <w:r>
+        <w:t xml:space="preserve"> </w:t>
+      </w:r>
+      <w:r>
+        <w:t xml:space="preserve">event time; the closest sampled index is audit metadata and a bounded tangent</w:t>
+      </w:r>
+      <w:r>
+        <w:t xml:space="preserve"> </w:t>
+      </w:r>
+      <w:r>
+        <w:t xml:space="preserve">fallback. A miss remains a closest-approach event and is not relabeled impact.</w:t>
+      </w:r>
+    </w:p>
+    <w:bookmarkEnd w:id="55"/>
+    <w:bookmarkEnd w:id="56"/>
+    <w:bookmarkStart w:id="59" w:name="units-and-dimensions"/>
+    <w:p>
+      <w:pPr>
+        <w:pStyle w:val="Heading2"/>
+      </w:pPr>
+      <w:r>
+        <w:t xml:space="preserve">Units and Dimensions</w:t>
+      </w:r>
+    </w:p>
+    <w:bookmarkStart w:id="57" w:name="symbol-and-unit-table"/>
+    <w:p>
+      <w:pPr>
+        <w:pStyle w:val="Heading3"/>
+      </w:pPr>
+      <w:r>
+        <w:t xml:space="preserve">Symbol and Unit Table</w:t>
+      </w:r>
+    </w:p>
+    <w:tbl>
+      <w:tblPr>
+        <w:tblStyle w:val="Table"/>
+        <w:tblW w:type="pct" w:w="5000"/>
+        <w:tblLayout w:type="fixed"/>
+        <w:tblLook w:firstRow="1" w:lastRow="0" w:firstColumn="0" w:lastColumn="0" w:noHBand="0" w:noVBand="0" w:val="0020"/>
+      </w:tblPr>
+      <w:tblGrid>
+        <w:gridCol w:w="2640"/>
+        <w:gridCol w:w="2640"/>
+        <w:gridCol w:w="2640"/>
+      </w:tblGrid>
+      <w:tr>
+        <w:trPr>
+          <w:tblHeader w:val="on"/>
+        </w:trPr>
+        <w:tc>
+          <w:tcPr/>
+          <w:p>
+            <w:pPr>
+              <w:pStyle w:val="Compact"/>
+            </w:pPr>
+            <w:r>
+              <w:t xml:space="preserve">Symbol or field</w:t>
+            </w:r>
+          </w:p>
+        </w:tc>
+        <w:tc>
+          <w:tcPr/>
+          <w:p>
+            <w:pPr>
+              <w:pStyle w:val="Compact"/>
+            </w:pPr>
+            <w:r>
+              <w:t xml:space="preserve">Meaning</w:t>
+            </w:r>
+          </w:p>
+        </w:tc>
+        <w:tc>
+          <w:tcPr/>
+          <w:p>
+            <w:pPr>
+              <w:pStyle w:val="Compact"/>
+            </w:pPr>
+            <w:r>
+              <w:t xml:space="preserve">Unit</w:t>
+            </w:r>
+          </w:p>
+        </w:tc>
+      </w:tr>
+      <w:tr>
+        <w:tc>
+          <w:tcPr/>
+          <w:p>
+            <w:pPr>
+              <w:pStyle w:val="Compact"/>
+            </w:pPr>
+            <m:oMath>
+              <m:r>
+                <m:rPr>
+                  <m:sty m:val="b"/>
+                </m:rPr>
+                <m:t>v</m:t>
+              </m:r>
+            </m:oMath>
+          </w:p>
+        </w:tc>
+        <w:tc>
+          <w:tcPr/>
+          <w:p>
+            <w:pPr>
+              <w:pStyle w:val="Compact"/>
+            </w:pPr>
+            <w:r>
+              <w:t xml:space="preserve">reference, face-center, or contact velocity</w:t>
+            </w:r>
+          </w:p>
+        </w:tc>
+        <w:tc>
+          <w:tcPr/>
+          <w:p>
+            <w:pPr>
+              <w:pStyle w:val="Compact"/>
+            </w:pPr>
+            <w:r>
+              <w:t xml:space="preserve">m/s</w:t>
+            </w:r>
+          </w:p>
+        </w:tc>
+      </w:tr>
+      <w:tr>
+        <w:tc>
+          <w:tcPr/>
+          <w:p>
+            <w:pPr>
+              <w:pStyle w:val="Compact"/>
+            </w:pPr>
+            <m:oMath>
+              <m:acc>
+                <m:accPr>
+                  <m:chr m:val="̂"/>
+                </m:accPr>
+                <m:e>
+                  <m:r>
+                    <m:rPr>
+                      <m:sty m:val="b"/>
+                    </m:rPr>
+                    <m:t>n</m:t>
+                  </m:r>
+                </m:e>
+              </m:acc>
+            </m:oMath>
+          </w:p>
+        </w:tc>
+        <w:tc>
+          <w:tcPr/>
+          <w:p>
+            <w:pPr>
+              <w:pStyle w:val="Compact"/>
+            </w:pPr>
+            <w:r>
+              <w:t xml:space="preserve">delivered face normal</w:t>
+            </w:r>
+          </w:p>
+        </w:tc>
+        <w:tc>
+          <w:tcPr/>
+          <w:p>
+            <w:pPr>
+              <w:pStyle w:val="Compact"/>
+            </w:pPr>
+            <w:r>
+              <w:t xml:space="preserve">1</w:t>
+            </w:r>
+          </w:p>
+        </w:tc>
+      </w:tr>
+      <w:tr>
+        <w:tc>
+          <w:tcPr/>
+          <w:p>
+            <w:pPr>
+              <w:pStyle w:val="Compact"/>
+            </w:pPr>
+            <m:oMath>
+              <m:acc>
+                <m:accPr>
+                  <m:chr m:val="̂"/>
+                </m:accPr>
+                <m:e>
+                  <m:r>
+                    <m:rPr>
+                      <m:sty m:val="b"/>
+                    </m:rPr>
+                    <m:t>t</m:t>
+                  </m:r>
+                </m:e>
+              </m:acc>
+              <m:r>
+                <m:rPr>
+                  <m:sty m:val="p"/>
+                </m:rPr>
+                <m:t>,</m:t>
+              </m:r>
+              <m:acc>
+                <m:accPr>
+                  <m:chr m:val="̂"/>
+                </m:accPr>
+                <m:e>
+                  <m:r>
+                    <m:rPr>
+                      <m:sty m:val="b"/>
+                    </m:rPr>
+                    <m:t>u</m:t>
+                  </m:r>
+                </m:e>
+              </m:acc>
+              <m:r>
+                <m:rPr>
+                  <m:sty m:val="p"/>
+                </m:rPr>
+                <m:t>,</m:t>
+              </m:r>
+              <m:acc>
+                <m:accPr>
+                  <m:chr m:val="̂"/>
+                </m:accPr>
+                <m:e>
+                  <m:r>
+                    <m:rPr>
+                      <m:sty m:val="b"/>
+                    </m:rPr>
+                    <m:t>r</m:t>
+                  </m:r>
+                </m:e>
+              </m:acc>
+            </m:oMath>
+          </w:p>
+        </w:tc>
+        <w:tc>
+          <w:tcPr/>
+          <w:p>
+            <w:pPr>
+              <w:pStyle w:val="Compact"/>
+            </w:pPr>
+            <w:r>
+              <w:t xml:space="preserve">target, up, right axes</w:t>
+            </w:r>
+          </w:p>
+        </w:tc>
+        <w:tc>
+          <w:tcPr/>
+          <w:p>
+            <w:pPr>
+              <w:pStyle w:val="Compact"/>
+            </w:pPr>
+            <w:r>
+              <w:t xml:space="preserve">1</w:t>
+            </w:r>
+          </w:p>
+        </w:tc>
+      </w:tr>
+      <w:tr>
+        <w:tc>
+          <w:tcPr/>
+          <w:p>
+            <w:pPr>
+              <w:pStyle w:val="Compact"/>
+            </w:pPr>
+            <m:oMath>
+              <m:r>
+                <m:t>λ</m:t>
+              </m:r>
+            </m:oMath>
+          </w:p>
+        </w:tc>
+        <w:tc>
+          <w:tcPr/>
+          <w:p>
+            <w:pPr>
+              <w:pStyle w:val="Compact"/>
+            </w:pPr>
+            <w:r>
+              <w:t xml:space="preserve">three-dimensional spin loft</w:t>
+            </w:r>
+          </w:p>
+        </w:tc>
+        <w:tc>
+          <w:tcPr/>
+          <w:p>
+            <w:pPr>
+              <w:pStyle w:val="Compact"/>
+            </w:pPr>
+            <w:r>
+              <w:t xml:space="preserve">degree</w:t>
+            </w:r>
+          </w:p>
+        </w:tc>
+      </w:tr>
+      <w:tr>
+        <w:tc>
+          <w:tcPr/>
+          <w:p>
+            <w:pPr>
+              <w:pStyle w:val="Compact"/>
+            </w:pPr>
+            <m:oMath>
+              <m:r>
+                <m:t>p</m:t>
+              </m:r>
+              <m:r>
+                <m:rPr>
+                  <m:sty m:val="p"/>
+                </m:rPr>
+                <m:t>,</m:t>
+              </m:r>
+              <m:r>
+                <m:t>a</m:t>
+              </m:r>
+              <m:r>
+                <m:rPr>
+                  <m:sty m:val="p"/>
+                </m:rPr>
+                <m:t>,</m:t>
+              </m:r>
+              <m:r>
+                <m:t>f</m:t>
+              </m:r>
+              <m:r>
+                <m:rPr>
+                  <m:sty m:val="p"/>
+                </m:rPr>
+                <m:t>,</m:t>
+              </m:r>
+              <m:r>
+                <m:t>ℓ</m:t>
+              </m:r>
+            </m:oMath>
+          </w:p>
+        </w:tc>
+        <w:tc>
+          <w:tcPr/>
+          <w:p>
+            <w:pPr>
+              <w:pStyle w:val="Compact"/>
+            </w:pPr>
+            <w:r>
+              <w:t xml:space="preserve">path, attack, face, and dynamic-loft angles</w:t>
+            </w:r>
+          </w:p>
+        </w:tc>
+        <w:tc>
+          <w:tcPr/>
+          <w:p>
+            <w:pPr>
+              <w:pStyle w:val="Compact"/>
+            </w:pPr>
+            <w:r>
+              <w:t xml:space="preserve">degree</w:t>
+            </w:r>
+          </w:p>
+        </w:tc>
+      </w:tr>
+      <w:tr>
+        <w:tc>
+          <w:tcPr/>
+          <w:p>
+            <w:pPr>
+              <w:pStyle w:val="Compact"/>
+            </w:pPr>
+            <m:oMath>
+              <m:acc>
+                <m:accPr>
+                  <m:chr m:val="̂"/>
+                </m:accPr>
+                <m:e>
+                  <m:r>
+                    <m:rPr>
+                      <m:sty m:val="b"/>
+                    </m:rPr>
+                    <m:t>d</m:t>
+                  </m:r>
+                </m:e>
+              </m:acc>
+            </m:oMath>
+          </w:p>
+        </w:tc>
+        <w:tc>
+          <w:tcPr/>
+          <w:p>
+            <w:pPr>
+              <w:pStyle w:val="Compact"/>
+            </w:pPr>
+            <w:r>
+              <w:t xml:space="preserve">D-plane normal</w:t>
+            </w:r>
+          </w:p>
+        </w:tc>
+        <w:tc>
+          <w:tcPr/>
+          <w:p>
+            <w:pPr>
+              <w:pStyle w:val="Compact"/>
+            </w:pPr>
+            <w:r>
+              <w:t xml:space="preserve">1</w:t>
+            </w:r>
+          </w:p>
+        </w:tc>
+      </w:tr>
+      <w:tr>
+        <w:tc>
+          <w:tcPr/>
+          <w:p>
+            <w:pPr>
+              <w:pStyle w:val="Compact"/>
+            </w:pPr>
+            <w:r>
+              <w:rPr>
+                <w:rStyle w:val="VerbatimChar"/>
+              </w:rPr>
+              <w:t xml:space="preserve">event_time_s</w:t>
+            </w:r>
+          </w:p>
+        </w:tc>
+        <w:tc>
+          <w:tcPr/>
+          <w:p>
+            <w:pPr>
+              <w:pStyle w:val="Compact"/>
+            </w:pPr>
+            <w:r>
+              <w:t xml:space="preserve">interpolation time</w:t>
+            </w:r>
+          </w:p>
+        </w:tc>
+        <w:tc>
+          <w:tcPr/>
+          <w:p>
+            <w:pPr>
+              <w:pStyle w:val="Compact"/>
+            </w:pPr>
+            <w:r>
+              <w:t xml:space="preserve">s</w:t>
+            </w:r>
+          </w:p>
+        </w:tc>
+      </w:tr>
+    </w:tbl>
+    <w:bookmarkEnd w:id="57"/>
+    <w:bookmarkStart w:id="58" w:name="dimensional-checks"/>
+    <w:p>
+      <w:pPr>
+        <w:pStyle w:val="Heading3"/>
+      </w:pPr>
+      <w:r>
+        <w:t xml:space="preserve">Dimensional Checks</w:t>
+      </w:r>
+    </w:p>
+    <w:p>
+      <w:pPr>
+        <w:pStyle w:val="FirstParagraph"/>
+      </w:pPr>
+      <w:r>
+        <w:t xml:space="preserve">Normalizing</w:t>
+      </w:r>
+      <w:r>
+        <w:t xml:space="preserve"> </w:t>
+      </w:r>
+      <m:oMath>
+        <m:r>
+          <m:rPr>
+            <m:sty m:val="b"/>
+          </m:rPr>
+          <m:t>v</m:t>
+        </m:r>
+      </m:oMath>
+      <w:r>
+        <w:t xml:space="preserve"> </w:t>
+      </w:r>
+      <w:r>
+        <w:t xml:space="preserve">divides m/s by m/s, producing a unit direction. Dot and</w:t>
+      </w:r>
+      <w:r>
+        <w:t xml:space="preserve"> </w:t>
+      </w:r>
+      <w:r>
+        <w:t xml:space="preserve">cross products operate on dimensionless directions.</w:t>
+      </w:r>
+      <w:r>
+        <w:t xml:space="preserve"> </w:t>
+      </w:r>
+      <w:r>
+        <w:rPr>
+          <w:rStyle w:val="VerbatimChar"/>
+        </w:rPr>
+        <w:t xml:space="preserve">acos</w:t>
+      </w:r>
+      <w:r>
+        <w:t xml:space="preserve"> </w:t>
+      </w:r>
+      <w:r>
+        <w:t xml:space="preserve">and</w:t>
+      </w:r>
+      <w:r>
+        <w:t xml:space="preserve"> </w:t>
+      </w:r>
+      <w:r>
+        <w:rPr>
+          <w:rStyle w:val="VerbatimChar"/>
+        </w:rPr>
+        <w:t xml:space="preserve">atan2</w:t>
+      </w:r>
+      <w:r>
+        <w:t xml:space="preserve"> </w:t>
+      </w:r>
+      <w:r>
+        <w:t xml:space="preserve">return dimensionless radians, converted to degrees. The rigid-body equation</w:t>
+      </w:r>
+      <w:r>
+        <w:t xml:space="preserve"> </w:t>
+      </w:r>
+      <m:oMath>
+        <m:sSub>
+          <m:e>
+            <m:r>
+              <m:rPr>
+                <m:sty m:val="b"/>
+              </m:rPr>
+              <m:t>v</m:t>
+            </m:r>
+          </m:e>
+          <m:sub>
+            <m:r>
+              <m:t>P</m:t>
+            </m:r>
+          </m:sub>
+        </m:sSub>
+        <m:r>
+          <m:rPr>
+            <m:sty m:val="p"/>
+          </m:rPr>
+          <m:t>=</m:t>
+        </m:r>
+        <m:sSub>
+          <m:e>
+            <m:r>
+              <m:rPr>
+                <m:sty m:val="b"/>
+              </m:rPr>
+              <m:t>v</m:t>
+            </m:r>
+          </m:e>
+          <m:sub>
+            <m:r>
+              <m:t>O</m:t>
+            </m:r>
+          </m:sub>
+        </m:sSub>
+        <m:r>
+          <m:rPr>
+            <m:sty m:val="p"/>
+          </m:rPr>
+          <m:t>+</m:t>
+        </m:r>
+        <m:r>
+          <m:rPr>
+            <m:sty m:val="b"/>
+          </m:rPr>
+          <m:t>ω</m:t>
+        </m:r>
+        <m:r>
+          <m:rPr>
+            <m:sty m:val="p"/>
+          </m:rPr>
+          <m:t>×</m:t>
+        </m:r>
+        <m:sSub>
+          <m:e>
+            <m:r>
+              <m:rPr>
+                <m:sty m:val="b"/>
+              </m:rPr>
+              <m:t>r</m:t>
+            </m:r>
+          </m:e>
+          <m:sub>
+            <m:r>
+              <m:t>O</m:t>
+            </m:r>
+            <m:r>
+              <m:t>P</m:t>
+            </m:r>
+          </m:sub>
+        </m:sSub>
+      </m:oMath>
+      <w:r>
+        <w:t xml:space="preserve"> </w:t>
+      </w:r>
+      <w:r>
+        <w:t xml:space="preserve">is consistent:</w:t>
+      </w:r>
+      <w:r>
+        <w:t xml:space="preserve"> </w:t>
+      </w:r>
+      <w:r>
+        <w:t xml:space="preserve">rad/s is treated as</w:t>
+      </w:r>
+      <w:r>
+        <w:t xml:space="preserve"> </w:t>
+      </w:r>
+      <m:oMath>
+        <m:r>
+          <m:t>1</m:t>
+        </m:r>
+        <m:r>
+          <m:rPr>
+            <m:sty m:val="p"/>
+          </m:rPr>
+          <m:t>/</m:t>
+        </m:r>
+        <m:r>
+          <m:t>s</m:t>
+        </m:r>
+      </m:oMath>
+      <w:r>
+        <w:t xml:space="preserve">, and multiplying by metres produces m/s.</w:t>
+      </w:r>
+    </w:p>
+    <w:bookmarkEnd w:id="58"/>
+    <w:bookmarkEnd w:id="59"/>
+    <w:bookmarkStart w:id="64" w:name="derivation-and-assumptions"/>
+    <w:p>
+      <w:pPr>
+        <w:pStyle w:val="Heading2"/>
+      </w:pPr>
+      <w:r>
+        <w:t xml:space="preserve">Derivation and Assumptions</w:t>
+      </w:r>
+    </w:p>
+    <w:bookmarkStart w:id="60" w:name="assumptions"/>
+    <w:p>
+      <w:pPr>
+        <w:pStyle w:val="Heading3"/>
+      </w:pPr>
+      <w:r>
+        <w:t xml:space="preserve">Assumptions</w:t>
+      </w:r>
+    </w:p>
+    <w:p>
+      <w:pPr>
+        <w:pStyle w:val="FirstParagraph"/>
+      </w:pPr>
+      <w:r>
+        <w:t xml:space="preserve">The calculation assumes Euclidean three-space, a right-handed orthonormal</w:t>
+      </w:r>
+      <w:r>
+        <w:t xml:space="preserve"> </w:t>
+      </w:r>
+      <w:r>
+        <w:t xml:space="preserve">target frame, finite floating-point inputs, and one instantaneous delivered</w:t>
+      </w:r>
+      <w:r>
+        <w:t xml:space="preserve"> </w:t>
+      </w:r>
+      <w:r>
+        <w:t xml:space="preserve">face normal. It treats the D-plane as geometry spanned by travel and face;</w:t>
+      </w:r>
+      <w:r>
+        <w:t xml:space="preserve"> </w:t>
+      </w:r>
+      <w:r>
+        <w:t xml:space="preserve">collision dynamics and aerodynamic response lie outside this method. Rate of</w:t>
+      </w:r>
+      <w:r>
+        <w:t xml:space="preserve"> </w:t>
+      </w:r>
+      <w:r>
+        <w:t xml:space="preserve">Closure assumes its interpolated homogeneous pose is rigid and its twist stores</w:t>
+      </w:r>
+      <w:r>
+        <w:t xml:space="preserve"> </w:t>
+      </w:r>
+      <w:r>
+        <w:t xml:space="preserve">angular components followed by translational components.</w:t>
+      </w:r>
+    </w:p>
+    <w:bookmarkEnd w:id="60"/>
+    <w:bookmarkStart w:id="63" w:name="derivation"/>
+    <w:p>
+      <w:pPr>
+        <w:pStyle w:val="Heading3"/>
+      </w:pPr>
+      <w:r>
+        <w:t xml:space="preserve">Derivation</w:t>
+      </w:r>
+    </w:p>
+    <w:p>
+      <w:pPr>
+        <w:pStyle w:val="FirstParagraph"/>
+      </w:pPr>
+      <w:r>
+        <w:t xml:space="preserve">Normalize travel and face as</w:t>
+      </w:r>
+      <w:r>
+        <w:t xml:space="preserve"> </w:t>
+      </w:r>
+      <m:oMath>
+        <m:acc>
+          <m:accPr>
+            <m:chr m:val="̂"/>
+          </m:accPr>
+          <m:e>
+            <m:r>
+              <m:rPr>
+                <m:sty m:val="b"/>
+              </m:rPr>
+              <m:t>v</m:t>
+            </m:r>
+          </m:e>
+        </m:acc>
+        <m:r>
+          <m:rPr>
+            <m:sty m:val="p"/>
+          </m:rPr>
+          <m:t>=</m:t>
+        </m:r>
+        <m:r>
+          <m:rPr>
+            <m:sty m:val="b"/>
+          </m:rPr>
+          <m:t>v</m:t>
+        </m:r>
+        <m:r>
+          <m:rPr>
+            <m:sty m:val="p"/>
+          </m:rPr>
+          <m:t>/</m:t>
+        </m:r>
+        <m:d>
+          <m:dPr>
+            <m:begChr m:val="‖"/>
+            <m:sepChr m:val=""/>
+            <m:endChr m:val="‖"/>
+            <m:grow/>
+          </m:dPr>
+          <m:e>
+            <m:r>
+              <m:rPr>
+                <m:sty m:val="b"/>
+              </m:rPr>
+              <m:t>v</m:t>
+            </m:r>
+          </m:e>
+        </m:d>
+      </m:oMath>
+      <w:r>
+        <w:t xml:space="preserve"> </w:t>
+      </w:r>
+      <w:r>
+        <w:t xml:space="preserve">and</w:t>
+      </w:r>
+      <w:r>
+        <w:t xml:space="preserve"> </w:t>
+      </w:r>
+      <m:oMath>
+        <m:acc>
+          <m:accPr>
+            <m:chr m:val="̂"/>
+          </m:accPr>
+          <m:e>
+            <m:r>
+              <m:rPr>
+                <m:sty m:val="b"/>
+              </m:rPr>
+              <m:t>n</m:t>
+            </m:r>
+          </m:e>
+        </m:acc>
+        <m:r>
+          <m:rPr>
+            <m:sty m:val="p"/>
+          </m:rPr>
+          <m:t>=</m:t>
+        </m:r>
+        <m:r>
+          <m:rPr>
+            <m:sty m:val="b"/>
+          </m:rPr>
+          <m:t>n</m:t>
+        </m:r>
+        <m:r>
+          <m:rPr>
+            <m:sty m:val="p"/>
+          </m:rPr>
+          <m:t>/</m:t>
+        </m:r>
+        <m:d>
+          <m:dPr>
+            <m:begChr m:val="‖"/>
+            <m:sepChr m:val=""/>
+            <m:endChr m:val="‖"/>
+            <m:grow/>
+          </m:dPr>
+          <m:e>
+            <m:r>
+              <m:rPr>
+                <m:sty m:val="b"/>
+              </m:rPr>
+              <m:t>n</m:t>
+            </m:r>
+          </m:e>
+        </m:d>
+      </m:oMath>
+      <w:r>
+        <w:t xml:space="preserve">. Their dot product is the</w:t>
+      </w:r>
+      <w:r>
+        <w:t xml:space="preserve"> </w:t>
+      </w:r>
+      <w:r>
+        <w:t xml:space="preserve">cosine of the included angle. Clipping protects</w:t>
+      </w:r>
+      <w:r>
+        <w:t xml:space="preserve"> </w:t>
+      </w:r>
+      <w:r>
+        <w:rPr>
+          <w:rStyle w:val="VerbatimChar"/>
+        </w:rPr>
+        <w:t xml:space="preserve">acos</w:t>
+      </w:r>
+      <w:r>
+        <w:t xml:space="preserve"> </w:t>
+      </w:r>
+      <w:r>
+        <w:t xml:space="preserve">from roundoff beyond</w:t>
+      </w:r>
+      <w:r>
+        <w:t xml:space="preserve"> </w:t>
+      </w:r>
+      <w:r>
+        <w:t xml:space="preserve">the mathematical interval.</w:t>
+      </w:r>
+    </w:p>
+    <w:p>
+      <w:pPr>
+        <w:pStyle w:val="BodyText"/>
+      </w:pPr>
+      <w:bookmarkStart w:id="61" w:name="dplane-spin-loft-equation"/>
+      <w:bookmarkEnd w:id="61"/>
+    </w:p>
+    <w:p>
+      <w:pPr>
+        <w:pStyle w:val="BodyText"/>
+      </w:pPr>
+      <m:oMathPara>
+        <m:oMathParaPr>
+          <m:jc m:val="center"/>
+        </m:oMathParaPr>
+        <m:oMath>
+          <m:r>
+            <m:t>λ</m:t>
+          </m:r>
+          <m:r>
+            <m:rPr>
+              <m:sty m:val="p"/>
+            </m:rPr>
+            <m:t>=</m:t>
+          </m:r>
+          <m:f>
+            <m:fPr>
+              <m:type m:val="bar"/>
+            </m:fPr>
+            <m:num>
+              <m:r>
+                <m:t>180</m:t>
+              </m:r>
+            </m:num>
+            <m:den>
+              <m:r>
+                <m:t>π</m:t>
+              </m:r>
+            </m:den>
+          </m:f>
+          <m:sSup>
+            <m:e>
+              <m:r>
+                <m:rPr>
+                  <m:sty m:val="p"/>
+                </m:rPr>
+                <m:t>cos</m:t>
+              </m:r>
+            </m:e>
+            <m:sup>
+              <m:r>
+                <m:rPr>
+                  <m:sty m:val="p"/>
+                </m:rPr>
+                <m:t>−</m:t>
+              </m:r>
+              <m:r>
+                <m:t>1</m:t>
+              </m:r>
+            </m:sup>
+          </m:sSup>
+          <m:r>
+            <m:t>​</m:t>
+          </m:r>
+          <m:d>
+            <m:dPr>
+              <m:begChr m:val="("/>
+              <m:sepChr m:val=""/>
+              <m:endChr m:val=")"/>
+              <m:grow/>
+            </m:dPr>
+            <m:e>
+              <m:r>
+                <m:rPr>
+                  <m:sty m:val="p"/>
+                </m:rPr>
+                <m:t>clip</m:t>
+              </m:r>
+              <m:r>
+                <m:rPr>
+                  <m:sty m:val="p"/>
+                </m:rPr>
+                <m:t>(</m:t>
+              </m:r>
+              <m:acc>
+                <m:accPr>
+                  <m:chr m:val="̂"/>
+                </m:accPr>
+                <m:e>
+                  <m:r>
+                    <m:rPr>
+                      <m:sty m:val="b"/>
+                    </m:rPr>
+                    <m:t>v</m:t>
+                  </m:r>
+                </m:e>
+              </m:acc>
+              <m:r>
+                <m:rPr>
+                  <m:sty m:val="p"/>
+                </m:rPr>
+                <m:t>⋅</m:t>
+              </m:r>
+              <m:acc>
+                <m:accPr>
+                  <m:chr m:val="̂"/>
+                </m:accPr>
+                <m:e>
+                  <m:r>
+                    <m:rPr>
+                      <m:sty m:val="b"/>
+                    </m:rPr>
+                    <m:t>n</m:t>
+                  </m:r>
+                </m:e>
+              </m:acc>
+              <m:r>
+                <m:rPr>
+                  <m:sty m:val="p"/>
+                </m:rPr>
+                <m:t>,</m:t>
+              </m:r>
+              <m:r>
+                <m:rPr>
+                  <m:sty m:val="p"/>
+                </m:rPr>
+                <m:t>−</m:t>
+              </m:r>
+              <m:r>
+                <m:t>1</m:t>
+              </m:r>
+              <m:r>
+                <m:rPr>
+                  <m:sty m:val="p"/>
+                </m:rPr>
+                <m:t>,</m:t>
+              </m:r>
+              <m:r>
+                <m:t>1</m:t>
+              </m:r>
+              <m:r>
+                <m:rPr>
+                  <m:sty m:val="p"/>
+                </m:rPr>
+                <m:t>)</m:t>
+              </m:r>
+            </m:e>
+          </m:d>
+          <m:r>
+            <m:rPr>
+              <m:sty m:val="p"/>
+            </m:rPr>
+            <m:t>.</m:t>
+          </m:r>
+        </m:oMath>
+      </m:oMathPara>
+    </w:p>
+    <w:p>
+      <w:pPr>
+        <w:pStyle w:val="FirstParagraph"/>
+      </w:pPr>
+      <w:r>
+        <w:t xml:space="preserve">When the vectors are not collinear, the oriented plane normal is</w:t>
+      </w:r>
+    </w:p>
+    <w:p>
+      <w:pPr>
+        <w:pStyle w:val="BodyText"/>
+      </w:pPr>
+      <w:bookmarkStart w:id="62" w:name="dplane-normal-equation"/>
+      <w:bookmarkEnd w:id="62"/>
+    </w:p>
+    <w:p>
+      <w:pPr>
+        <w:pStyle w:val="BodyText"/>
+      </w:pPr>
+      <m:oMathPara>
+        <m:oMathParaPr>
+          <m:jc m:val="center"/>
+        </m:oMathParaPr>
+        <m:oMath>
+          <m:acc>
+            <m:accPr>
+              <m:chr m:val="̂"/>
+            </m:accPr>
+            <m:e>
+              <m:r>
+                <m:rPr>
+                  <m:sty m:val="b"/>
+                </m:rPr>
+                <m:t>d</m:t>
+              </m:r>
+            </m:e>
+          </m:acc>
+          <m:r>
+            <m:rPr>
+              <m:sty m:val="p"/>
+            </m:rPr>
+            <m:t>=</m:t>
+          </m:r>
+          <m:f>
+            <m:fPr>
+              <m:type m:val="bar"/>
+            </m:fPr>
+            <m:num>
+              <m:acc>
+                <m:accPr>
+                  <m:chr m:val="̂"/>
+                </m:accPr>
+                <m:e>
+                  <m:r>
+                    <m:rPr>
+                      <m:sty m:val="b"/>
+                    </m:rPr>
+                    <m:t>v</m:t>
+                  </m:r>
+                </m:e>
+              </m:acc>
+              <m:r>
+                <m:rPr>
+                  <m:sty m:val="p"/>
+                </m:rPr>
+                <m:t>×</m:t>
+              </m:r>
+              <m:acc>
+                <m:accPr>
+                  <m:chr m:val="̂"/>
+                </m:accPr>
+                <m:e>
+                  <m:r>
+                    <m:rPr>
+                      <m:sty m:val="b"/>
+                    </m:rPr>
+                    <m:t>n</m:t>
+                  </m:r>
+                </m:e>
+              </m:acc>
+            </m:num>
+            <m:den>
+              <m:d>
+                <m:dPr>
+                  <m:begChr m:val="‖"/>
+                  <m:sepChr m:val=""/>
+                  <m:endChr m:val="‖"/>
+                  <m:grow/>
+                </m:dPr>
+                <m:e>
+                  <m:acc>
+                    <m:accPr>
+                      <m:chr m:val="̂"/>
+                    </m:accPr>
+                    <m:e>
+                      <m:r>
+                        <m:rPr>
+                          <m:sty m:val="b"/>
+                        </m:rPr>
+                        <m:t>v</m:t>
+                      </m:r>
+                    </m:e>
+                  </m:acc>
+                  <m:r>
+                    <m:rPr>
+                      <m:sty m:val="p"/>
+                    </m:rPr>
+                    <m:t>×</m:t>
+                  </m:r>
+                  <m:acc>
+                    <m:accPr>
+                      <m:chr m:val="̂"/>
+                    </m:accPr>
+                    <m:e>
+                      <m:r>
+                        <m:rPr>
+                          <m:sty m:val="b"/>
+                        </m:rPr>
+                        <m:t>n</m:t>
+                      </m:r>
+                    </m:e>
+                  </m:acc>
+                </m:e>
+              </m:d>
+            </m:den>
+          </m:f>
+          <m:r>
+            <m:rPr>
+              <m:sty m:val="p"/>
+            </m:rPr>
+            <m:t>.</m:t>
+          </m:r>
+        </m:oMath>
+      </m:oMathPara>
+    </w:p>
+    <w:p>
+      <w:pPr>
+        <w:pStyle w:val="FirstParagraph"/>
+      </w:pPr>
+      <w:r>
+        <w:t xml:space="preserve">For any direction</w:t>
+      </w:r>
+      <w:r>
+        <w:t xml:space="preserve"> </w:t>
+      </w:r>
+      <m:oMath>
+        <m:r>
+          <m:rPr>
+            <m:sty m:val="b"/>
+          </m:rPr>
+          <m:t>q</m:t>
+        </m:r>
+      </m:oMath>
+      <w:r>
+        <w:t xml:space="preserve">, remove its vertical component:</w:t>
+      </w:r>
+      <w:r>
+        <w:t xml:space="preserve"> </w:t>
+      </w:r>
+      <m:oMath>
+        <m:sSub>
+          <m:e>
+            <m:r>
+              <m:rPr>
+                <m:sty m:val="b"/>
+              </m:rPr>
+              <m:t>q</m:t>
+            </m:r>
+          </m:e>
+          <m:sub>
+            <m:r>
+              <m:t>h</m:t>
+            </m:r>
+          </m:sub>
+        </m:sSub>
+        <m:r>
+          <m:rPr>
+            <m:sty m:val="p"/>
+          </m:rPr>
+          <m:t>=</m:t>
+        </m:r>
+        <m:r>
+          <m:rPr>
+            <m:sty m:val="b"/>
+          </m:rPr>
+          <m:t>q</m:t>
+        </m:r>
+        <m:r>
+          <m:rPr>
+            <m:sty m:val="p"/>
+          </m:rPr>
+          <m:t>−</m:t>
+        </m:r>
+        <m:r>
+          <m:rPr>
+            <m:sty m:val="p"/>
+          </m:rPr>
+          <m:t>(</m:t>
+        </m:r>
+        <m:r>
+          <m:rPr>
+            <m:sty m:val="b"/>
+          </m:rPr>
+          <m:t>q</m:t>
+        </m:r>
+        <m:r>
+          <m:rPr>
+            <m:sty m:val="p"/>
+          </m:rPr>
+          <m:t>⋅</m:t>
+        </m:r>
+        <m:acc>
+          <m:accPr>
+            <m:chr m:val="̂"/>
+          </m:accPr>
+          <m:e>
+            <m:r>
+              <m:rPr>
+                <m:sty m:val="b"/>
+              </m:rPr>
+              <m:t>u</m:t>
+            </m:r>
+          </m:e>
+        </m:acc>
+        <m:r>
+          <m:rPr>
+            <m:sty m:val="p"/>
+          </m:rPr>
+          <m:t>)</m:t>
+        </m:r>
+        <m:acc>
+          <m:accPr>
+            <m:chr m:val="̂"/>
+          </m:accPr>
+          <m:e>
+            <m:r>
+              <m:rPr>
+                <m:sty m:val="b"/>
+              </m:rPr>
+              <m:t>u</m:t>
+            </m:r>
+          </m:e>
+        </m:acc>
+      </m:oMath>
+      <w:r>
+        <w:t xml:space="preserve">.</w:t>
+      </w:r>
+      <w:r>
+        <w:t xml:space="preserve"> </w:t>
+      </w:r>
+      <w:r>
+        <w:t xml:space="preserve">Heading and elevation are</w:t>
+      </w:r>
+      <w:r>
+        <w:t xml:space="preserve"> </w:t>
+      </w:r>
+      <m:oMath>
+        <m:r>
+          <m:rPr>
+            <m:sty m:val="p"/>
+          </m:rPr>
+          <m:t>atan2</m:t>
+        </m:r>
+        <m:r>
+          <m:rPr>
+            <m:sty m:val="p"/>
+          </m:rPr>
+          <m:t>(</m:t>
+        </m:r>
+        <m:sSub>
+          <m:e>
+            <m:r>
+              <m:rPr>
+                <m:sty m:val="b"/>
+              </m:rPr>
+              <m:t>q</m:t>
+            </m:r>
+          </m:e>
+          <m:sub>
+            <m:r>
+              <m:t>h</m:t>
+            </m:r>
+          </m:sub>
+        </m:sSub>
+        <m:r>
+          <m:rPr>
+            <m:sty m:val="p"/>
+          </m:rPr>
+          <m:t>⋅</m:t>
+        </m:r>
+        <m:acc>
+          <m:accPr>
+            <m:chr m:val="̂"/>
+          </m:accPr>
+          <m:e>
+            <m:r>
+              <m:rPr>
+                <m:sty m:val="b"/>
+              </m:rPr>
+              <m:t>r</m:t>
+            </m:r>
+          </m:e>
+        </m:acc>
+        <m:r>
+          <m:rPr>
+            <m:sty m:val="p"/>
+          </m:rPr>
+          <m:t>,</m:t>
+        </m:r>
+        <m:sSub>
+          <m:e>
+            <m:r>
+              <m:rPr>
+                <m:sty m:val="b"/>
+              </m:rPr>
+              <m:t>q</m:t>
+            </m:r>
+          </m:e>
+          <m:sub>
+            <m:r>
+              <m:t>h</m:t>
+            </m:r>
+          </m:sub>
+        </m:sSub>
+        <m:r>
+          <m:rPr>
+            <m:sty m:val="p"/>
+          </m:rPr>
+          <m:t>⋅</m:t>
+        </m:r>
+        <m:acc>
+          <m:accPr>
+            <m:chr m:val="̂"/>
+          </m:accPr>
+          <m:e>
+            <m:r>
+              <m:rPr>
+                <m:sty m:val="b"/>
+              </m:rPr>
+              <m:t>t</m:t>
+            </m:r>
+          </m:e>
+        </m:acc>
+        <m:r>
+          <m:rPr>
+            <m:sty m:val="p"/>
+          </m:rPr>
+          <m:t>)</m:t>
+        </m:r>
+      </m:oMath>
+      <w:r>
+        <w:t xml:space="preserve"> </w:t>
+      </w:r>
+      <w:r>
+        <w:t xml:space="preserve">and</w:t>
+      </w:r>
+      <w:r>
+        <w:t xml:space="preserve"> </w:t>
+      </w:r>
+      <m:oMath>
+        <m:r>
+          <m:rPr>
+            <m:sty m:val="p"/>
+          </m:rPr>
+          <m:t>atan2</m:t>
+        </m:r>
+        <m:r>
+          <m:rPr>
+            <m:sty m:val="p"/>
+          </m:rPr>
+          <m:t>(</m:t>
+        </m:r>
+        <m:r>
+          <m:rPr>
+            <m:sty m:val="b"/>
+          </m:rPr>
+          <m:t>q</m:t>
+        </m:r>
+        <m:r>
+          <m:rPr>
+            <m:sty m:val="p"/>
+          </m:rPr>
+          <m:t>⋅</m:t>
+        </m:r>
+        <m:acc>
+          <m:accPr>
+            <m:chr m:val="̂"/>
+          </m:accPr>
+          <m:e>
+            <m:r>
+              <m:rPr>
+                <m:sty m:val="b"/>
+              </m:rPr>
+              <m:t>u</m:t>
+            </m:r>
+          </m:e>
+        </m:acc>
+        <m:r>
+          <m:rPr>
+            <m:sty m:val="p"/>
+          </m:rPr>
+          <m:t>,</m:t>
+        </m:r>
+        <m:d>
+          <m:dPr>
+            <m:begChr m:val="‖"/>
+            <m:sepChr m:val=""/>
+            <m:endChr m:val="‖"/>
+            <m:grow/>
+          </m:dPr>
+          <m:e>
+            <m:sSub>
+              <m:e>
+                <m:r>
+                  <m:rPr>
+                    <m:sty m:val="b"/>
+                  </m:rPr>
+                  <m:t>q</m:t>
+                </m:r>
+              </m:e>
+              <m:sub>
+                <m:r>
+                  <m:t>h</m:t>
+                </m:r>
+              </m:sub>
+            </m:sSub>
+          </m:e>
+        </m:d>
+        <m:r>
+          <m:rPr>
+            <m:sty m:val="p"/>
+          </m:rPr>
+          <m:t>)</m:t>
+        </m:r>
+      </m:oMath>
+      <w:r>
+        <w:t xml:space="preserve">. Face-to-path wraps</w:t>
+      </w:r>
+      <w:r>
+        <w:t xml:space="preserve"> </w:t>
+      </w:r>
+      <m:oMath>
+        <m:r>
+          <m:t>f</m:t>
+        </m:r>
+        <m:r>
+          <m:rPr>
+            <m:sty m:val="p"/>
+          </m:rPr>
+          <m:t>−</m:t>
+        </m:r>
+        <m:r>
+          <m:t>p</m:t>
+        </m:r>
+      </m:oMath>
+      <w:r>
+        <w:t xml:space="preserve"> </w:t>
+      </w:r>
+      <w:r>
+        <w:t xml:space="preserve">to</w:t>
+      </w:r>
+      <w:r>
+        <w:t xml:space="preserve"> </w:t>
+      </w:r>
+      <m:oMath>
+        <m:r>
+          <m:rPr>
+            <m:sty m:val="p"/>
+          </m:rPr>
+          <m:t>[</m:t>
+        </m:r>
+        <m:r>
+          <m:rPr>
+            <m:sty m:val="p"/>
+          </m:rPr>
+          <m:t>−</m:t>
+        </m:r>
+        <m:r>
+          <m:t>180</m:t>
+        </m:r>
+        <m:r>
+          <m:rPr>
+            <m:sty m:val="p"/>
+          </m:rPr>
+          <m:t>,</m:t>
+        </m:r>
+        <m:r>
+          <m:t>180</m:t>
+        </m:r>
+        <m:r>
+          <m:rPr>
+            <m:sty m:val="p"/>
+          </m:rPr>
+          <m:t>)</m:t>
+        </m:r>
+      </m:oMath>
+      <w:r>
+        <w:t xml:space="preserve">.</w:t>
+      </w:r>
+      <w:r>
+        <w:t xml:space="preserve"> </w:t>
+      </w:r>
+      <w:r>
+        <w:t xml:space="preserve">Rate of Closure obtains face-center velocity from rigid-body kinematics before</w:t>
+      </w:r>
+      <w:r>
+        <w:t xml:space="preserve"> </w:t>
+      </w:r>
+      <w:r>
+        <w:t xml:space="preserve">applying the same geometry.</w:t>
+      </w:r>
+    </w:p>
+    <w:bookmarkEnd w:id="63"/>
+    <w:bookmarkEnd w:id="64"/>
+    <w:bookmarkStart w:id="68" w:name="algorithm"/>
+    <w:p>
+      <w:pPr>
+        <w:pStyle w:val="Heading2"/>
+      </w:pPr>
+      <w:r>
+        <w:t xml:space="preserve">Algorithm</w:t>
+      </w:r>
+    </w:p>
+    <w:bookmarkStart w:id="65" w:name="inputs"/>
+    <w:p>
+      <w:pPr>
+        <w:pStyle w:val="Heading3"/>
+      </w:pPr>
+      <w:r>
+        <w:t xml:space="preserve">Inputs</w:t>
+      </w:r>
+    </w:p>
+    <w:p>
+      <w:pPr>
+        <w:pStyle w:val="FirstParagraph"/>
+      </w:pPr>
+      <w:r>
+        <w:t xml:space="preserve">The standalone calculation consumes</w:t>
+      </w:r>
+      <w:r>
+        <w:t xml:space="preserve"> </w:t>
+      </w:r>
+      <w:r>
+        <w:rPr>
+          <w:rStyle w:val="VerbatimChar"/>
+        </w:rPr>
+        <w:t xml:space="preserve">travel_vector</w:t>
+      </w:r>
+      <w:r>
+        <w:t xml:space="preserve">,</w:t>
+      </w:r>
+      <w:r>
+        <w:t xml:space="preserve"> </w:t>
+      </w:r>
+      <w:r>
+        <w:rPr>
+          <w:rStyle w:val="VerbatimChar"/>
+        </w:rPr>
+        <w:t xml:space="preserve">face_normal</w:t>
+      </w:r>
+      <w:r>
+        <w:t xml:space="preserve">,</w:t>
+      </w:r>
+      <w:r>
+        <w:t xml:space="preserve"> </w:t>
+      </w:r>
+      <w:r>
+        <w:t xml:space="preserve">optional</w:t>
+      </w:r>
+      <w:r>
+        <w:t xml:space="preserve"> </w:t>
+      </w:r>
+      <w:r>
+        <w:rPr>
+          <w:rStyle w:val="VerbatimChar"/>
+        </w:rPr>
+        <w:t xml:space="preserve">target</w:t>
+      </w:r>
+      <w:r>
+        <w:t xml:space="preserve"> </w:t>
+      </w:r>
+      <w:r>
+        <w:t xml:space="preserve">and</w:t>
+      </w:r>
+      <w:r>
+        <w:t xml:space="preserve"> </w:t>
+      </w:r>
+      <w:r>
+        <w:rPr>
+          <w:rStyle w:val="VerbatimChar"/>
+        </w:rPr>
+        <w:t xml:space="preserve">up</w:t>
+      </w:r>
+      <w:r>
+        <w:t xml:space="preserve">, and descriptive</w:t>
+      </w:r>
+      <w:r>
+        <w:t xml:space="preserve"> </w:t>
+      </w:r>
+      <w:r>
+        <w:rPr>
+          <w:rStyle w:val="VerbatimChar"/>
+        </w:rPr>
+        <w:t xml:space="preserve">frame_id</w:t>
+      </w:r>
+      <w:r>
+        <w:t xml:space="preserve">. The consumer</w:t>
+      </w:r>
+      <w:r>
+        <w:t xml:space="preserve"> </w:t>
+      </w:r>
+      <w:r>
+        <w:t xml:space="preserve">accepts one immutable</w:t>
+      </w:r>
+      <w:r>
+        <w:t xml:space="preserve"> </w:t>
+      </w:r>
+      <w:r>
+        <w:rPr>
+          <w:rStyle w:val="VerbatimChar"/>
+        </w:rPr>
+        <w:t xml:space="preserve">SimulationRun</w:t>
+      </w:r>
+      <w:r>
+        <w:t xml:space="preserve"> </w:t>
+      </w:r>
+      <w:r>
+        <w:t xml:space="preserve">and derives inspection pose, twist,</w:t>
+      </w:r>
+      <w:r>
+        <w:t xml:space="preserve"> </w:t>
+      </w:r>
+      <w:r>
+        <w:t xml:space="preserve">shaft geometry, contact lever, face normal, leading-edge tangent, and arc</w:t>
+      </w:r>
+      <w:r>
+        <w:t xml:space="preserve"> </w:t>
+      </w:r>
+      <w:r>
+        <w:t xml:space="preserve">tangent rather than asking callers to assemble those values.</w:t>
+      </w:r>
+    </w:p>
+    <w:bookmarkEnd w:id="65"/>
+    <w:bookmarkStart w:id="66" w:name="procedure"/>
+    <w:p>
+      <w:pPr>
+        <w:pStyle w:val="Heading3"/>
+      </w:pPr>
+      <w:r>
+        <w:t xml:space="preserve">Procedure</w:t>
+      </w:r>
+    </w:p>
+    <w:p>
+      <w:pPr>
+        <w:pStyle w:val="Compact"/>
+        <w:numPr>
+          <w:ilvl w:val="0"/>
+          <w:numId w:val="1003"/>
+        </w:numPr>
+      </w:pPr>
+      <w:r>
+        <w:t xml:space="preserve">Convert each vector to a finite three-component array and validate the frame.</w:t>
+      </w:r>
+    </w:p>
+    <w:p>
+      <w:pPr>
+        <w:pStyle w:val="Compact"/>
+        <w:numPr>
+          <w:ilvl w:val="0"/>
+          <w:numId w:val="1003"/>
+        </w:numPr>
+      </w:pPr>
+      <w:r>
+        <w:t xml:space="preserve">Normalize face, target, and up; derive right from target-times-up.</w:t>
+      </w:r>
+    </w:p>
+    <w:p>
+      <w:pPr>
+        <w:pStyle w:val="Compact"/>
+        <w:numPr>
+          <w:ilvl w:val="0"/>
+          <w:numId w:val="1003"/>
+        </w:numPr>
+      </w:pPr>
+      <w:r>
+        <w:t xml:space="preserve">Compute face heading and dynamic loft even if travel is zero.</w:t>
+      </w:r>
+    </w:p>
+    <w:p>
+      <w:pPr>
+        <w:pStyle w:val="Compact"/>
+        <w:numPr>
+          <w:ilvl w:val="0"/>
+          <w:numId w:val="1003"/>
+        </w:numPr>
+      </w:pPr>
+      <w:r>
+        <w:t xml:space="preserve">Return</w:t>
+      </w:r>
+      <w:r>
+        <w:t xml:space="preserve"> </w:t>
+      </w:r>
+      <w:r>
+        <w:rPr>
+          <w:rStyle w:val="VerbatimChar"/>
+        </w:rPr>
+        <w:t xml:space="preserve">zero_travel</w:t>
+      </w:r>
+      <w:r>
+        <w:t xml:space="preserve"> </w:t>
+      </w:r>
+      <w:r>
+        <w:t xml:space="preserve">when travel norm is at most</w:t>
+      </w:r>
+      <w:r>
+        <w:t xml:space="preserve"> </w:t>
+      </w:r>
+      <m:oMath>
+        <m:sSup>
+          <m:e>
+            <m:r>
+              <m:t>10</m:t>
+            </m:r>
+          </m:e>
+          <m:sup>
+            <m:r>
+              <m:rPr>
+                <m:sty m:val="p"/>
+              </m:rPr>
+              <m:t>−</m:t>
+            </m:r>
+            <m:r>
+              <m:t>12</m:t>
+            </m:r>
+          </m:sup>
+        </m:sSup>
+      </m:oMath>
+      <w:r>
+        <w:t xml:space="preserve">.</w:t>
+      </w:r>
+    </w:p>
+    <w:p>
+      <w:pPr>
+        <w:pStyle w:val="Compact"/>
+        <w:numPr>
+          <w:ilvl w:val="0"/>
+          <w:numId w:val="1003"/>
+        </w:numPr>
+      </w:pPr>
+      <w:r>
+        <w:t xml:space="preserve">Normalize travel; compute path, attack, face-to-path, and spin loft.</w:t>
+      </w:r>
+    </w:p>
+    <w:p>
+      <w:pPr>
+        <w:pStyle w:val="Compact"/>
+        <w:numPr>
+          <w:ilvl w:val="0"/>
+          <w:numId w:val="1003"/>
+        </w:numPr>
+      </w:pPr>
+      <w:r>
+        <w:t xml:space="preserve">Return</w:t>
+      </w:r>
+      <w:r>
+        <w:t xml:space="preserve"> </w:t>
+      </w:r>
+      <w:r>
+        <w:rPr>
+          <w:rStyle w:val="VerbatimChar"/>
+        </w:rPr>
+        <w:t xml:space="preserve">parallel</w:t>
+      </w:r>
+      <w:r>
+        <w:t xml:space="preserve"> </w:t>
+      </w:r>
+      <w:r>
+        <w:t xml:space="preserve">or</w:t>
+      </w:r>
+      <w:r>
+        <w:t xml:space="preserve"> </w:t>
+      </w:r>
+      <w:r>
+        <w:rPr>
+          <w:rStyle w:val="VerbatimChar"/>
+        </w:rPr>
+        <w:t xml:space="preserve">antiparallel</w:t>
+      </w:r>
+      <w:r>
+        <w:t xml:space="preserve"> </w:t>
+      </w:r>
+      <w:r>
+        <w:t xml:space="preserve">for a singular cross product.</w:t>
+      </w:r>
+    </w:p>
+    <w:p>
+      <w:pPr>
+        <w:pStyle w:val="Compact"/>
+        <w:numPr>
+          <w:ilvl w:val="0"/>
+          <w:numId w:val="1003"/>
+        </w:numPr>
+      </w:pPr>
+      <w:r>
+        <w:t xml:space="preserve">Otherwise derive plane normal, tilt, inclination, and ground intersection.</w:t>
+      </w:r>
+    </w:p>
+    <w:p>
+      <w:pPr>
+        <w:pStyle w:val="Compact"/>
+        <w:numPr>
+          <w:ilvl w:val="0"/>
+          <w:numId w:val="1003"/>
+        </w:numPr>
+      </w:pPr>
+      <w:r>
+        <w:t xml:space="preserve">Rate of Closure repeats the calculation for reference, face center, and</w:t>
+      </w:r>
+      <w:r>
+        <w:t xml:space="preserve"> </w:t>
+      </w:r>
+      <w:r>
+        <w:t xml:space="preserve">contact so a consumer cannot silently confuse those datums.</w:t>
+      </w:r>
+    </w:p>
+    <w:p>
+      <w:pPr>
+        <w:pStyle w:val="FirstParagraph"/>
+      </w:pPr>
+      <w:r>
+        <w:t xml:space="preserve">Standalone work is constant time and memory. Sector rendering is linear in the</w:t>
+      </w:r>
+      <w:r>
+        <w:t xml:space="preserve"> </w:t>
+      </w:r>
+      <w:r>
+        <w:t xml:space="preserve">caller-bounded segment count and returns</w:t>
+      </w:r>
+      <w:r>
+        <w:t xml:space="preserve"> </w:t>
+      </w:r>
+      <w:r>
+        <w:rPr>
+          <w:rStyle w:val="VerbatimChar"/>
+        </w:rPr>
+        <w:t xml:space="preserve">segments + 1</w:t>
+      </w:r>
+      <w:r>
+        <w:t xml:space="preserve"> </w:t>
+      </w:r>
+      <w:r>
+        <w:t xml:space="preserve">unit directions.</w:t>
+      </w:r>
+    </w:p>
+    <w:bookmarkEnd w:id="66"/>
+    <w:bookmarkStart w:id="67" w:name="outputs"/>
+    <w:p>
+      <w:pPr>
+        <w:pStyle w:val="Heading3"/>
+      </w:pPr>
+      <w:r>
+        <w:t xml:space="preserve">Outputs</w:t>
+      </w:r>
+    </w:p>
+    <w:p>
+      <w:pPr>
+        <w:pStyle w:val="FirstParagraph"/>
+      </w:pPr>
+      <w:r>
+        <w:rPr>
+          <w:rStyle w:val="VerbatimChar"/>
+        </w:rPr>
+        <w:t xml:space="preserve">DPlaneAnalysis</w:t>
+      </w:r>
+      <w:r>
+        <w:t xml:space="preserve"> </w:t>
+      </w:r>
+      <w:r>
+        <w:t xml:space="preserve">returns status, frame, normalized basis vectors, optional</w:t>
+      </w:r>
+      <w:r>
+        <w:t xml:space="preserve"> </w:t>
+      </w:r>
+      <w:r>
+        <w:t xml:space="preserve">plane and ground-intersection directions, three-dimensional and planar spin</w:t>
+      </w:r>
+      <w:r>
+        <w:t xml:space="preserve"> </w:t>
+      </w:r>
+      <w:r>
+        <w:t xml:space="preserve">loft, residual, path, attack, face, dynamic loft, face-to-path, azimuth, tilt,</w:t>
+      </w:r>
+      <w:r>
+        <w:t xml:space="preserve"> </w:t>
+      </w:r>
+      <w:r>
+        <w:t xml:space="preserve">and inclination.</w:t>
+      </w:r>
+      <w:r>
+        <w:t xml:space="preserve"> </w:t>
+      </w:r>
+      <w:r>
+        <w:rPr>
+          <w:rStyle w:val="VerbatimChar"/>
+        </w:rPr>
+        <w:t xml:space="preserve">ImpactKinematicSnapshot</w:t>
+      </w:r>
+      <w:r>
+        <w:t xml:space="preserve"> </w:t>
+      </w:r>
+      <w:r>
+        <w:t xml:space="preserve">wraps three analyses with event,</w:t>
+      </w:r>
+      <w:r>
+        <w:t xml:space="preserve"> </w:t>
+      </w:r>
+      <w:r>
+        <w:t xml:space="preserve">geometry basis, limitations, pose, and wedge-kinematics evidence.</w:t>
+      </w:r>
+    </w:p>
+    <w:bookmarkEnd w:id="67"/>
+    <w:bookmarkEnd w:id="68"/>
+    <w:bookmarkStart w:id="71" w:name="implementation-symbols"/>
+    <w:p>
+      <w:pPr>
+        <w:pStyle w:val="Heading2"/>
+      </w:pPr>
+      <w:r>
+        <w:t xml:space="preserve">Implementation Symbols</w:t>
+      </w:r>
+    </w:p>
+    <w:bookmarkStart w:id="69" w:name="public-symbols"/>
+    <w:p>
+      <w:pPr>
+        <w:pStyle w:val="Heading3"/>
+      </w:pPr>
+      <w:r>
+        <w:t xml:space="preserve">Public Symbols</w:t>
+      </w:r>
+    </w:p>
+    <w:p>
+      <w:pPr>
+        <w:pStyle w:val="FirstParagraph"/>
+      </w:pPr>
+      <w:r>
+        <w:t xml:space="preserve">The stable</w:t>
+      </w:r>
+      <w:r>
+        <w:t xml:space="preserve"> </w:t>
+      </w:r>
+      <w:r>
+        <w:rPr>
+          <w:rStyle w:val="VerbatimChar"/>
+        </w:rPr>
+        <w:t xml:space="preserve">shared.python.swing_sim.impact</w:t>
+      </w:r>
+      <w:r>
+        <w:t xml:space="preserve"> </w:t>
+      </w:r>
+      <w:r>
+        <w:t xml:space="preserve">facade exports</w:t>
+      </w:r>
+      <w:r>
+        <w:t xml:space="preserve"> </w:t>
+      </w:r>
+      <w:r>
+        <w:rPr>
+          <w:rStyle w:val="VerbatimChar"/>
+        </w:rPr>
+        <w:t xml:space="preserve">DPlaneStatus</w:t>
+      </w:r>
+      <w:r>
+        <w:t xml:space="preserve">,</w:t>
+      </w:r>
+      <w:r>
+        <w:t xml:space="preserve"> </w:t>
+      </w:r>
+      <w:r>
+        <w:rPr>
+          <w:rStyle w:val="VerbatimChar"/>
+        </w:rPr>
+        <w:t xml:space="preserve">DPlaneAnalysis</w:t>
+      </w:r>
+      <w:r>
+        <w:t xml:space="preserve">,</w:t>
+      </w:r>
+      <w:r>
+        <w:t xml:space="preserve"> </w:t>
+      </w:r>
+      <w:r>
+        <w:rPr>
+          <w:rStyle w:val="VerbatimChar"/>
+        </w:rPr>
+        <w:t xml:space="preserve">analyze_dplane</w:t>
+      </w:r>
+      <w:r>
+        <w:t xml:space="preserve">, and</w:t>
+      </w:r>
+      <w:r>
+        <w:t xml:space="preserve"> </w:t>
+      </w:r>
+      <w:r>
+        <w:rPr>
+          <w:rStyle w:val="VerbatimChar"/>
+        </w:rPr>
+        <w:t xml:space="preserve">spin_loft_sector_directions</w:t>
+      </w:r>
+      <w:r>
+        <w:t xml:space="preserve">. Rate of Closure exports</w:t>
+      </w:r>
+      <w:r>
+        <w:t xml:space="preserve"> </w:t>
+      </w:r>
+      <w:r>
+        <w:rPr>
+          <w:rStyle w:val="VerbatimChar"/>
+        </w:rPr>
+        <w:t xml:space="preserve">ImpactKinematicSnapshot</w:t>
+      </w:r>
+      <w:r>
+        <w:t xml:space="preserve"> </w:t>
+      </w:r>
+      <w:r>
+        <w:t xml:space="preserve">and</w:t>
+      </w:r>
+      <w:r>
+        <w:t xml:space="preserve"> </w:t>
+      </w:r>
+      <w:r>
+        <w:rPr>
+          <w:rStyle w:val="VerbatimChar"/>
+        </w:rPr>
+        <w:t xml:space="preserve">impact_kinematics_for_run</w:t>
+      </w:r>
+      <w:r>
+        <w:t xml:space="preserve">. Consumers should</w:t>
+      </w:r>
+      <w:r>
+        <w:t xml:space="preserve"> </w:t>
+      </w:r>
+      <w:r>
+        <w:t xml:space="preserve">not import private helpers such as</w:t>
+      </w:r>
+      <w:r>
+        <w:t xml:space="preserve"> </w:t>
+      </w:r>
+      <w:r>
+        <w:rPr>
+          <w:rStyle w:val="VerbatimChar"/>
+        </w:rPr>
+        <w:t xml:space="preserve">_heading_deg</w:t>
+      </w:r>
+      <w:r>
+        <w:t xml:space="preserve"> </w:t>
+      </w:r>
+      <w:r>
+        <w:t xml:space="preserve">or</w:t>
+      </w:r>
+      <w:r>
+        <w:t xml:space="preserve"> </w:t>
+      </w:r>
+      <w:r>
+        <w:rPr>
+          <w:rStyle w:val="VerbatimChar"/>
+        </w:rPr>
+        <w:t xml:space="preserve">_shaft_geometry</w:t>
+      </w:r>
+      <w:r>
+        <w:t xml:space="preserve">.</w:t>
+      </w:r>
+    </w:p>
+    <w:bookmarkEnd w:id="69"/>
+    <w:bookmarkStart w:id="70" w:name="source-mapping"/>
+    <w:p>
+      <w:pPr>
+        <w:pStyle w:val="Heading3"/>
+      </w:pPr>
+      <w:r>
+        <w:t xml:space="preserve">Source Mapping</w:t>
+      </w:r>
+    </w:p>
+    <w:p>
+      <w:pPr>
+        <w:pStyle w:val="FirstParagraph"/>
+      </w:pPr>
+      <w:r>
+        <w:t xml:space="preserve">Calculation</w:t>
+      </w:r>
+      <w:r>
+        <w:t xml:space="preserve"> </w:t>
+      </w:r>
+      <w:r>
+        <w:rPr>
+          <w:rStyle w:val="VerbatimChar"/>
+        </w:rPr>
+        <w:t xml:space="preserve">TOOLS-DPLANE-GEOMETRY</w:t>
+      </w:r>
+      <w:r>
+        <w:t xml:space="preserve"> </w:t>
+      </w:r>
+      <w:r>
+        <w:t xml:space="preserve">maps spin loft, normal, heading,</w:t>
+      </w:r>
+      <w:r>
+        <w:t xml:space="preserve"> </w:t>
+      </w:r>
+      <w:r>
+        <w:t xml:space="preserve">elevation, singular states, and sectors to</w:t>
+      </w:r>
+      <w:r>
+        <w:t xml:space="preserve"> </w:t>
+      </w:r>
+      <w:r>
+        <w:rPr>
+          <w:rStyle w:val="VerbatimChar"/>
+        </w:rPr>
+        <w:t xml:space="preserve">src/shared/python/swing_sim/impact/dplane.py</w:t>
+      </w:r>
+      <w:r>
+        <w:t xml:space="preserve">. The Rate-of-Closure datum and</w:t>
+      </w:r>
+      <w:r>
+        <w:t xml:space="preserve"> </w:t>
+      </w:r>
+      <w:r>
+        <w:t xml:space="preserve">point-velocity mapping lives in</w:t>
+      </w:r>
+      <w:r>
+        <w:t xml:space="preserve"> </w:t>
+      </w:r>
+      <w:r>
+        <w:rPr>
+          <w:rStyle w:val="VerbatimChar"/>
+        </w:rPr>
+        <w:t xml:space="preserve">src/rate_of_closure/simulation/impact_kinematics.py</w:t>
+      </w:r>
+      <w:r>
+        <w:t xml:space="preserve">. Both are pinned to D3</w:t>
+      </w:r>
+      <w:r>
+        <w:t xml:space="preserve"> </w:t>
+      </w:r>
+      <w:r>
+        <w:t xml:space="preserve">base</w:t>
+      </w:r>
+      <w:r>
+        <w:t xml:space="preserve"> </w:t>
+      </w:r>
+      <w:r>
+        <w:rPr>
+          <w:rStyle w:val="VerbatimChar"/>
+        </w:rPr>
+        <w:t xml:space="preserve">916fb9f27f486486f0c071dcc6f15f81f68ecb18</w:t>
+      </w:r>
+      <w:r>
+        <w:t xml:space="preserve">; their provisional module</w:t>
+      </w:r>
+      <w:r>
+        <w:t xml:space="preserve"> </w:t>
+      </w:r>
+      <w:r>
+        <w:t xml:space="preserve">IDs and public symbols remain recorded in the module inventory.</w:t>
+      </w:r>
+    </w:p>
+    <w:bookmarkEnd w:id="70"/>
+    <w:bookmarkEnd w:id="71"/>
+    <w:bookmarkStart w:id="74" w:name="error-and-failure-semantics"/>
+    <w:p>
+      <w:pPr>
+        <w:pStyle w:val="Heading2"/>
+      </w:pPr>
+      <w:r>
+        <w:t xml:space="preserve">Error and Failure Semantics</w:t>
+      </w:r>
+    </w:p>
+    <w:bookmarkStart w:id="72" w:name="error-conditions"/>
+    <w:p>
+      <w:pPr>
+        <w:pStyle w:val="Heading3"/>
+      </w:pPr>
+      <w:r>
+        <w:t xml:space="preserve">Error Conditions</w:t>
+      </w:r>
+    </w:p>
+    <w:p>
+      <w:pPr>
+        <w:pStyle w:val="FirstParagraph"/>
+      </w:pPr>
+      <w:r>
+        <w:t xml:space="preserve">Wrong vector shape, non-finite values, zero face/target/up, or a nonorthogonal</w:t>
+      </w:r>
+      <w:r>
+        <w:t xml:space="preserve"> </w:t>
+      </w:r>
+      <w:r>
+        <w:t xml:space="preserve">frame raises</w:t>
+      </w:r>
+      <w:r>
+        <w:t xml:space="preserve"> </w:t>
+      </w:r>
+      <w:r>
+        <w:rPr>
+          <w:rStyle w:val="VerbatimChar"/>
+        </w:rPr>
+        <w:t xml:space="preserve">ValueError</w:t>
+      </w:r>
+      <w:r>
+        <w:t xml:space="preserve">. A non-</w:t>
+      </w:r>
+      <w:r>
+        <w:rPr>
+          <w:rStyle w:val="VerbatimChar"/>
+        </w:rPr>
+        <w:t xml:space="preserve">SimulationRun</w:t>
+      </w:r>
+      <w:r>
+        <w:t xml:space="preserve"> </w:t>
+      </w:r>
+      <w:r>
+        <w:t xml:space="preserve">input raises</w:t>
+      </w:r>
+      <w:r>
+        <w:t xml:space="preserve"> </w:t>
+      </w:r>
+      <w:r>
+        <w:rPr>
+          <w:rStyle w:val="VerbatimChar"/>
+        </w:rPr>
+        <w:t xml:space="preserve">TypeError</w:t>
+      </w:r>
+      <w:r>
+        <w:t xml:space="preserve">.</w:t>
+      </w:r>
+      <w:r>
+        <w:t xml:space="preserve"> </w:t>
+      </w:r>
+      <w:r>
+        <w:t xml:space="preserve">Nonincreasing times, zero shaft geometry, zero path fallback, or degenerate</w:t>
+      </w:r>
+      <w:r>
+        <w:t xml:space="preserve"> </w:t>
+      </w:r>
+      <w:r>
+        <w:t xml:space="preserve">projected leading edge also fail preconditions. These failures are distinct</w:t>
+      </w:r>
+      <w:r>
+        <w:t xml:space="preserve"> </w:t>
+      </w:r>
+      <w:r>
+        <w:t xml:space="preserve">from valid singular geometry.</w:t>
+      </w:r>
+    </w:p>
+    <w:bookmarkEnd w:id="72"/>
+    <w:bookmarkStart w:id="73" w:name="recovery-and-cancellation"/>
+    <w:p>
+      <w:pPr>
+        <w:pStyle w:val="Heading3"/>
+      </w:pPr>
+      <w:r>
+        <w:t xml:space="preserve">Recovery and Cancellation</w:t>
+      </w:r>
+    </w:p>
+    <w:p>
+      <w:pPr>
+        <w:pStyle w:val="FirstParagraph"/>
+      </w:pPr>
+      <w:r>
+        <w:t xml:space="preserve">Callers recover by correcting source data or frame; the method does not coerce,</w:t>
+      </w:r>
+      <w:r>
+        <w:t xml:space="preserve"> </w:t>
+      </w:r>
+      <w:r>
+        <w:t xml:space="preserve">interpolate missing vectors, or substitute a default. Valid singular statuses</w:t>
+      </w:r>
+      <w:r>
+        <w:t xml:space="preserve"> </w:t>
+      </w:r>
+      <w:r>
+        <w:t xml:space="preserve">may be displayed with null fields intact. The synchronous calculation is</w:t>
+      </w:r>
+      <w:r>
+        <w:t xml:space="preserve"> </w:t>
+      </w:r>
+      <w:r>
+        <w:t xml:space="preserve">bounded and has no external I/O, so it has no mid-operation cancellation seam.</w:t>
+      </w:r>
+      <w:r>
+        <w:t xml:space="preserve"> </w:t>
+      </w:r>
+      <w:r>
+        <w:t xml:space="preserve">Higher-level cancellation occurs before calls or between complete runs.</w:t>
+      </w:r>
+    </w:p>
+    <w:bookmarkEnd w:id="73"/>
+    <w:bookmarkEnd w:id="74"/>
+    <w:bookmarkStart w:id="77" w:name="uncertainty-and-sensitivity"/>
+    <w:p>
+      <w:pPr>
+        <w:pStyle w:val="Heading2"/>
+      </w:pPr>
+      <w:r>
+        <w:t xml:space="preserve">Uncertainty and Sensitivity</w:t>
+      </w:r>
+    </w:p>
+    <w:bookmarkStart w:id="75" w:name="uncertainty-sources"/>
+    <w:p>
+      <w:pPr>
+        <w:pStyle w:val="Heading3"/>
+      </w:pPr>
+      <w:r>
+        <w:t xml:space="preserve">Uncertainty Sources</w:t>
+      </w:r>
+    </w:p>
+    <w:p>
+      <w:pPr>
+        <w:pStyle w:val="FirstParagraph"/>
+      </w:pPr>
+      <w:r>
+        <w:t xml:space="preserve">The implementation does not estimate covariance. Uncertainty can enter through</w:t>
+      </w:r>
+      <w:r>
+        <w:t xml:space="preserve"> </w:t>
+      </w:r>
+      <w:r>
+        <w:t xml:space="preserve">travel, face orientation, coordinate transform, event interpolation, club</w:t>
+      </w:r>
+      <w:r>
+        <w:t xml:space="preserve"> </w:t>
+      </w:r>
+      <w:r>
+        <w:t xml:space="preserve">geometry, or the choice of reference versus contact datum. Floating-point</w:t>
+      </w:r>
+      <w:r>
+        <w:t xml:space="preserve"> </w:t>
+      </w:r>
+      <w:r>
+        <w:t xml:space="preserve">clipping addresses numerical roundoff only; it is not a measurement uncertainty</w:t>
+      </w:r>
+      <w:r>
+        <w:t xml:space="preserve"> </w:t>
+      </w:r>
+      <w:r>
+        <w:t xml:space="preserve">model. Angles therefore remain model-conditioned rather than observed truth.</w:t>
+      </w:r>
+    </w:p>
+    <w:bookmarkEnd w:id="75"/>
+    <w:bookmarkStart w:id="76" w:name="sensitivity"/>
+    <w:p>
+      <w:pPr>
+        <w:pStyle w:val="Heading3"/>
+      </w:pPr>
+      <w:r>
+        <w:t xml:space="preserve">Sensitivity</w:t>
+      </w:r>
+    </w:p>
+    <w:p>
+      <w:pPr>
+        <w:pStyle w:val="FirstParagraph"/>
+      </w:pPr>
+      <w:r>
+        <w:t xml:space="preserve">Small perturbations are smooth away from singular states. Sensitivity rises</w:t>
+      </w:r>
+      <w:r>
+        <w:t xml:space="preserve"> </w:t>
+      </w:r>
+      <w:r>
+        <w:t xml:space="preserve">when horizontal projection approaches zero because heading becomes undefined,</w:t>
+      </w:r>
+      <w:r>
+        <w:t xml:space="preserve"> </w:t>
+      </w:r>
+      <w:r>
+        <w:t xml:space="preserve">and when travel and face approach parallel or antiparallel because a small cross</w:t>
+      </w:r>
+      <w:r>
+        <w:t xml:space="preserve"> </w:t>
+      </w:r>
+      <w:r>
+        <w:t xml:space="preserve">product cannot define a stable normal. The API exposes these limits as null or</w:t>
+      </w:r>
+      <w:r>
+        <w:t xml:space="preserve"> </w:t>
+      </w:r>
+      <w:r>
+        <w:t xml:space="preserve">typed status; downstream code must not carry forward a prior frame’s plane.</w:t>
+      </w:r>
+    </w:p>
+    <w:bookmarkEnd w:id="76"/>
+    <w:bookmarkEnd w:id="77"/>
+    <w:bookmarkStart w:id="80" w:name="verification-and-validation"/>
+    <w:p>
+      <w:pPr>
+        <w:pStyle w:val="Heading2"/>
+      </w:pPr>
+      <w:r>
+        <w:t xml:space="preserve">Verification and Validation</w:t>
+      </w:r>
+    </w:p>
+    <w:bookmarkStart w:id="78" w:name="test-evidence"/>
+    <w:p>
+      <w:pPr>
+        <w:pStyle w:val="Heading3"/>
+      </w:pPr>
+      <w:r>
+        <w:t xml:space="preserve">Test Evidence</w:t>
+      </w:r>
+    </w:p>
+    <w:p>
+      <w:pPr>
+        <w:pStyle w:val="FirstParagraph"/>
+      </w:pPr>
+      <w:r>
+        <w:rPr>
+          <w:rStyle w:val="VerbatimChar"/>
+        </w:rPr>
+        <w:t xml:space="preserve">test_matches_cross_client_golden_contract</w:t>
+      </w:r>
+      <w:r>
+        <w:t xml:space="preserve"> </w:t>
+      </w:r>
+      <w:r>
+        <w:t xml:space="preserve">executes three analytical cases</w:t>
+      </w:r>
+      <w:r>
+        <w:t xml:space="preserve"> </w:t>
+      </w:r>
+      <w:r>
+        <w:t xml:space="preserve">from</w:t>
+      </w:r>
+      <w:r>
+        <w:t xml:space="preserve"> </w:t>
+      </w:r>
+      <w:r>
+        <w:rPr>
+          <w:rStyle w:val="VerbatimChar"/>
+        </w:rPr>
+        <w:t xml:space="preserve">dplane_golden_v1.json</w:t>
+      </w:r>
+      <w:r>
+        <w:t xml:space="preserve"> </w:t>
+      </w:r>
+      <w:r>
+        <w:t xml:space="preserve">at absolute tolerance</w:t>
+      </w:r>
+      <w:r>
+        <w:t xml:space="preserve"> </w:t>
+      </w:r>
+      <m:oMath>
+        <m:sSup>
+          <m:e>
+            <m:r>
+              <m:t>10</m:t>
+            </m:r>
+          </m:e>
+          <m:sup>
+            <m:r>
+              <m:rPr>
+                <m:sty m:val="p"/>
+              </m:rPr>
+              <m:t>−</m:t>
+            </m:r>
+            <m:r>
+              <m:t>9</m:t>
+            </m:r>
+          </m:sup>
+        </m:sSup>
+      </m:oMath>
+      <w:r>
+        <w:t xml:space="preserve"> </w:t>
+      </w:r>
+      <w:r>
+        <w:t xml:space="preserve">degree.</w:t>
+      </w:r>
+      <w:r>
+        <w:t xml:space="preserve"> </w:t>
+      </w:r>
+      <w:r>
+        <w:t xml:space="preserve">Singular-state tests cover zero travel, parallel, antiparallel, vertical</w:t>
+      </w:r>
+      <w:r>
+        <w:t xml:space="preserve"> </w:t>
+      </w:r>
+      <w:r>
+        <w:t xml:space="preserve">projection, and invalid frames. Rotation and reflection tests pin invariants.</w:t>
+      </w:r>
+      <w:r>
+        <w:t xml:space="preserve"> </w:t>
+      </w:r>
+      <w:r>
+        <w:t xml:space="preserve">The Rate-of-Closure integration test derives face-center velocity independently</w:t>
+      </w:r>
+      <w:r>
+        <w:t xml:space="preserve"> </w:t>
+      </w:r>
+      <w:r>
+        <w:t xml:space="preserve">as</w:t>
+      </w:r>
+      <w:r>
+        <w:t xml:space="preserve"> </w:t>
+      </w:r>
+      <m:oMath>
+        <m:sSub>
+          <m:e>
+            <m:r>
+              <m:rPr>
+                <m:sty m:val="b"/>
+              </m:rPr>
+              <m:t>v</m:t>
+            </m:r>
+          </m:e>
+          <m:sub>
+            <m:r>
+              <m:t>O</m:t>
+            </m:r>
+          </m:sub>
+        </m:sSub>
+        <m:r>
+          <m:rPr>
+            <m:sty m:val="p"/>
+          </m:rPr>
+          <m:t>+</m:t>
+        </m:r>
+        <m:r>
+          <m:rPr>
+            <m:sty m:val="b"/>
+          </m:rPr>
+          <m:t>ω</m:t>
+        </m:r>
+        <m:r>
+          <m:rPr>
+            <m:sty m:val="p"/>
+          </m:rPr>
+          <m:t>×</m:t>
+        </m:r>
+        <m:r>
+          <m:rPr>
+            <m:sty m:val="b"/>
+          </m:rPr>
+          <m:t>r</m:t>
+        </m:r>
+      </m:oMath>
+      <w:r>
+        <w:t xml:space="preserve">, then proves the consumer</w:t>
+      </w:r>
+      <w:r>
+        <w:t xml:space="preserve"> </w:t>
+      </w:r>
+      <w:r>
+        <w:t xml:space="preserve">normalizes that value for its face-center D-plane.</w:t>
+      </w:r>
+    </w:p>
+    <w:bookmarkEnd w:id="78"/>
+    <w:bookmarkStart w:id="79" w:name="acceptance-criteria"/>
+    <w:p>
+      <w:pPr>
+        <w:pStyle w:val="Heading3"/>
+      </w:pPr>
+      <w:r>
+        <w:t xml:space="preserve">Acceptance Criteria</w:t>
+      </w:r>
+    </w:p>
+    <w:p>
+      <w:pPr>
+        <w:pStyle w:val="FirstParagraph"/>
+      </w:pPr>
+      <w:r>
+        <w:t xml:space="preserve">The exemplar passes only when strict JSON Schema and typed loader agree;</w:t>
+      </w:r>
+      <w:r>
+        <w:t xml:space="preserve"> </w:t>
+      </w:r>
+      <w:r>
+        <w:t xml:space="preserve">calculation, chapter, module, source, consumer, test, and golden-fixture links</w:t>
+      </w:r>
+      <w:r>
+        <w:t xml:space="preserve"> </w:t>
+      </w:r>
+      <w:r>
+        <w:t xml:space="preserve">all resolve; the fourteen-section linter and focused tests pass; and HTML,</w:t>
+      </w:r>
+      <w:r>
+        <w:t xml:space="preserve"> </w:t>
+      </w:r>
+      <w:r>
+        <w:t xml:space="preserve">LaTeX, PDF, and DOCX share the governed semantic digest. This evidence verifies</w:t>
+      </w:r>
+      <w:r>
+        <w:t xml:space="preserve"> </w:t>
+      </w:r>
+      <w:r>
+        <w:t xml:space="preserve">reproduction, not scientific or publication approval.</w:t>
+      </w:r>
+    </w:p>
+    <w:bookmarkEnd w:id="79"/>
+    <w:bookmarkEnd w:id="80"/>
+    <w:bookmarkStart w:id="83" w:name="limits-and-applicability"/>
+    <w:p>
+      <w:pPr>
+        <w:pStyle w:val="Heading2"/>
+      </w:pPr>
+      <w:r>
+        <w:t xml:space="preserve">Limits and Applicability</w:t>
+      </w:r>
+    </w:p>
+    <w:bookmarkStart w:id="81" w:name="validity-range"/>
+    <w:p>
+      <w:pPr>
+        <w:pStyle w:val="Heading3"/>
+      </w:pPr>
+      <w:r>
+        <w:t xml:space="preserve">Validity Range</w:t>
+      </w:r>
+    </w:p>
+    <w:p>
+      <w:pPr>
+        <w:pStyle w:val="FirstParagraph"/>
+      </w:pPr>
+      <w:r>
+        <w:t xml:space="preserve">Finite vectors may have any representable scale, but face and frame axes must</w:t>
+      </w:r>
+      <w:r>
+        <w:t xml:space="preserve"> </w:t>
+      </w:r>
+      <w:r>
+        <w:t xml:space="preserve">exceed norm</w:t>
+      </w:r>
+      <w:r>
+        <w:t xml:space="preserve"> </w:t>
+      </w:r>
+      <m:oMath>
+        <m:sSup>
+          <m:e>
+            <m:r>
+              <m:t>10</m:t>
+            </m:r>
+          </m:e>
+          <m:sup>
+            <m:r>
+              <m:rPr>
+                <m:sty m:val="p"/>
+              </m:rPr>
+              <m:t>−</m:t>
+            </m:r>
+            <m:r>
+              <m:t>12</m:t>
+            </m:r>
+          </m:sup>
+        </m:sSup>
+      </m:oMath>
+      <w:r>
+        <w:t xml:space="preserve">, and target/up orthogonality must satisfy</w:t>
+      </w:r>
+      <w:r>
+        <w:t xml:space="preserve"> </w:t>
+      </w:r>
+      <m:oMath>
+        <m:sSup>
+          <m:e>
+            <m:r>
+              <m:t>10</m:t>
+            </m:r>
+          </m:e>
+          <m:sup>
+            <m:r>
+              <m:rPr>
+                <m:sty m:val="p"/>
+              </m:rPr>
+              <m:t>−</m:t>
+            </m:r>
+            <m:r>
+              <m:t>10</m:t>
+            </m:r>
+          </m:sup>
+        </m:sSup>
+      </m:oMath>
+      <w:r>
+        <w:t xml:space="preserve">.</w:t>
+      </w:r>
+      <w:r>
+        <w:t xml:space="preserve"> </w:t>
+      </w:r>
+      <w:r>
+        <w:t xml:space="preserve">Spin loft spans</w:t>
+      </w:r>
+      <w:r>
+        <w:t xml:space="preserve"> </w:t>
+      </w:r>
+      <m:oMath>
+        <m:r>
+          <m:t>0</m:t>
+        </m:r>
+      </m:oMath>
+      <w:r>
+        <w:t xml:space="preserve"> </w:t>
+      </w:r>
+      <w:r>
+        <w:t xml:space="preserve">through</w:t>
+      </w:r>
+      <w:r>
+        <w:t xml:space="preserve"> </w:t>
+      </w:r>
+      <m:oMath>
+        <m:r>
+          <m:t>180</m:t>
+        </m:r>
+      </m:oMath>
+      <w:r>
+        <w:t xml:space="preserve"> </w:t>
+      </w:r>
+      <w:r>
+        <w:t xml:space="preserve">degrees. Signed relationships wrap to</w:t>
+      </w:r>
+      <w:r>
+        <w:t xml:space="preserve"> </w:t>
+      </w:r>
+      <m:oMath>
+        <m:r>
+          <m:rPr>
+            <m:sty m:val="p"/>
+          </m:rPr>
+          <m:t>[</m:t>
+        </m:r>
+        <m:r>
+          <m:rPr>
+            <m:sty m:val="p"/>
+          </m:rPr>
+          <m:t>−</m:t>
+        </m:r>
+        <m:r>
+          <m:t>180</m:t>
+        </m:r>
+        <m:r>
+          <m:rPr>
+            <m:sty m:val="p"/>
+          </m:rPr>
+          <m:t>,</m:t>
+        </m:r>
+        <m:r>
+          <m:t>180</m:t>
+        </m:r>
+        <m:r>
+          <m:rPr>
+            <m:sty m:val="p"/>
+          </m:rPr>
+          <m:t>)</m:t>
+        </m:r>
+      </m:oMath>
+      <w:r>
+        <w:t xml:space="preserve">. The golden fixture qualifies only its declared cases and</w:t>
+      </w:r>
+      <w:r>
+        <w:t xml:space="preserve"> </w:t>
+      </w:r>
+      <m:oMath>
+        <m:sSup>
+          <m:e>
+            <m:r>
+              <m:t>10</m:t>
+            </m:r>
+          </m:e>
+          <m:sup>
+            <m:r>
+              <m:rPr>
+                <m:sty m:val="p"/>
+              </m:rPr>
+              <m:t>−</m:t>
+            </m:r>
+            <m:r>
+              <m:t>9</m:t>
+            </m:r>
+          </m:sup>
+        </m:sSup>
+      </m:oMath>
+      <w:r>
+        <w:t xml:space="preserve">-degree tolerance.</w:t>
+      </w:r>
+    </w:p>
+    <w:bookmarkEnd w:id="81"/>
+    <w:bookmarkStart w:id="82" w:name="known-limitations"/>
+    <w:p>
+      <w:pPr>
+        <w:pStyle w:val="Heading3"/>
+      </w:pPr>
+      <w:r>
+        <w:t xml:space="preserve">Known Limitations</w:t>
+      </w:r>
+    </w:p>
+    <w:p>
+      <w:pPr>
+        <w:pStyle w:val="FirstParagraph"/>
+      </w:pPr>
+      <w:r>
+        <w:t xml:space="preserve">The method does not compute ball response, impulse, spin rate, lift, drag,</w:t>
+      </w:r>
+      <w:r>
+        <w:t xml:space="preserve"> </w:t>
+      </w:r>
+      <w:r>
+        <w:t xml:space="preserve">landing, biomechanics, or camera-derived pose. It does not establish that an</w:t>
+      </w:r>
+      <w:r>
+        <w:t xml:space="preserve"> </w:t>
+      </w:r>
+      <w:r>
+        <w:t xml:space="preserve">external device’s axes, timestamps, or face normal match this contract. Rate of</w:t>
+      </w:r>
+      <w:r>
+        <w:t xml:space="preserve"> </w:t>
+      </w:r>
+      <w:r>
+        <w:t xml:space="preserve">Closure downstream flight currently consumes reference-point translation;</w:t>
+      </w:r>
+      <w:r>
+        <w:t xml:space="preserve"> </w:t>
+      </w:r>
+      <w:r>
+        <w:t xml:space="preserve">shaft-induced contact velocity remains analysis. The markerless-mocap exemplar</w:t>
+      </w:r>
+      <w:r>
+        <w:t xml:space="preserve"> </w:t>
+      </w:r>
+      <w:r>
+        <w:t xml:space="preserve">is deliberately absent because TOOLS-M0 issue #4708 and PR #4734 are open and</w:t>
+      </w:r>
+      <w:r>
+        <w:t xml:space="preserve"> </w:t>
+      </w:r>
+      <w:r>
+        <w:t xml:space="preserve">no markerless module exists on this D3 base. Unmerged content is not promoted.</w:t>
+      </w:r>
+    </w:p>
+    <w:bookmarkEnd w:id="82"/>
+    <w:bookmarkEnd w:id="83"/>
+    <w:bookmarkStart w:id="86" w:name="worked-examples"/>
+    <w:p>
+      <w:pPr>
+        <w:pStyle w:val="Heading2"/>
+      </w:pPr>
+      <w:r>
+        <w:t xml:space="preserve">Worked Examples</w:t>
+      </w:r>
+    </w:p>
+    <w:bookmarkStart w:id="84" w:name="example-inputs"/>
+    <w:p>
+      <w:pPr>
+        <w:pStyle w:val="Heading3"/>
+      </w:pPr>
+      <w:r>
+        <w:t xml:space="preserve">Example Inputs</w:t>
+      </w:r>
+    </w:p>
+    <w:p>
+      <w:pPr>
+        <w:pStyle w:val="FirstParagraph"/>
+      </w:pPr>
+      <w:r>
+        <w:t xml:space="preserve">The governed</w:t>
+      </w:r>
+      <w:r>
+        <w:t xml:space="preserve"> </w:t>
+      </w:r>
+      <w:r>
+        <w:rPr>
+          <w:rStyle w:val="VerbatimChar"/>
+        </w:rPr>
+        <w:t xml:space="preserve">square-descending</w:t>
+      </w:r>
+      <w:r>
+        <w:t xml:space="preserve"> </w:t>
+      </w:r>
+      <w:r>
+        <w:t xml:space="preserve">fixture supplies</w:t>
+      </w:r>
+      <w:r>
+        <w:t xml:space="preserve"> </w:t>
+      </w:r>
+      <m:oMath>
+        <m:r>
+          <m:rPr>
+            <m:sty m:val="b"/>
+          </m:rPr>
+          <m:t>v</m:t>
+        </m:r>
+        <m:r>
+          <m:rPr>
+            <m:sty m:val="p"/>
+          </m:rPr>
+          <m:t>=</m:t>
+        </m:r>
+        <m:r>
+          <m:rPr>
+            <m:sty m:val="p"/>
+          </m:rPr>
+          <m:t>(</m:t>
+        </m:r>
+        <m:r>
+          <m:t>0.9986295347545738</m:t>
+        </m:r>
+        <m:r>
+          <m:rPr>
+            <m:sty m:val="p"/>
+          </m:rPr>
+          <m:t>,</m:t>
+        </m:r>
+        <m:r>
+          <m:rPr>
+            <m:sty m:val="p"/>
+          </m:rPr>
+          <m:t>−</m:t>
+        </m:r>
+        <m:r>
+          <m:t>0.052335956242943835</m:t>
+        </m:r>
+        <m:r>
+          <m:rPr>
+            <m:sty m:val="p"/>
+          </m:rPr>
+          <m:t>,</m:t>
+        </m:r>
+        <m:r>
+          <m:t>0</m:t>
+        </m:r>
+        <m:r>
+          <m:rPr>
+            <m:sty m:val="p"/>
+          </m:rPr>
+          <m:t>)</m:t>
+        </m:r>
+      </m:oMath>
+      <w:r>
+        <w:t xml:space="preserve">, with path</w:t>
+      </w:r>
+      <w:r>
+        <w:t xml:space="preserve"> </w:t>
+      </w:r>
+      <m:oMath>
+        <m:sSup>
+          <m:e>
+            <m:r>
+              <m:t>0</m:t>
+            </m:r>
+          </m:e>
+          <m:sup>
+            <m:r>
+              <m:rPr>
+                <m:sty m:val="p"/>
+              </m:rPr>
+              <m:t>∘</m:t>
+            </m:r>
+          </m:sup>
+        </m:sSup>
+      </m:oMath>
+      <w:r>
+        <w:t xml:space="preserve"> </w:t>
+      </w:r>
+      <w:r>
+        <w:t xml:space="preserve">and attack</w:t>
+      </w:r>
+      <w:r>
+        <w:t xml:space="preserve"> </w:t>
+      </w:r>
+      <m:oMath>
+        <m:r>
+          <m:rPr>
+            <m:sty m:val="p"/>
+          </m:rPr>
+          <m:t>−</m:t>
+        </m:r>
+        <m:sSup>
+          <m:e>
+            <m:r>
+              <m:t>3</m:t>
+            </m:r>
+          </m:e>
+          <m:sup>
+            <m:r>
+              <m:rPr>
+                <m:sty m:val="p"/>
+              </m:rPr>
+              <m:t>∘</m:t>
+            </m:r>
+          </m:sup>
+        </m:sSup>
+      </m:oMath>
+      <w:r>
+        <w:t xml:space="preserve">. Its face normal is</w:t>
+      </w:r>
+      <w:r>
+        <w:t xml:space="preserve"> </w:t>
+      </w:r>
+      <m:oMath>
+        <m:r>
+          <m:rPr>
+            <m:sty m:val="b"/>
+          </m:rPr>
+          <m:t>n</m:t>
+        </m:r>
+        <m:r>
+          <m:rPr>
+            <m:sty m:val="p"/>
+          </m:rPr>
+          <m:t>=</m:t>
+        </m:r>
+        <m:r>
+          <m:rPr>
+            <m:sty m:val="p"/>
+          </m:rPr>
+          <m:t>(</m:t>
+        </m:r>
+        <m:r>
+          <m:t>0.9781476007338057</m:t>
+        </m:r>
+        <m:r>
+          <m:rPr>
+            <m:sty m:val="p"/>
+          </m:rPr>
+          <m:t>,</m:t>
+        </m:r>
+        <m:r>
+          <m:t>0.20791169081775934</m:t>
+        </m:r>
+        <m:r>
+          <m:rPr>
+            <m:sty m:val="p"/>
+          </m:rPr>
+          <m:t>,</m:t>
+        </m:r>
+        <m:r>
+          <m:t>0</m:t>
+        </m:r>
+        <m:r>
+          <m:rPr>
+            <m:sty m:val="p"/>
+          </m:rPr>
+          <m:t>)</m:t>
+        </m:r>
+      </m:oMath>
+      <w:r>
+        <w:t xml:space="preserve">, with face</w:t>
+      </w:r>
+      <w:r>
+        <w:t xml:space="preserve"> </w:t>
+      </w:r>
+      <m:oMath>
+        <m:sSup>
+          <m:e>
+            <m:r>
+              <m:t>0</m:t>
+            </m:r>
+          </m:e>
+          <m:sup>
+            <m:r>
+              <m:rPr>
+                <m:sty m:val="p"/>
+              </m:rPr>
+              <m:t>∘</m:t>
+            </m:r>
+          </m:sup>
+        </m:sSup>
+      </m:oMath>
+      <w:r>
+        <w:t xml:space="preserve"> </w:t>
+      </w:r>
+      <w:r>
+        <w:t xml:space="preserve">and dynamic loft</w:t>
+      </w:r>
+      <w:r>
+        <w:t xml:space="preserve"> </w:t>
+      </w:r>
+      <m:oMath>
+        <m:sSup>
+          <m:e>
+            <m:r>
+              <m:t>12</m:t>
+            </m:r>
+          </m:e>
+          <m:sup>
+            <m:r>
+              <m:rPr>
+                <m:sty m:val="p"/>
+              </m:rPr>
+              <m:t>∘</m:t>
+            </m:r>
+          </m:sup>
+        </m:sSup>
+      </m:oMath>
+      <w:r>
+        <w:t xml:space="preserve">. Target and up use default unit axes.</w:t>
+      </w:r>
+      <w:r>
+        <w:t xml:space="preserve"> </w:t>
+      </w:r>
+      <w:r>
+        <w:t xml:space="preserve">The fixture tolerance is</w:t>
+      </w:r>
+      <w:r>
+        <w:t xml:space="preserve"> </w:t>
+      </w:r>
+      <m:oMath>
+        <m:sSup>
+          <m:e>
+            <m:r>
+              <m:t>10</m:t>
+            </m:r>
+          </m:e>
+          <m:sup>
+            <m:r>
+              <m:rPr>
+                <m:sty m:val="p"/>
+              </m:rPr>
+              <m:t>−</m:t>
+            </m:r>
+            <m:r>
+              <m:t>9</m:t>
+            </m:r>
+          </m:sup>
+        </m:sSup>
+      </m:oMath>
+      <w:r>
+        <w:t xml:space="preserve"> </w:t>
+      </w:r>
+      <w:r>
+        <w:t xml:space="preserve">degree.</w:t>
+      </w:r>
+    </w:p>
+    <w:bookmarkEnd w:id="84"/>
+    <w:bookmarkStart w:id="85" w:name="example-results"/>
+    <w:p>
+      <w:pPr>
+        <w:pStyle w:val="Heading3"/>
+      </w:pPr>
+      <w:r>
+        <w:t xml:space="preserve">Example Results</w:t>
+      </w:r>
+    </w:p>
+    <w:p>
+      <w:pPr>
+        <w:pStyle w:val="FirstParagraph"/>
+      </w:pPr>
+      <w:r>
+        <w:t xml:space="preserve">The dot product is</w:t>
+      </w:r>
+      <w:r>
+        <w:t xml:space="preserve"> </w:t>
+      </w:r>
+      <m:oMath>
+        <m:r>
+          <m:rPr>
+            <m:sty m:val="p"/>
+          </m:rPr>
+          <m:t>cos</m:t>
+        </m:r>
+        <m:sSup>
+          <m:e>
+            <m:r>
+              <m:t>15</m:t>
+            </m:r>
+          </m:e>
+          <m:sup>
+            <m:r>
+              <m:rPr>
+                <m:sty m:val="p"/>
+              </m:rPr>
+              <m:t>∘</m:t>
+            </m:r>
+          </m:sup>
+        </m:sSup>
+      </m:oMath>
+      <w:r>
+        <w:t xml:space="preserve">, so spin loft is</w:t>
+      </w:r>
+      <w:r>
+        <w:t xml:space="preserve"> </w:t>
+      </w:r>
+      <m:oMath>
+        <m:sSup>
+          <m:e>
+            <m:r>
+              <m:t>15</m:t>
+            </m:r>
+          </m:e>
+          <m:sup>
+            <m:r>
+              <m:rPr>
+                <m:sty m:val="p"/>
+              </m:rPr>
+              <m:t>∘</m:t>
+            </m:r>
+          </m:sup>
+        </m:sSup>
+      </m:oMath>
+      <w:r>
+        <w:t xml:space="preserve">. Dynamic loft</w:t>
+      </w:r>
+      <w:r>
+        <w:t xml:space="preserve"> </w:t>
+      </w:r>
+      <w:r>
+        <w:t xml:space="preserve">minus attack is</w:t>
+      </w:r>
+      <w:r>
+        <w:t xml:space="preserve"> </w:t>
+      </w:r>
+      <m:oMath>
+        <m:r>
+          <m:t>12</m:t>
+        </m:r>
+        <m:r>
+          <m:rPr>
+            <m:sty m:val="p"/>
+          </m:rPr>
+          <m:t>−</m:t>
+        </m:r>
+        <m:r>
+          <m:rPr>
+            <m:sty m:val="p"/>
+          </m:rPr>
+          <m:t>(</m:t>
+        </m:r>
+        <m:r>
+          <m:rPr>
+            <m:sty m:val="p"/>
+          </m:rPr>
+          <m:t>−</m:t>
+        </m:r>
+        <m:r>
+          <m:t>3</m:t>
+        </m:r>
+        <m:r>
+          <m:rPr>
+            <m:sty m:val="p"/>
+          </m:rPr>
+          <m:t>)</m:t>
+        </m:r>
+        <m:r>
+          <m:rPr>
+            <m:sty m:val="p"/>
+          </m:rPr>
+          <m:t>=</m:t>
+        </m:r>
+        <m:sSup>
+          <m:e>
+            <m:r>
+              <m:t>15</m:t>
+            </m:r>
+          </m:e>
+          <m:sup>
+            <m:r>
+              <m:rPr>
+                <m:sty m:val="p"/>
+              </m:rPr>
+              <m:t>∘</m:t>
+            </m:r>
+          </m:sup>
+        </m:sSup>
+      </m:oMath>
+      <w:r>
+        <w:t xml:space="preserve">, making planar residual zero.</w:t>
+      </w:r>
+      <w:r>
+        <w:t xml:space="preserve"> </w:t>
+      </w:r>
+      <w:r>
+        <w:t xml:space="preserve">Travel-times-face points along right, giving</w:t>
+      </w:r>
+      <w:r>
+        <w:t xml:space="preserve"> </w:t>
+      </w:r>
+      <m:oMath>
+        <m:acc>
+          <m:accPr>
+            <m:chr m:val="̂"/>
+          </m:accPr>
+          <m:e>
+            <m:r>
+              <m:rPr>
+                <m:sty m:val="b"/>
+              </m:rPr>
+              <m:t>d</m:t>
+            </m:r>
+          </m:e>
+        </m:acc>
+        <m:r>
+          <m:rPr>
+            <m:sty m:val="p"/>
+          </m:rPr>
+          <m:t>=</m:t>
+        </m:r>
+        <m:r>
+          <m:rPr>
+            <m:sty m:val="p"/>
+          </m:rPr>
+          <m:t>(</m:t>
+        </m:r>
+        <m:r>
+          <m:t>0</m:t>
+        </m:r>
+        <m:r>
+          <m:rPr>
+            <m:sty m:val="p"/>
+          </m:rPr>
+          <m:t>,</m:t>
+        </m:r>
+        <m:r>
+          <m:t>0</m:t>
+        </m:r>
+        <m:r>
+          <m:rPr>
+            <m:sty m:val="p"/>
+          </m:rPr>
+          <m:t>,</m:t>
+        </m:r>
+        <m:r>
+          <m:t>1</m:t>
+        </m:r>
+        <m:r>
+          <m:rPr>
+            <m:sty m:val="p"/>
+          </m:rPr>
+          <m:t>)</m:t>
+        </m:r>
+      </m:oMath>
+      <w:r>
+        <w:t xml:space="preserve">, tilt</w:t>
+      </w:r>
+      <w:r>
+        <w:t xml:space="preserve"> </w:t>
+      </w:r>
+      <m:oMath>
+        <m:sSup>
+          <m:e>
+            <m:r>
+              <m:t>0</m:t>
+            </m:r>
+          </m:e>
+          <m:sup>
+            <m:r>
+              <m:rPr>
+                <m:sty m:val="p"/>
+              </m:rPr>
+              <m:t>∘</m:t>
+            </m:r>
+          </m:sup>
+        </m:sSup>
+      </m:oMath>
+      <w:r>
+        <w:t xml:space="preserve">, inclination</w:t>
+      </w:r>
+      <w:r>
+        <w:t xml:space="preserve"> </w:t>
+      </w:r>
+      <m:oMath>
+        <m:sSup>
+          <m:e>
+            <m:r>
+              <m:t>90</m:t>
+            </m:r>
+          </m:e>
+          <m:sup>
+            <m:r>
+              <m:rPr>
+                <m:sty m:val="p"/>
+              </m:rPr>
+              <m:t>∘</m:t>
+            </m:r>
+          </m:sup>
+        </m:sSup>
+      </m:oMath>
+      <w:r>
+        <w:t xml:space="preserve">, and ground</w:t>
+      </w:r>
+      <w:r>
+        <w:t xml:space="preserve"> </w:t>
+      </w:r>
+      <w:r>
+        <w:t xml:space="preserve">intersection at</w:t>
+      </w:r>
+      <w:r>
+        <w:t xml:space="preserve"> </w:t>
+      </w:r>
+      <m:oMath>
+        <m:sSup>
+          <m:e>
+            <m:r>
+              <m:t>0</m:t>
+            </m:r>
+          </m:e>
+          <m:sup>
+            <m:r>
+              <m:rPr>
+                <m:sty m:val="p"/>
+              </m:rPr>
+              <m:t>∘</m:t>
+            </m:r>
+          </m:sup>
+        </m:sSup>
+      </m:oMath>
+      <w:r>
+        <w:t xml:space="preserve">. Status is</w:t>
+      </w:r>
+      <w:r>
+        <w:t xml:space="preserve"> </w:t>
+      </w:r>
+      <w:r>
+        <w:rPr>
+          <w:rStyle w:val="VerbatimChar"/>
+        </w:rPr>
+        <w:t xml:space="preserve">defined</w:t>
+      </w:r>
+      <w:r>
+        <w:t xml:space="preserve">. Values come from the</w:t>
+      </w:r>
+      <w:r>
+        <w:t xml:space="preserve"> </w:t>
+      </w:r>
+      <w:r>
+        <w:t xml:space="preserve">cross-client golden fixture and executable Python test, not renderer-only text.</w:t>
+      </w:r>
+    </w:p>
+    <w:bookmarkEnd w:id="85"/>
+    <w:bookmarkEnd w:id="86"/>
+    <w:bookmarkStart w:id="89" w:name="references-and-provenance"/>
+    <w:p>
+      <w:pPr>
+        <w:pStyle w:val="Heading2"/>
+      </w:pPr>
+      <w:r>
+        <w:t xml:space="preserve">References and Provenance</w:t>
+      </w:r>
+    </w:p>
+    <w:bookmarkStart w:id="87" w:name="references-1"/>
+    <w:p>
+      <w:pPr>
+        <w:pStyle w:val="Heading3"/>
+      </w:pPr>
+      <w:r>
+        <w:t xml:space="preserve">References</w:t>
+      </w:r>
+    </w:p>
+    <w:p>
+      <w:pPr>
+        <w:pStyle w:val="FirstParagraph"/>
+      </w:pPr>
+      <w:r>
+        <w:t xml:space="preserve">Primary implementation authority is exact source at</w:t>
+      </w:r>
+      <w:r>
+        <w:t xml:space="preserve"> </w:t>
+      </w:r>
+      <w:r>
+        <w:rPr>
+          <w:rStyle w:val="VerbatimChar"/>
+        </w:rPr>
+        <w:t xml:space="preserve">916fb9f27f486486f0c071dcc6f15f81f68ecb18</w:t>
+      </w:r>
+      <w:r>
+        <w:t xml:space="preserve">. Numerical expectations come</w:t>
+      </w:r>
+      <w:r>
+        <w:t xml:space="preserve"> </w:t>
+      </w:r>
+      <w:r>
+        <w:t xml:space="preserve">from</w:t>
+      </w:r>
+      <w:r>
+        <w:t xml:space="preserve"> </w:t>
+      </w:r>
+      <w:r>
+        <w:rPr>
+          <w:rStyle w:val="VerbatimChar"/>
+        </w:rPr>
+        <w:t xml:space="preserve">dplane-golden-v1</w:t>
+      </w:r>
+      <w:r>
+        <w:t xml:space="preserve">, with independent behavior exercised by the tests in</w:t>
+      </w:r>
+      <w:r>
+        <w:t xml:space="preserve"> </w:t>
+      </w:r>
+      <w:r>
+        <w:t xml:space="preserve">the registry. External scientific literature has not completed review, so this</w:t>
+      </w:r>
+      <w:r>
+        <w:t xml:space="preserve"> </w:t>
+      </w:r>
+      <w:r>
+        <w:t xml:space="preserve">chapter makes no literature-backed ball-flight or equipment-performance claim.</w:t>
+      </w:r>
+    </w:p>
+    <w:bookmarkEnd w:id="87"/>
+    <w:bookmarkStart w:id="88" w:name="provenance"/>
+    <w:p>
+      <w:pPr>
+        <w:pStyle w:val="Heading3"/>
+      </w:pPr>
+      <w:r>
+        <w:t xml:space="preserve">Provenance</w:t>
+      </w:r>
+    </w:p>
+    <w:p>
+      <w:pPr>
+        <w:pStyle w:val="FirstParagraph"/>
+      </w:pPr>
+      <w:r>
+        <w:t xml:space="preserve">The calculation registry records method version</w:t>
+      </w:r>
+      <w:r>
+        <w:t xml:space="preserve"> </w:t>
+      </w:r>
+      <w:r>
+        <w:rPr>
+          <w:rStyle w:val="VerbatimChar"/>
+        </w:rPr>
+        <w:t xml:space="preserve">1.0.0</w:t>
+      </w:r>
+      <w:r>
+        <w:t xml:space="preserve">, symbols and commit,</w:t>
+      </w:r>
+      <w:r>
+        <w:t xml:space="preserve"> </w:t>
+      </w:r>
+      <w:r>
+        <w:t xml:space="preserve">source digest, inputs, units, contracts, equation anchors, tests, artifacts,</w:t>
+      </w:r>
+      <w:r>
+        <w:t xml:space="preserve"> </w:t>
+      </w:r>
+      <w:r>
+        <w:t xml:space="preserve">limitations, and approval blockers. D4 coverage separately records markerless</w:t>
+      </w:r>
+      <w:r>
+        <w:t xml:space="preserve"> </w:t>
+      </w:r>
+      <w:r>
+        <w:t xml:space="preserve">as blocked. Generated HTML, LaTeX, PDF, and DOCX derive from canonical QMD via</w:t>
+      </w:r>
+      <w:r>
+        <w:t xml:space="preserve"> </w:t>
+      </w:r>
+      <w:r>
+        <w:t xml:space="preserve">the pinned D2 toolchain and remain</w:t>
+      </w:r>
+      <w:r>
+        <w:t xml:space="preserve"> </w:t>
+      </w:r>
+      <w:r>
+        <w:rPr>
+          <w:rStyle w:val="VerbatimChar"/>
+        </w:rPr>
+        <w:t xml:space="preserve">generated-unapproved</w:t>
+      </w:r>
+      <w:r>
+        <w:t xml:space="preserve">.</w:t>
+      </w:r>
+    </w:p>
+    <w:bookmarkEnd w:id="88"/>
+    <w:bookmarkEnd w:id="89"/>
+    <w:bookmarkStart w:id="96" w:name="revision-history"/>
+    <w:p>
+      <w:pPr>
+        <w:pStyle w:val="Heading2"/>
+      </w:pPr>
+      <w:r>
+        <w:t xml:space="preserve">Revision History</w:t>
+      </w:r>
+    </w:p>
+    <w:bookmarkStart w:id="95" w:name="revision-record"/>
+    <w:p>
+      <w:pPr>
+        <w:pStyle w:val="Heading3"/>
+      </w:pPr>
+      <w:r>
+        <w:t xml:space="preserve">Revision Record</w:t>
+      </w:r>
+    </w:p>
+    <w:p>
+      <w:pPr>
+        <w:pStyle w:val="FirstParagraph"/>
+      </w:pPr>
+      <w:r>
+        <w:t xml:space="preserve">Version 1.0.0, dated 2026-08-26, registers the first Tools textbook exemplar:</w:t>
+      </w:r>
+      <w:r>
+        <w:t xml:space="preserve"> </w:t>
+      </w:r>
+      <w:r>
+        <w:t xml:space="preserve">frame-explicit D-plane geometry shared by swing simulation and Rate of Closure,</w:t>
+      </w:r>
+      <w:r>
+        <w:t xml:space="preserve"> </w:t>
+      </w:r>
+      <w:r>
+        <w:t xml:space="preserve">with executable golden values and fail-closed markerless dependency status.</w:t>
+      </w:r>
+      <w:r>
+        <w:t xml:space="preserve"> </w:t>
+      </w:r>
+      <w:r>
+        <w:t xml:space="preserve">Later revisions must update the descriptor, method version when mathematics or</w:t>
+      </w:r>
+      <w:r>
+        <w:t xml:space="preserve"> </w:t>
+      </w:r>
+      <w:r>
+        <w:t xml:space="preserve">behavior changes, tests, provenance, limitations, and every generated artifact.</w:t>
+      </w:r>
+    </w:p>
+    <w:bookmarkStart w:id="94" w:name="refs"/>
+    <w:bookmarkStart w:id="91" w:name="ref-pandoc-manual"/>
     <w:p>
       <w:pPr>
         <w:pStyle w:val="Bibliography"/>
@@ -2217,7 +6574,7 @@
       <w:r>
         <w:t xml:space="preserve"> </w:t>
       </w:r>
-      <w:hyperlink r:id="rId45">
+      <w:hyperlink r:id="rId90">
         <w:r>
           <w:rPr>
             <w:rStyle w:val="Hyperlink"/>
@@ -2229,8 +6586,8 @@
         <w:t xml:space="preserve">.</w:t>
       </w:r>
     </w:p>
-    <w:bookmarkEnd w:id="46"/>
-    <w:bookmarkStart w:id="48" w:name="ref-quarto-guide"/>
+    <w:bookmarkEnd w:id="91"/>
+    <w:bookmarkStart w:id="93" w:name="ref-quarto-guide"/>
     <w:p>
       <w:pPr>
         <w:pStyle w:val="Bibliography"/>
@@ -2254,7 +6611,7 @@
       <w:r>
         <w:t xml:space="preserve"> </w:t>
       </w:r>
-      <w:hyperlink r:id="rId47">
+      <w:hyperlink r:id="rId92">
         <w:r>
           <w:rPr>
             <w:rStyle w:val="Hyperlink"/>
@@ -2266,10 +6623,11 @@
         <w:t xml:space="preserve">.</w:t>
       </w:r>
     </w:p>
-    <w:bookmarkEnd w:id="48"/>
-    <w:bookmarkEnd w:id="49"/>
-    <w:bookmarkEnd w:id="50"/>
-    <w:bookmarkEnd w:id="51"/>
+    <w:bookmarkEnd w:id="93"/>
+    <w:bookmarkEnd w:id="94"/>
+    <w:bookmarkEnd w:id="95"/>
+    <w:bookmarkEnd w:id="96"/>
+    <w:bookmarkEnd w:id="97"/>
     <w:sectPr>
       <w:headerReference r:id="rId9" w:type="default"/>
       <w:footerReference r:id="rId10" w:type="default"/>
@@ -2686,6 +7044,91 @@
       <w:rPr>
         <w:rFonts w:ascii="Wingdings" w:hAnsi="Wingdings" w:cs="Wingdings" w:hint="default"/>
       </w:rPr>
+    </w:lvl>
+  </w:abstractNum>
+  <w:abstractNum w:abstractNumId="99411">
+    <w:nsid w:val="00A99411"/>
+    <w:multiLevelType w:val="multilevel"/>
+    <w:lvl w:ilvl="0">
+      <w:start w:val="1"/>
+      <w:numFmt w:val="decimal"/>
+      <w:lvlText w:val="%1."/>
+      <w:lvlJc w:val="left"/>
+      <w:pPr>
+        <w:ind w:left="720" w:hanging="360"/>
+      </w:pPr>
+    </w:lvl>
+    <w:lvl w:ilvl="1">
+      <w:start w:val="1"/>
+      <w:numFmt w:val="decimal"/>
+      <w:lvlText w:val="%2."/>
+      <w:lvlJc w:val="left"/>
+      <w:pPr>
+        <w:ind w:left="1440" w:hanging="360"/>
+      </w:pPr>
+    </w:lvl>
+    <w:lvl w:ilvl="2">
+      <w:start w:val="1"/>
+      <w:numFmt w:val="decimal"/>
+      <w:lvlText w:val="%3."/>
+      <w:lvlJc w:val="left"/>
+      <w:pPr>
+        <w:ind w:left="2160" w:hanging="360"/>
+      </w:pPr>
+    </w:lvl>
+    <w:lvl w:ilvl="3">
+      <w:start w:val="1"/>
+      <w:numFmt w:val="decimal"/>
+      <w:lvlText w:val="%4."/>
+      <w:lvlJc w:val="left"/>
+      <w:pPr>
+        <w:ind w:left="2880" w:hanging="360"/>
+      </w:pPr>
+    </w:lvl>
+    <w:lvl w:ilvl="4">
+      <w:start w:val="1"/>
+      <w:numFmt w:val="decimal"/>
+      <w:lvlText w:val="%5."/>
+      <w:lvlJc w:val="left"/>
+      <w:pPr>
+        <w:ind w:left="3600" w:hanging="360"/>
+      </w:pPr>
+    </w:lvl>
+    <w:lvl w:ilvl="5">
+      <w:start w:val="1"/>
+      <w:numFmt w:val="decimal"/>
+      <w:lvlText w:val="%6."/>
+      <w:lvlJc w:val="left"/>
+      <w:pPr>
+        <w:ind w:left="4320" w:hanging="360"/>
+      </w:pPr>
+    </w:lvl>
+    <w:lvl w:ilvl="6">
+      <w:start w:val="1"/>
+      <w:numFmt w:val="decimal"/>
+      <w:lvlText w:val="%7."/>
+      <w:lvlJc w:val="left"/>
+      <w:pPr>
+        <w:ind w:left="5040" w:hanging="360"/>
+      </w:pPr>
+    </w:lvl>
+    <w:lvl w:ilvl="7">
+      <w:start w:val="1"/>
+      <w:numFmt w:val="decimal"/>
+      <w:lvlText w:val="%8."/>
+      <w:lvlJc w:val="left"/>
+      <w:pPr>
+        <w:ind w:left="5760" w:hanging="360"/>
+      </w:pPr>
+    </w:lvl>
+    <w:lvl w:ilvl="8">
+      <w:start w:val="1"/>
+      <w:numFmt w:val="decimal"/>
+      <w:lvlText w:val="%9."/>
+      <w:lvlJc w:val="left"/>
+      <w:pPr>
+        <w:ind w:left="6480" w:hanging="360"/>
+      </w:pPr>
     </w:lvl>
   </w:abstractNum>
   <w:num w:numId="1">
@@ -2720,6 +7163,66 @@
   </w:num>
   <w:num w:numId="1001">
     <w:abstractNumId w:val="991"/>
+  </w:num>
+  <w:num w:numId="1002">
+    <w:abstractNumId w:val="99411"/>
+    <w:lvlOverride w:ilvl="0">
+      <w:startOverride w:val="1"/>
+    </w:lvlOverride>
+    <w:lvlOverride w:ilvl="1">
+      <w:startOverride w:val="1"/>
+    </w:lvlOverride>
+    <w:lvlOverride w:ilvl="2">
+      <w:startOverride w:val="1"/>
+    </w:lvlOverride>
+    <w:lvlOverride w:ilvl="3">
+      <w:startOverride w:val="1"/>
+    </w:lvlOverride>
+    <w:lvlOverride w:ilvl="4">
+      <w:startOverride w:val="1"/>
+    </w:lvlOverride>
+    <w:lvlOverride w:ilvl="5">
+      <w:startOverride w:val="1"/>
+    </w:lvlOverride>
+    <w:lvlOverride w:ilvl="6">
+      <w:startOverride w:val="1"/>
+    </w:lvlOverride>
+    <w:lvlOverride w:ilvl="7">
+      <w:startOverride w:val="1"/>
+    </w:lvlOverride>
+    <w:lvlOverride w:ilvl="8">
+      <w:startOverride w:val="1"/>
+    </w:lvlOverride>
+  </w:num>
+  <w:num w:numId="1003">
+    <w:abstractNumId w:val="99411"/>
+    <w:lvlOverride w:ilvl="0">
+      <w:startOverride w:val="1"/>
+    </w:lvlOverride>
+    <w:lvlOverride w:ilvl="1">
+      <w:startOverride w:val="1"/>
+    </w:lvlOverride>
+    <w:lvlOverride w:ilvl="2">
+      <w:startOverride w:val="1"/>
+    </w:lvlOverride>
+    <w:lvlOverride w:ilvl="3">
+      <w:startOverride w:val="1"/>
+    </w:lvlOverride>
+    <w:lvlOverride w:ilvl="4">
+      <w:startOverride w:val="1"/>
+    </w:lvlOverride>
+    <w:lvlOverride w:ilvl="5">
+      <w:startOverride w:val="1"/>
+    </w:lvlOverride>
+    <w:lvlOverride w:ilvl="6">
+      <w:startOverride w:val="1"/>
+    </w:lvlOverride>
+    <w:lvlOverride w:ilvl="7">
+      <w:startOverride w:val="1"/>
+    </w:lvlOverride>
+    <w:lvlOverride w:ilvl="8">
+      <w:startOverride w:val="1"/>
+    </w:lvlOverride>
   </w:num>
 </w:numbering>
 </file>

</xml_diff>

<commit_message>
docs(manual): enforce textbook chapter contract (#4751)
* test(manual): define textbook chapter contract

* feat(manual): enforce textbook chapter contract

* docs(handoff): record main-rooted D3 delivery

* fix(manual): classify public contract digest

* ci: retrigger title-aware phantom guard

---------

Co-authored-by: codex-scheduled <codex-scheduled@users.noreply.github.com>
</commit_message>
<xml_diff>
--- a/manuals/tools/dist/tools-engineering-design-manual.docx
+++ b/manuals/tools/dist/tools-engineering-design-manual.docx
@@ -56,13 +56,19 @@
         <w:t xml:space="preserve"> </w:t>
       </w:r>
       <w:r>
-        <w:t xml:space="preserve">the stable calculation-pathway registry remains empty. Release remains blocked</w:t>
-      </w:r>
-      <w:r>
-        <w:t xml:space="preserve"> </w:t>
-      </w:r>
-      <w:r>
-        <w:t xml:space="preserve">by TOOLS-D3 through TOOLS-D9. Generated HTML, LaTeX, PDF, and DOCX artifacts</w:t>
+        <w:t xml:space="preserve">the stable calculation-pathway registry remains empty. The required textbook</w:t>
+      </w:r>
+      <w:r>
+        <w:t xml:space="preserve"> </w:t>
+      </w:r>
+      <w:r>
+        <w:t xml:space="preserve">chapter contract is qualified, but no exemplar chapter is registered. Release</w:t>
+      </w:r>
+      <w:r>
+        <w:t xml:space="preserve"> </w:t>
+      </w:r>
+      <w:r>
+        <w:t xml:space="preserve">remains blocked by TOOLS-D4 through TOOLS-D9. Generated HTML, LaTeX, PDF, and DOCX artifacts</w:t>
       </w:r>
       <w:r>
         <w:t xml:space="preserve"> </w:t>
@@ -418,7 +424,7 @@
         <w:t xml:space="preserve"> </w:t>
       </w:r>
       <w:r>
-        <w:t xml:space="preserve">Those pathways remain empty and blocked pending TOOLS-D3 through TOOLS-D9.</w:t>
+        <w:t xml:space="preserve">Those pathways remain empty and blocked pending TOOLS-D4 through TOOLS-D9.</w:t>
       </w:r>
     </w:p>
     <w:bookmarkEnd w:id="25"/>
@@ -529,13 +535,13 @@
         <w:pStyle w:val="BodyText"/>
       </w:pPr>
       <w:r>
-        <w:t xml:space="preserve">At this baseline, 3,434 modules are classified: 808 conservative calculation</w:t>
-      </w:r>
-      <w:r>
-        <w:t xml:space="preserve"> </w:t>
-      </w:r>
-      <w:r>
-        <w:t xml:space="preserve">candidates and 2,626 non-calculation modules. One legacy JavaScript file has a</w:t>
+        <w:t xml:space="preserve">At this baseline, 3,437 modules are classified: 808 conservative calculation</w:t>
+      </w:r>
+      <w:r>
+        <w:t xml:space="preserve"> </w:t>
+      </w:r>
+      <w:r>
+        <w:t xml:space="preserve">candidates and 2,629 non-calculation modules. One legacy JavaScript file has a</w:t>
       </w:r>
       <w:r>
         <w:t xml:space="preserve"> </w:t>
@@ -765,7 +771,13 @@
         <w:t xml:space="preserve"> </w:t>
       </w:r>
       <w:r>
-        <w:t xml:space="preserve">TOOLS-D3 owns stable equation-to-code identities that survive file movement.</w:t>
+        <w:t xml:space="preserve">TOOLS-D3 owns the structural chapter contract; TOOLS-D4 owns exemplar</w:t>
+      </w:r>
+      <w:r>
+        <w:t xml:space="preserve"> </w:t>
+      </w:r>
+      <w:r>
+        <w:t xml:space="preserve">registration and stable equation-to-code identities that survive file movement.</w:t>
       </w:r>
     </w:p>
     <w:bookmarkEnd w:id="28"/>
@@ -1027,22 +1039,13 @@
         <w:t xml:space="preserve"> </w:t>
       </w:r>
       <w:r>
-        <w:t xml:space="preserve">change makes</w:t>
-      </w:r>
-      <w:r>
-        <w:t xml:space="preserve"> </w:t>
-      </w:r>
-      <w:r>
-        <w:rPr>
-          <w:rStyle w:val="VerbatimChar"/>
-        </w:rPr>
-        <w:t xml:space="preserve">--check</w:t>
-      </w:r>
-      <w:r>
-        <w:t xml:space="preserve"> </w:t>
-      </w:r>
-      <w:r>
-        <w:t xml:space="preserve">fail until the manifest is regenerated and reviewed. A</w:t>
+        <w:t xml:space="preserve">change makes inventory check mode fail until the manifest is regenerated and</w:t>
+      </w:r>
+      <w:r>
+        <w:t xml:space="preserve"> </w:t>
+      </w:r>
+      <w:r>
+        <w:t xml:space="preserve">reviewed. A</w:t>
       </w:r>
       <w:r>
         <w:t xml:space="preserve"> </w:t>
@@ -1444,7 +1447,7 @@
     </w:p>
     <w:bookmarkEnd w:id="37"/>
     <w:bookmarkEnd w:id="38"/>
-    <w:bookmarkStart w:id="44" w:name="references"/>
+    <w:bookmarkStart w:id="39" w:name="references"/>
     <w:p>
       <w:pPr>
         <w:pStyle w:val="Heading1"/>
@@ -1453,8 +1456,744 @@
         <w:t xml:space="preserve">References</w:t>
       </w:r>
     </w:p>
-    <w:bookmarkStart w:id="43" w:name="refs"/>
-    <w:bookmarkStart w:id="40" w:name="ref-pandoc-manual"/>
+    <w:bookmarkEnd w:id="39"/>
+    <w:bookmarkStart w:id="51" w:name="required-textbook-chapter-contract"/>
+    <w:p>
+      <w:pPr>
+        <w:pStyle w:val="Heading1"/>
+      </w:pPr>
+      <w:r>
+        <w:t xml:space="preserve">Required Textbook Chapter Contract</w:t>
+      </w:r>
+    </w:p>
+    <w:bookmarkStart w:id="40" w:name="outcome-and-authority-1"/>
+    <w:p>
+      <w:pPr>
+        <w:pStyle w:val="Heading2"/>
+      </w:pPr>
+      <w:r>
+        <w:t xml:space="preserve">Outcome and Authority</w:t>
+      </w:r>
+    </w:p>
+    <w:p>
+      <w:pPr>
+        <w:pStyle w:val="FirstParagraph"/>
+      </w:pPr>
+      <w:r>
+        <w:t xml:space="preserve">TOOLS-D3 defines the public structure that every calculation-level textbook</w:t>
+      </w:r>
+      <w:r>
+        <w:t xml:space="preserve"> </w:t>
+      </w:r>
+      <w:r>
+        <w:t xml:space="preserve">chapter must satisfy before registration. The contract is structural and</w:t>
+      </w:r>
+      <w:r>
+        <w:t xml:space="preserve"> </w:t>
+      </w:r>
+      <w:r>
+        <w:t xml:space="preserve">traceability-focused: passing it does not approve an equation, implementation,</w:t>
+      </w:r>
+      <w:r>
+        <w:t xml:space="preserve"> </w:t>
+      </w:r>
+      <w:r>
+        <w:t xml:space="preserve">dataset, artifact, license, or engineering use. The registry is intentionally</w:t>
+      </w:r>
+      <w:r>
+        <w:t xml:space="preserve"> </w:t>
+      </w:r>
+      <w:r>
+        <w:t xml:space="preserve">empty until TOOLS-D4 supplies reviewed exemplar chapters.</w:t>
+      </w:r>
+    </w:p>
+    <w:p>
+      <w:pPr>
+        <w:pStyle w:val="BodyText"/>
+      </w:pPr>
+      <w:r>
+        <w:t xml:space="preserve">Two version identifiers are fixed:</w:t>
+      </w:r>
+    </w:p>
+    <w:p>
+      <w:pPr>
+        <w:pStyle w:val="Compact"/>
+        <w:numPr>
+          <w:ilvl w:val="0"/>
+          <w:numId w:val="1001"/>
+        </w:numPr>
+      </w:pPr>
+      <w:r>
+        <w:t xml:space="preserve">Contract:</w:t>
+      </w:r>
+      <w:r>
+        <w:t xml:space="preserve"> </w:t>
+      </w:r>
+      <w:r>
+        <w:rPr>
+          <w:rStyle w:val="VerbatimChar"/>
+        </w:rPr>
+        <w:t xml:space="preserve">tools-textbook-chapter-contract/1.0.0</w:t>
+      </w:r>
+    </w:p>
+    <w:p>
+      <w:pPr>
+        <w:pStyle w:val="Compact"/>
+        <w:numPr>
+          <w:ilvl w:val="0"/>
+          <w:numId w:val="1001"/>
+        </w:numPr>
+      </w:pPr>
+      <w:r>
+        <w:t xml:space="preserve">Registry:</w:t>
+      </w:r>
+      <w:r>
+        <w:t xml:space="preserve"> </w:t>
+      </w:r>
+      <w:r>
+        <w:rPr>
+          <w:rStyle w:val="VerbatimChar"/>
+        </w:rPr>
+        <w:t xml:space="preserve">tools-textbook-chapter-registry/1.0.0</w:t>
+      </w:r>
+    </w:p>
+    <w:p>
+      <w:pPr>
+        <w:pStyle w:val="FirstParagraph"/>
+      </w:pPr>
+      <w:r>
+        <w:t xml:space="preserve">Their repository-owned JSON Schemas allow external consumers to validate shape</w:t>
+      </w:r>
+      <w:r>
+        <w:t xml:space="preserve"> </w:t>
+      </w:r>
+      <w:r>
+        <w:t xml:space="preserve">without importing producer code. The Python consumer then applies stricter</w:t>
+      </w:r>
+      <w:r>
+        <w:t xml:space="preserve"> </w:t>
+      </w:r>
+      <w:r>
+        <w:t xml:space="preserve">invariants for normalized paths, ordering, uniqueness, authority state, and QMD</w:t>
+      </w:r>
+      <w:r>
+        <w:t xml:space="preserve"> </w:t>
+      </w:r>
+      <w:r>
+        <w:t xml:space="preserve">content.</w:t>
+      </w:r>
+    </w:p>
+    <w:bookmarkEnd w:id="40"/>
+    <w:bookmarkStart w:id="41" w:name="required-chapter-anatomy"/>
+    <w:p>
+      <w:pPr>
+        <w:pStyle w:val="Heading2"/>
+      </w:pPr>
+      <w:r>
+        <w:t xml:space="preserve">Required Chapter Anatomy</w:t>
+      </w:r>
+    </w:p>
+    <w:p>
+      <w:pPr>
+        <w:pStyle w:val="FirstParagraph"/>
+      </w:pPr>
+      <w:r>
+        <w:t xml:space="preserve">Fourteen ordered sections are mandatory. A registered chapter must present,</w:t>
+      </w:r>
+      <w:r>
+        <w:t xml:space="preserve"> </w:t>
+      </w:r>
+      <w:r>
+        <w:t xml:space="preserve">in order: Purpose and Scope; Design by Contract; Coordinates, Frames, and Time;</w:t>
+      </w:r>
+      <w:r>
+        <w:t xml:space="preserve"> </w:t>
+      </w:r>
+      <w:r>
+        <w:t xml:space="preserve">Units and Dimensions; Derivation and Assumptions; Algorithm; Implementation</w:t>
+      </w:r>
+      <w:r>
+        <w:t xml:space="preserve"> </w:t>
+      </w:r>
+      <w:r>
+        <w:t xml:space="preserve">Symbols; Error and Failure Semantics; Uncertainty and Sensitivity; Verification</w:t>
+      </w:r>
+      <w:r>
+        <w:t xml:space="preserve"> </w:t>
+      </w:r>
+      <w:r>
+        <w:t xml:space="preserve">and Validation; Limits and Applicability; Worked Examples; References and</w:t>
+      </w:r>
+      <w:r>
+        <w:t xml:space="preserve"> </w:t>
+      </w:r>
+      <w:r>
+        <w:t xml:space="preserve">Provenance; and Revision History.</w:t>
+      </w:r>
+    </w:p>
+    <w:p>
+      <w:pPr>
+        <w:pStyle w:val="BodyText"/>
+      </w:pPr>
+      <w:r>
+        <w:t xml:space="preserve">The contract also declares mandatory third-level headings. For example, Design</w:t>
+      </w:r>
+      <w:r>
+        <w:t xml:space="preserve"> </w:t>
+      </w:r>
+      <w:r>
+        <w:t xml:space="preserve">by Contract requires Preconditions, Postconditions, and Invariants. Coordinates</w:t>
+      </w:r>
+      <w:r>
+        <w:t xml:space="preserve"> </w:t>
+      </w:r>
+      <w:r>
+        <w:t xml:space="preserve">requires frame, handedness, and time declarations. Verification and Validation</w:t>
+      </w:r>
+      <w:r>
+        <w:t xml:space="preserve"> </w:t>
+      </w:r>
+      <w:r>
+        <w:t xml:space="preserve">requires test evidence and acceptance criteria. Exact ordered headings remove</w:t>
+      </w:r>
+      <w:r>
+        <w:t xml:space="preserve"> </w:t>
+      </w:r>
+      <w:r>
+        <w:t xml:space="preserve">format-dependent inference and make an omitted obligation a deterministic</w:t>
+      </w:r>
+      <w:r>
+        <w:t xml:space="preserve"> </w:t>
+      </w:r>
+      <w:r>
+        <w:t xml:space="preserve">failure.</w:t>
+      </w:r>
+    </w:p>
+    <w:bookmarkEnd w:id="41"/>
+    <w:bookmarkStart w:id="42" w:name="registration-and-traceability"/>
+    <w:p>
+      <w:pPr>
+        <w:pStyle w:val="Heading2"/>
+      </w:pPr>
+      <w:r>
+        <w:t xml:space="preserve">Registration and Traceability</w:t>
+      </w:r>
+    </w:p>
+    <w:p>
+      <w:pPr>
+        <w:pStyle w:val="FirstParagraph"/>
+      </w:pPr>
+      <w:r>
+        <w:t xml:space="preserve">Each registered chapter has one stable chapter ID and one normalized QMD path.</w:t>
+      </w:r>
+      <w:r>
+        <w:t xml:space="preserve"> </w:t>
+      </w:r>
+      <w:r>
+        <w:t xml:space="preserve">Its descriptor binds the chapter version and provisional authority to an owner,</w:t>
+      </w:r>
+      <w:r>
+        <w:t xml:space="preserve"> </w:t>
+      </w:r>
+      <w:r>
+        <w:t xml:space="preserve">review owner, stable calculation IDs, module IDs, verification tests, source</w:t>
+      </w:r>
+      <w:r>
+        <w:t xml:space="preserve"> </w:t>
+      </w:r>
+      <w:r>
+        <w:t xml:space="preserve">citations, explicit limitations, and revision history. All traceability arrays</w:t>
+      </w:r>
+      <w:r>
+        <w:t xml:space="preserve"> </w:t>
+      </w:r>
+      <w:r>
+        <w:t xml:space="preserve">are non-empty, unique, and sorted; duplicate chapter IDs or paths are rejected.</w:t>
+      </w:r>
+    </w:p>
+    <w:p>
+      <w:pPr>
+        <w:pStyle w:val="BodyText"/>
+      </w:pPr>
+      <w:r>
+        <w:t xml:space="preserve">An</w:t>
+      </w:r>
+      <w:r>
+        <w:t xml:space="preserve"> </w:t>
+      </w:r>
+      <w:r>
+        <w:rPr>
+          <w:rStyle w:val="VerbatimChar"/>
+        </w:rPr>
+        <w:t xml:space="preserve">approved</w:t>
+      </w:r>
+      <w:r>
+        <w:t xml:space="preserve"> </w:t>
+      </w:r>
+      <w:r>
+        <w:t xml:space="preserve">chapter claim is unsupported by this D3 contract because later</w:t>
+      </w:r>
+      <w:r>
+        <w:t xml:space="preserve"> </w:t>
+      </w:r>
+      <w:r>
+        <w:t xml:space="preserve">subepics own page, accessibility, publication, and human-review evidence. D3</w:t>
+      </w:r>
+      <w:r>
+        <w:t xml:space="preserve"> </w:t>
+      </w:r>
+      <w:r>
+        <w:t xml:space="preserve">accepts only</w:t>
+      </w:r>
+      <w:r>
+        <w:t xml:space="preserve"> </w:t>
+      </w:r>
+      <w:r>
+        <w:rPr>
+          <w:rStyle w:val="VerbatimChar"/>
+        </w:rPr>
+        <w:t xml:space="preserve">provisional</w:t>
+      </w:r>
+      <w:r>
+        <w:t xml:space="preserve"> </w:t>
+      </w:r>
+      <w:r>
+        <w:t xml:space="preserve">and</w:t>
+      </w:r>
+      <w:r>
+        <w:t xml:space="preserve"> </w:t>
+      </w:r>
+      <w:r>
+        <w:rPr>
+          <w:rStyle w:val="VerbatimChar"/>
+        </w:rPr>
+        <w:t xml:space="preserve">verified-unapproved</w:t>
+      </w:r>
+      <w:r>
+        <w:t xml:space="preserve"> </w:t>
+      </w:r>
+      <w:r>
+        <w:t xml:space="preserve">chapter descriptors. The</w:t>
+      </w:r>
+      <w:r>
+        <w:t xml:space="preserve"> </w:t>
+      </w:r>
+      <w:r>
+        <w:t xml:space="preserve">manual and every generated representation therefore remain</w:t>
+      </w:r>
+      <w:r>
+        <w:t xml:space="preserve"> </w:t>
+      </w:r>
+      <w:r>
+        <w:rPr>
+          <w:rStyle w:val="VerbatimChar"/>
+        </w:rPr>
+        <w:t xml:space="preserve">generated-unapproved</w:t>
+      </w:r>
+      <w:r>
+        <w:t xml:space="preserve">.</w:t>
+      </w:r>
+    </w:p>
+    <w:bookmarkEnd w:id="42"/>
+    <w:bookmarkStart w:id="43" w:name="linter-algorithm-and-evidence"/>
+    <w:p>
+      <w:pPr>
+        <w:pStyle w:val="Heading2"/>
+      </w:pPr>
+      <w:r>
+        <w:t xml:space="preserve">Linter Algorithm and Evidence</w:t>
+      </w:r>
+    </w:p>
+    <w:p>
+      <w:pPr>
+        <w:pStyle w:val="FirstParagraph"/>
+      </w:pPr>
+      <w:r>
+        <w:t xml:space="preserve">The linter loads the contract and registry through strict typed consumers,</w:t>
+      </w:r>
+      <w:r>
+        <w:t xml:space="preserve"> </w:t>
+      </w:r>
+      <w:r>
+        <w:t xml:space="preserve">resolves each registered path beneath</w:t>
+      </w:r>
+      <w:r>
+        <w:t xml:space="preserve"> </w:t>
+      </w:r>
+      <w:r>
+        <w:rPr>
+          <w:rStyle w:val="VerbatimChar"/>
+        </w:rPr>
+        <w:t xml:space="preserve">manuals/tools/chapters</w:t>
+      </w:r>
+      <w:r>
+        <w:t xml:space="preserve">, decodes UTF-8,</w:t>
+      </w:r>
+      <w:r>
+        <w:t xml:space="preserve"> </w:t>
+      </w:r>
+      <w:r>
+        <w:t xml:space="preserve">and rejects forbidden placeholder or private-source tokens. It extracts level-2</w:t>
+      </w:r>
+      <w:r>
+        <w:t xml:space="preserve"> </w:t>
+      </w:r>
+      <w:r>
+        <w:t xml:space="preserve">and level-3 headings, compares them with the exact ordered contract, and checks</w:t>
+      </w:r>
+      <w:r>
+        <w:t xml:space="preserve"> </w:t>
+      </w:r>
+      <w:r>
+        <w:t xml:space="preserve">that every required section has governed body content.</w:t>
+      </w:r>
+    </w:p>
+    <w:p>
+      <w:pPr>
+        <w:pStyle w:val="BodyText"/>
+      </w:pPr>
+      <w:r>
+        <w:t xml:space="preserve">For normalized chapter text</w:t>
+      </w:r>
+      <w:r>
+        <w:t xml:space="preserve"> </w:t>
+      </w:r>
+      <m:oMath>
+        <m:r>
+          <m:t>T</m:t>
+        </m:r>
+      </m:oMath>
+      <w:r>
+        <w:t xml:space="preserve"> </w:t>
+      </w:r>
+      <w:r>
+        <w:t xml:space="preserve">and ordered section blocks</w:t>
+      </w:r>
+      <w:r>
+        <w:t xml:space="preserve"> </w:t>
+      </w:r>
+      <m:oMath>
+        <m:sSub>
+          <m:e>
+            <m:r>
+              <m:t>S</m:t>
+            </m:r>
+          </m:e>
+          <m:sub>
+            <m:r>
+              <m:t>i</m:t>
+            </m:r>
+          </m:sub>
+        </m:sSub>
+      </m:oMath>
+      <w:r>
+        <w:t xml:space="preserve">, the linter</w:t>
+      </w:r>
+      <w:r>
+        <w:t xml:space="preserve"> </w:t>
+      </w:r>
+      <w:r>
+        <w:t xml:space="preserve">records deterministic evidence as</w:t>
+      </w:r>
+    </w:p>
+    <w:p>
+      <w:pPr>
+        <w:pStyle w:val="BodyText"/>
+      </w:pPr>
+      <m:oMathPara>
+        <m:oMathParaPr>
+          <m:jc m:val="center"/>
+        </m:oMathParaPr>
+        <m:oMath>
+          <m:sSub>
+            <m:e>
+              <m:r>
+                <m:t>h</m:t>
+              </m:r>
+            </m:e>
+            <m:sub>
+              <m:r>
+                <m:t>T</m:t>
+              </m:r>
+            </m:sub>
+          </m:sSub>
+          <m:r>
+            <m:rPr>
+              <m:sty m:val="p"/>
+            </m:rPr>
+            <m:t>=</m:t>
+          </m:r>
+          <m:r>
+            <m:rPr>
+              <m:sty m:val="p"/>
+            </m:rPr>
+            <m:t>SHA256</m:t>
+          </m:r>
+          <m:r>
+            <m:rPr>
+              <m:sty m:val="p"/>
+            </m:rPr>
+            <m:t>(</m:t>
+          </m:r>
+          <m:r>
+            <m:rPr>
+              <m:sty m:val="p"/>
+            </m:rPr>
+            <m:t>LF</m:t>
+          </m:r>
+          <m:r>
+            <m:rPr>
+              <m:sty m:val="p"/>
+            </m:rPr>
+            <m:t>(</m:t>
+          </m:r>
+          <m:r>
+            <m:t>T</m:t>
+          </m:r>
+          <m:r>
+            <m:rPr>
+              <m:sty m:val="p"/>
+            </m:rPr>
+            <m:t>)</m:t>
+          </m:r>
+          <m:r>
+            <m:rPr>
+              <m:sty m:val="p"/>
+            </m:rPr>
+            <m:t>)</m:t>
+          </m:r>
+          <m:r>
+            <m:rPr>
+              <m:sty m:val="p"/>
+            </m:rPr>
+            <m:t>,</m:t>
+          </m:r>
+          <m:r>
+            <m:t>  </m:t>
+          </m:r>
+          <m:sSub>
+            <m:e>
+              <m:r>
+                <m:t>h</m:t>
+              </m:r>
+            </m:e>
+            <m:sub>
+              <m:r>
+                <m:t>i</m:t>
+              </m:r>
+            </m:sub>
+          </m:sSub>
+          <m:r>
+            <m:rPr>
+              <m:sty m:val="p"/>
+            </m:rPr>
+            <m:t>=</m:t>
+          </m:r>
+          <m:r>
+            <m:rPr>
+              <m:sty m:val="p"/>
+            </m:rPr>
+            <m:t>SHA256</m:t>
+          </m:r>
+          <m:r>
+            <m:rPr>
+              <m:sty m:val="p"/>
+            </m:rPr>
+            <m:t>(</m:t>
+          </m:r>
+          <m:r>
+            <m:rPr>
+              <m:sty m:val="p"/>
+            </m:rPr>
+            <m:t>LF</m:t>
+          </m:r>
+          <m:r>
+            <m:rPr>
+              <m:sty m:val="p"/>
+            </m:rPr>
+            <m:t>(</m:t>
+          </m:r>
+          <m:sSub>
+            <m:e>
+              <m:r>
+                <m:t>S</m:t>
+              </m:r>
+            </m:e>
+            <m:sub>
+              <m:r>
+                <m:t>i</m:t>
+              </m:r>
+            </m:sub>
+          </m:sSub>
+          <m:r>
+            <m:rPr>
+              <m:sty m:val="p"/>
+            </m:rPr>
+            <m:t>)</m:t>
+          </m:r>
+          <m:r>
+            <m:rPr>
+              <m:sty m:val="p"/>
+            </m:rPr>
+            <m:t>)</m:t>
+          </m:r>
+          <m:r>
+            <m:rPr>
+              <m:sty m:val="p"/>
+            </m:rPr>
+            <m:t>.</m:t>
+          </m:r>
+        </m:oMath>
+      </m:oMathPara>
+    </w:p>
+    <w:p>
+      <w:pPr>
+        <w:pStyle w:val="FirstParagraph"/>
+      </w:pPr>
+      <w:r>
+        <w:t xml:space="preserve">These hashes detect byte-level content drift while remaining independent of</w:t>
+      </w:r>
+      <w:r>
+        <w:t xml:space="preserve"> </w:t>
+      </w:r>
+      <w:r>
+        <w:t xml:space="preserve">Windows or POSIX checkout line endings. They are lint evidence, not scientific</w:t>
+      </w:r>
+      <w:r>
+        <w:t xml:space="preserve"> </w:t>
+      </w:r>
+      <w:r>
+        <w:t xml:space="preserve">approval or an immutable publication digest.</w:t>
+      </w:r>
+    </w:p>
+    <w:bookmarkEnd w:id="43"/>
+    <w:bookmarkStart w:id="44" w:name="failure-and-ownership-boundaries"/>
+    <w:p>
+      <w:pPr>
+        <w:pStyle w:val="Heading2"/>
+      </w:pPr>
+      <w:r>
+        <w:t xml:space="preserve">Failure and Ownership Boundaries</w:t>
+      </w:r>
+    </w:p>
+    <w:p>
+      <w:pPr>
+        <w:pStyle w:val="FirstParagraph"/>
+      </w:pPr>
+      <w:r>
+        <w:t xml:space="preserve">Missing files, invalid UTF-8, unsafe paths, unknown fields or versions, duplicate</w:t>
+      </w:r>
+      <w:r>
+        <w:t xml:space="preserve"> </w:t>
+      </w:r>
+      <w:r>
+        <w:t xml:space="preserve">identities, unsorted traceability, missing or reordered headings, empty governed</w:t>
+      </w:r>
+      <w:r>
+        <w:t xml:space="preserve"> </w:t>
+      </w:r>
+      <w:r>
+        <w:t xml:space="preserve">content, placeholders, private-source references, unsupported status promotion,</w:t>
+      </w:r>
+      <w:r>
+        <w:t xml:space="preserve"> </w:t>
+      </w:r>
+      <w:r>
+        <w:t xml:space="preserve">and stale generated artifacts all fail closed. The linter does not synthesize</w:t>
+      </w:r>
+      <w:r>
+        <w:t xml:space="preserve"> </w:t>
+      </w:r>
+      <w:r>
+        <w:t xml:space="preserve">equations, units, sources, examples, tests, or limitations.</w:t>
+      </w:r>
+    </w:p>
+    <w:p>
+      <w:pPr>
+        <w:pStyle w:val="BodyText"/>
+      </w:pPr>
+      <w:r>
+        <w:t xml:space="preserve">TOOLS-D4 owns exemplar chapter registration. TOOLS-D5 expands phased module</w:t>
+      </w:r>
+      <w:r>
+        <w:t xml:space="preserve"> </w:t>
+      </w:r>
+      <w:r>
+        <w:t xml:space="preserve">coverage, TOOLS-D6 owns executable freshness, TOOLS-D7 owns rendered and</w:t>
+      </w:r>
+      <w:r>
+        <w:t xml:space="preserve"> </w:t>
+      </w:r>
+      <w:r>
+        <w:t xml:space="preserve">accessibility review, and TOOLS-D8 owns immutable public projection and human</w:t>
+      </w:r>
+      <w:r>
+        <w:t xml:space="preserve"> </w:t>
+      </w:r>
+      <w:r>
+        <w:t xml:space="preserve">approval.</w:t>
+      </w:r>
+    </w:p>
+    <w:bookmarkEnd w:id="44"/>
+    <w:bookmarkStart w:id="50" w:name="consumer-workflow"/>
+    <w:p>
+      <w:pPr>
+        <w:pStyle w:val="Heading2"/>
+      </w:pPr>
+      <w:r>
+        <w:t xml:space="preserve">Consumer Workflow</w:t>
+      </w:r>
+    </w:p>
+    <w:p>
+      <w:pPr>
+        <w:pStyle w:val="FirstParagraph"/>
+      </w:pPr>
+      <w:r>
+        <w:t xml:space="preserve">Authors edit only canonical QMD and the machine-readable chapter registry. Run</w:t>
+      </w:r>
+      <w:r>
+        <w:t xml:space="preserve"> </w:t>
+      </w:r>
+      <w:r>
+        <w:t xml:space="preserve">these commands in order:</w:t>
+      </w:r>
+    </w:p>
+    <w:p>
+      <w:pPr>
+        <w:pStyle w:val="SourceCode"/>
+      </w:pPr>
+      <w:r>
+        <w:rPr>
+          <w:rStyle w:val="VerbatimChar"/>
+        </w:rPr>
+        <w:t xml:space="preserve">python -m scripts.lint_tools_textbook_chapters</w:t>
+      </w:r>
+      <w:r>
+        <w:br/>
+      </w:r>
+      <w:r>
+        <w:rPr>
+          <w:rStyle w:val="VerbatimChar"/>
+        </w:rPr>
+        <w:t xml:space="preserve">python -m scripts.render_tools_design_manual --render</w:t>
+      </w:r>
+    </w:p>
+    <w:p>
+      <w:pPr>
+        <w:pStyle w:val="FirstParagraph"/>
+      </w:pPr>
+      <w:r>
+        <w:t xml:space="preserve">They regenerate and check all four representations. The combined governance,</w:t>
+      </w:r>
+      <w:r>
+        <w:t xml:space="preserve"> </w:t>
+      </w:r>
+      <w:r>
+        <w:t xml:space="preserve">inventory, chapter, and artifact freshness gates must pass before review.</w:t>
+      </w:r>
+    </w:p>
+    <w:bookmarkStart w:id="49" w:name="refs"/>
+    <w:bookmarkStart w:id="46" w:name="ref-pandoc-manual"/>
     <w:p>
       <w:pPr>
         <w:pStyle w:val="Bibliography"/>
@@ -1478,7 +2217,7 @@
       <w:r>
         <w:t xml:space="preserve"> </w:t>
       </w:r>
-      <w:hyperlink r:id="rId39">
+      <w:hyperlink r:id="rId45">
         <w:r>
           <w:rPr>
             <w:rStyle w:val="Hyperlink"/>
@@ -1490,8 +2229,8 @@
         <w:t xml:space="preserve">.</w:t>
       </w:r>
     </w:p>
-    <w:bookmarkEnd w:id="40"/>
-    <w:bookmarkStart w:id="42" w:name="ref-quarto-guide"/>
+    <w:bookmarkEnd w:id="46"/>
+    <w:bookmarkStart w:id="48" w:name="ref-quarto-guide"/>
     <w:p>
       <w:pPr>
         <w:pStyle w:val="Bibliography"/>
@@ -1515,7 +2254,7 @@
       <w:r>
         <w:t xml:space="preserve"> </w:t>
       </w:r>
-      <w:hyperlink r:id="rId41">
+      <w:hyperlink r:id="rId47">
         <w:r>
           <w:rPr>
             <w:rStyle w:val="Hyperlink"/>
@@ -1527,9 +2266,10 @@
         <w:t xml:space="preserve">.</w:t>
       </w:r>
     </w:p>
-    <w:bookmarkEnd w:id="42"/>
-    <w:bookmarkEnd w:id="43"/>
-    <w:bookmarkEnd w:id="44"/>
+    <w:bookmarkEnd w:id="48"/>
+    <w:bookmarkEnd w:id="49"/>
+    <w:bookmarkEnd w:id="50"/>
+    <w:bookmarkEnd w:id="51"/>
     <w:sectPr>
       <w:headerReference r:id="rId9" w:type="default"/>
       <w:footerReference r:id="rId10" w:type="default"/>
@@ -1845,6 +2585,109 @@
       </w:pPr>
     </w:lvl>
   </w:abstractNum>
+  <w:abstractNum w:abstractNumId="991">
+    <w:nsid w:val="0000A991"/>
+    <w:multiLevelType w:val="multilevel"/>
+    <w:lvl w:ilvl="0">
+      <w:numFmt w:val="bullet"/>
+      <w:lvlText w:val=""/>
+      <w:lvlJc w:val="left"/>
+      <w:pPr>
+        <w:ind w:left="720" w:hanging="360"/>
+      </w:pPr>
+      <w:rPr>
+        <w:rFonts w:ascii="Symbol" w:hAnsi="Symbol" w:cs="Symbol" w:hint="default"/>
+      </w:rPr>
+    </w:lvl>
+    <w:lvl w:ilvl="1">
+      <w:numFmt w:val="bullet"/>
+      <w:lvlText w:val="o"/>
+      <w:lvlJc w:val="left"/>
+      <w:pPr>
+        <w:ind w:left="1440" w:hanging="360"/>
+      </w:pPr>
+      <w:rPr>
+        <w:rFonts w:ascii="Courier New" w:hAnsi="Courier New" w:cs="Courier New" w:hint="default"/>
+      </w:rPr>
+    </w:lvl>
+    <w:lvl w:ilvl="2">
+      <w:numFmt w:val="bullet"/>
+      <w:lvlText w:val=""/>
+      <w:lvlJc w:val="left"/>
+      <w:pPr>
+        <w:ind w:left="2160" w:hanging="360"/>
+      </w:pPr>
+      <w:rPr>
+        <w:rFonts w:ascii="Wingdings" w:hAnsi="Wingdings" w:cs="Wingdings" w:hint="default"/>
+      </w:rPr>
+    </w:lvl>
+    <w:lvl w:ilvl="3">
+      <w:numFmt w:val="bullet"/>
+      <w:lvlText w:val=""/>
+      <w:lvlJc w:val="left"/>
+      <w:pPr>
+        <w:ind w:left="2880" w:hanging="360"/>
+      </w:pPr>
+      <w:rPr>
+        <w:rFonts w:ascii="Symbol" w:hAnsi="Symbol" w:cs="Symbol" w:hint="default"/>
+      </w:rPr>
+    </w:lvl>
+    <w:lvl w:ilvl="4">
+      <w:numFmt w:val="bullet"/>
+      <w:lvlText w:val="o"/>
+      <w:lvlJc w:val="left"/>
+      <w:pPr>
+        <w:ind w:left="3600" w:hanging="360"/>
+      </w:pPr>
+      <w:rPr>
+        <w:rFonts w:ascii="Courier New" w:hAnsi="Courier New" w:cs="Courier New" w:hint="default"/>
+      </w:rPr>
+    </w:lvl>
+    <w:lvl w:ilvl="5">
+      <w:numFmt w:val="bullet"/>
+      <w:lvlText w:val=""/>
+      <w:lvlJc w:val="left"/>
+      <w:pPr>
+        <w:ind w:left="4320" w:hanging="360"/>
+      </w:pPr>
+      <w:rPr>
+        <w:rFonts w:ascii="Wingdings" w:hAnsi="Wingdings" w:cs="Wingdings" w:hint="default"/>
+      </w:rPr>
+    </w:lvl>
+    <w:lvl w:ilvl="6">
+      <w:numFmt w:val="bullet"/>
+      <w:lvlText w:val=""/>
+      <w:lvlJc w:val="left"/>
+      <w:pPr>
+        <w:ind w:left="5040" w:hanging="360"/>
+      </w:pPr>
+      <w:rPr>
+        <w:rFonts w:ascii="Symbol" w:hAnsi="Symbol" w:cs="Symbol" w:hint="default"/>
+      </w:rPr>
+    </w:lvl>
+    <w:lvl w:ilvl="7">
+      <w:numFmt w:val="bullet"/>
+      <w:lvlText w:val="o"/>
+      <w:lvlJc w:val="left"/>
+      <w:pPr>
+        <w:ind w:left="5760" w:hanging="360"/>
+      </w:pPr>
+      <w:rPr>
+        <w:rFonts w:ascii="Courier New" w:hAnsi="Courier New" w:cs="Courier New" w:hint="default"/>
+      </w:rPr>
+    </w:lvl>
+    <w:lvl w:ilvl="8">
+      <w:numFmt w:val="bullet"/>
+      <w:lvlText w:val=""/>
+      <w:lvlJc w:val="left"/>
+      <w:pPr>
+        <w:ind w:left="6480" w:hanging="360"/>
+      </w:pPr>
+      <w:rPr>
+        <w:rFonts w:ascii="Wingdings" w:hAnsi="Wingdings" w:cs="Wingdings" w:hint="default"/>
+      </w:rPr>
+    </w:lvl>
+  </w:abstractNum>
   <w:num w:numId="1">
     <w:abstractNumId w:val="8"/>
   </w:num>
@@ -1874,6 +2717,9 @@
   </w:num>
   <w:num w:numId="1000">
     <w:abstractNumId w:val="990"/>
+  </w:num>
+  <w:num w:numId="1001">
+    <w:abstractNumId w:val="991"/>
   </w:num>
 </w:numbering>
 </file>

</xml_diff>

<commit_message>
docs(manual): add governed calculation exemplars (#4752)
* test(docs): define D4 exemplar contracts

* feat(docs): add D4 exemplar manuals

* fix(manual): allowlist deterministic inventory commit

---------

Co-authored-by: codex-scheduled <codex-scheduled@users.noreply.github.com>
</commit_message>
<xml_diff>
--- a/manuals/tools/dist/tools-engineering-design-manual.docx
+++ b/manuals/tools/dist/tools-engineering-design-manual.docx
@@ -50,37 +50,49 @@
         <w:t xml:space="preserve"> </w:t>
       </w:r>
       <w:r>
-        <w:t xml:space="preserve">denominator, but all detected calculation candidates remain provisional and</w:t>
-      </w:r>
-      <w:r>
-        <w:t xml:space="preserve"> </w:t>
-      </w:r>
-      <w:r>
-        <w:t xml:space="preserve">the stable calculation-pathway registry remains empty. The required textbook</w:t>
-      </w:r>
-      <w:r>
-        <w:t xml:space="preserve"> </w:t>
-      </w:r>
-      <w:r>
-        <w:t xml:space="preserve">chapter contract is qualified, but no exemplar chapter is registered. Release</w:t>
-      </w:r>
-      <w:r>
-        <w:t xml:space="preserve"> </w:t>
-      </w:r>
-      <w:r>
-        <w:t xml:space="preserve">remains blocked by TOOLS-D4 through TOOLS-D9. Generated HTML, LaTeX, PDF, and DOCX artifacts</w:t>
-      </w:r>
-      <w:r>
-        <w:t xml:space="preserve"> </w:t>
-      </w:r>
-      <w:r>
-        <w:t xml:space="preserve">are reproducible engineering records under TOOLS-D2, but none is approved for</w:t>
-      </w:r>
-      <w:r>
-        <w:t xml:space="preserve"> </w:t>
-      </w:r>
-      <w:r>
-        <w:t xml:space="preserve">publication or engineering use.</w:t>
+        <w:t xml:space="preserve">denominator. TOOLS-D4 registers one model-conditioned D-plane calculation and</w:t>
+      </w:r>
+      <w:r>
+        <w:t xml:space="preserve"> </w:t>
+      </w:r>
+      <w:r>
+        <w:t xml:space="preserve">one swing/Rate-of-Closure textbook exemplar with exact source, consumer, test,</w:t>
+      </w:r>
+      <w:r>
+        <w:t xml:space="preserve"> </w:t>
+      </w:r>
+      <w:r>
+        <w:t xml:space="preserve">fixture, equation, unit, and limitation traceability. The markerless-mocap</w:t>
+      </w:r>
+      <w:r>
+        <w:t xml:space="preserve"> </w:t>
+      </w:r>
+      <w:r>
+        <w:t xml:space="preserve">exemplar remains explicitly blocked because its authority PR is unmerged and no</w:t>
+      </w:r>
+      <w:r>
+        <w:t xml:space="preserve"> </w:t>
+      </w:r>
+      <w:r>
+        <w:t xml:space="preserve">markerless module exists on this exact source base. Release remains blocked by</w:t>
+      </w:r>
+      <w:r>
+        <w:t xml:space="preserve"> </w:t>
+      </w:r>
+      <w:r>
+        <w:t xml:space="preserve">TOOLS-D5 through TOOLS-D9 and outstanding D4 approvals. Generated HTML, LaTeX,</w:t>
+      </w:r>
+      <w:r>
+        <w:t xml:space="preserve"> </w:t>
+      </w:r>
+      <w:r>
+        <w:t xml:space="preserve">PDF, and DOCX artifacts are reproducible engineering records under TOOLS-D2,</w:t>
+      </w:r>
+      <w:r>
+        <w:t xml:space="preserve"> </w:t>
+      </w:r>
+      <w:r>
+        <w:t xml:space="preserve">but none is approved for publication or engineering use.</w:t>
       </w:r>
     </w:p>
     <w:bookmarkEnd w:id="19"/>
@@ -424,7 +436,31 @@
         <w:t xml:space="preserve"> </w:t>
       </w:r>
       <w:r>
-        <w:t xml:space="preserve">Those pathways remain empty and blocked pending TOOLS-D4 through TOOLS-D9.</w:t>
+        <w:t xml:space="preserve">TOOLS-D4 registers one model-conditioned D-plane exemplar with explicit</w:t>
+      </w:r>
+      <w:r>
+        <w:t xml:space="preserve"> </w:t>
+      </w:r>
+      <w:r>
+        <w:t xml:space="preserve">equation-to-code-to-test evidence while retaining review-required inventory</w:t>
+      </w:r>
+      <w:r>
+        <w:t xml:space="preserve"> </w:t>
+      </w:r>
+      <w:r>
+        <w:t xml:space="preserve">authority. The markerless-mocap exemplar remains fail-closed because its source</w:t>
+      </w:r>
+      <w:r>
+        <w:t xml:space="preserve"> </w:t>
+      </w:r>
+      <w:r>
+        <w:t xml:space="preserve">dependency is unmerged. Expansion, executable freshness, review, publication,</w:t>
+      </w:r>
+      <w:r>
+        <w:t xml:space="preserve"> </w:t>
+      </w:r>
+      <w:r>
+        <w:t xml:space="preserve">and human approval remain blocked under TOOLS-D5 through TOOLS-D9.</w:t>
       </w:r>
     </w:p>
     <w:bookmarkEnd w:id="25"/>
@@ -535,13 +571,13 @@
         <w:pStyle w:val="BodyText"/>
       </w:pPr>
       <w:r>
-        <w:t xml:space="preserve">At this baseline, 3,437 modules are classified: 808 conservative calculation</w:t>
-      </w:r>
-      <w:r>
-        <w:t xml:space="preserve"> </w:t>
-      </w:r>
-      <w:r>
-        <w:t xml:space="preserve">candidates and 2,629 non-calculation modules. One legacy JavaScript file has a</w:t>
+        <w:t xml:space="preserve">At this baseline, 3,439 modules are classified: 808 conservative calculation</w:t>
+      </w:r>
+      <w:r>
+        <w:t xml:space="preserve"> </w:t>
+      </w:r>
+      <w:r>
+        <w:t xml:space="preserve">candidates and 2,631 non-calculation modules. One legacy JavaScript file has a</w:t>
       </w:r>
       <w:r>
         <w:t xml:space="preserve"> </w:t>
@@ -1214,7 +1250,7 @@
       <w:r>
         <w:drawing>
           <wp:inline>
-            <wp:extent cx="4754880" cy="2318004"/>
+            <wp:extent cx="4160520" cy="2028253"/>
             <wp:effectExtent b="0" l="0" r="0" t="0"/>
             <wp:docPr descr="Deterministic rendering pathway." title="" id="33" name="Picture"/>
             <a:graphic>
@@ -1235,7 +1271,7 @@
                   <pic:spPr bwMode="auto">
                     <a:xfrm>
                       <a:off x="0" y="0"/>
-                      <a:ext cx="4754880" cy="2318004"/>
+                      <a:ext cx="4160520" cy="2028253"/>
                     </a:xfrm>
                     <a:prstGeom prst="rect">
                       <a:avLst/>
@@ -1456,8 +1492,28 @@
         <w:t xml:space="preserve">References</w:t>
       </w:r>
     </w:p>
+    <w:p>
+      <w:pPr>
+        <w:pStyle w:val="FirstParagraph"/>
+      </w:pPr>
+      <w:r>
+        <w:t xml:space="preserve">The cited Pandoc and Quarto records are resolved from the governed bibliography</w:t>
+      </w:r>
+      <w:r>
+        <w:t xml:space="preserve"> </w:t>
+      </w:r>
+      <w:r>
+        <w:t xml:space="preserve">declared by the pinned toolchain contract; an unresolved citation fails the</w:t>
+      </w:r>
+      <w:r>
+        <w:t xml:space="preserve"> </w:t>
+      </w:r>
+      <w:r>
+        <w:t xml:space="preserve">qualified render.</w:t>
+      </w:r>
+    </w:p>
     <w:bookmarkEnd w:id="39"/>
-    <w:bookmarkStart w:id="51" w:name="required-textbook-chapter-contract"/>
+    <w:bookmarkStart w:id="46" w:name="required-textbook-chapter-contract"/>
     <w:p>
       <w:pPr>
         <w:pStyle w:val="Heading1"/>
@@ -1498,13 +1554,19 @@
         <w:t xml:space="preserve"> </w:t>
       </w:r>
       <w:r>
-        <w:t xml:space="preserve">dataset, artifact, license, or engineering use. The registry is intentionally</w:t>
-      </w:r>
-      <w:r>
-        <w:t xml:space="preserve"> </w:t>
-      </w:r>
-      <w:r>
-        <w:t xml:space="preserve">empty until TOOLS-D4 supplies reviewed exemplar chapters.</w:t>
+        <w:t xml:space="preserve">dataset, artifact, license, or engineering use. TOOLS-D4 now registers one</w:t>
+      </w:r>
+      <w:r>
+        <w:t xml:space="preserve"> </w:t>
+      </w:r>
+      <w:r>
+        <w:t xml:space="preserve">verified-unapproved swing and Rate-of-Closure exemplar; missing markerless</w:t>
+      </w:r>
+      <w:r>
+        <w:t xml:space="preserve"> </w:t>
+      </w:r>
+      <w:r>
+        <w:t xml:space="preserve">authority remains an explicit blocker rather than an inferred calculation.</w:t>
       </w:r>
     </w:p>
     <w:p>
@@ -2113,7 +2175,13 @@
         <w:pStyle w:val="BodyText"/>
       </w:pPr>
       <w:r>
-        <w:t xml:space="preserve">TOOLS-D4 owns exemplar chapter registration. TOOLS-D5 expands phased module</w:t>
+        <w:t xml:space="preserve">TOOLS-D4 owns exemplar chapter registration and its fail-closed dependency</w:t>
+      </w:r>
+      <w:r>
+        <w:t xml:space="preserve"> </w:t>
+      </w:r>
+      <w:r>
+        <w:t xml:space="preserve">coverage. TOOLS-D5 expands phased module</w:t>
       </w:r>
       <w:r>
         <w:t xml:space="preserve"> </w:t>
@@ -2135,7 +2203,7 @@
       </w:r>
     </w:p>
     <w:bookmarkEnd w:id="44"/>
-    <w:bookmarkStart w:id="50" w:name="consumer-workflow"/>
+    <w:bookmarkStart w:id="45" w:name="consumer-workflow"/>
     <w:p>
       <w:pPr>
         <w:pStyle w:val="Heading2"/>
@@ -2160,40 +2228,4329 @@
     </w:p>
     <w:p>
       <w:pPr>
-        <w:pStyle w:val="SourceCode"/>
+        <w:pStyle w:val="Compact"/>
+        <w:numPr>
+          <w:ilvl w:val="0"/>
+          <w:numId w:val="1002"/>
+        </w:numPr>
       </w:pPr>
       <w:r>
         <w:rPr>
           <w:rStyle w:val="VerbatimChar"/>
         </w:rPr>
-        <w:t xml:space="preserve">python -m scripts.lint_tools_textbook_chapters</w:t>
-      </w:r>
-      <w:r>
-        <w:br/>
+        <w:t xml:space="preserve">python -m</w:t>
+      </w:r>
+      <w:r>
+        <w:t xml:space="preserve"> </w:t>
       </w:r>
       <w:r>
         <w:rPr>
           <w:rStyle w:val="VerbatimChar"/>
         </w:rPr>
-        <w:t xml:space="preserve">python -m scripts.render_tools_design_manual --render</w:t>
+        <w:t xml:space="preserve">scripts.lint_tools_textbook_chapters</w:t>
       </w:r>
     </w:p>
     <w:p>
       <w:pPr>
+        <w:pStyle w:val="Compact"/>
+        <w:numPr>
+          <w:ilvl w:val="0"/>
+          <w:numId w:val="1002"/>
+        </w:numPr>
+      </w:pPr>
+      <w:r>
+        <w:rPr>
+          <w:rStyle w:val="VerbatimChar"/>
+        </w:rPr>
+        <w:t xml:space="preserve">python -m</w:t>
+      </w:r>
+      <w:r>
+        <w:t xml:space="preserve"> </w:t>
+      </w:r>
+      <w:r>
+        <w:rPr>
+          <w:rStyle w:val="VerbatimChar"/>
+        </w:rPr>
+        <w:t xml:space="preserve">scripts.check_tools_exemplars</w:t>
+      </w:r>
+    </w:p>
+    <w:p>
+      <w:pPr>
+        <w:pStyle w:val="Compact"/>
+        <w:numPr>
+          <w:ilvl w:val="0"/>
+          <w:numId w:val="1002"/>
+        </w:numPr>
+      </w:pPr>
+      <w:r>
+        <w:rPr>
+          <w:rStyle w:val="VerbatimChar"/>
+        </w:rPr>
+        <w:t xml:space="preserve">python -m</w:t>
+      </w:r>
+      <w:r>
+        <w:t xml:space="preserve"> </w:t>
+      </w:r>
+      <w:r>
+        <w:rPr>
+          <w:rStyle w:val="VerbatimChar"/>
+        </w:rPr>
+        <w:t xml:space="preserve">scripts.render_tools_design_manual</w:t>
+      </w:r>
+      <w:r>
+        <w:t xml:space="preserve"> </w:t>
+      </w:r>
+      <w:r>
+        <w:rPr>
+          <w:rStyle w:val="VerbatimChar"/>
+        </w:rPr>
+        <w:t xml:space="preserve">--render</w:t>
+      </w:r>
+    </w:p>
+    <w:p>
+      <w:r>
+        <w:br w:type="page"/>
+      </w:r>
+    </w:p>
+    <w:bookmarkEnd w:id="45"/>
+    <w:bookmarkEnd w:id="46"/>
+    <w:bookmarkStart w:id="97" w:name="swing-rate-of-closure-d-plane-exemplar"/>
+    <w:p>
+      <w:pPr>
+        <w:pStyle w:val="Heading1"/>
+      </w:pPr>
+      <w:r>
+        <w:t xml:space="preserve">Swing and Rate-of-Closure D-Plane Geometry</w:t>
+      </w:r>
+    </w:p>
+    <w:bookmarkStart w:id="47" w:name="purpose-and-scope"/>
+    <w:p>
+      <w:pPr>
+        <w:pStyle w:val="Heading2"/>
+      </w:pPr>
+      <w:r>
+        <w:t xml:space="preserve">Purpose and Scope</w:t>
+      </w:r>
+    </w:p>
+    <w:p>
+      <w:pPr>
         <w:pStyle w:val="FirstParagraph"/>
       </w:pPr>
       <w:r>
-        <w:t xml:space="preserve">They regenerate and check all four representations. The combined governance,</w:t>
-      </w:r>
-      <w:r>
-        <w:t xml:space="preserve"> </w:t>
-      </w:r>
-      <w:r>
-        <w:t xml:space="preserve">inventory, chapter, and artifact freshness gates must pass before review.</w:t>
+        <w:t xml:space="preserve">This governed exemplar explains how</w:t>
+      </w:r>
+      <w:r>
+        <w:t xml:space="preserve"> </w:t>
+      </w:r>
+      <w:r>
+        <w:rPr>
+          <w:rStyle w:val="VerbatimChar"/>
+        </w:rPr>
+        <w:t xml:space="preserve">swing_sim</w:t>
+      </w:r>
+      <w:r>
+        <w:t xml:space="preserve"> </w:t>
+      </w:r>
+      <w:r>
+        <w:t xml:space="preserve">computes frame-explicit</w:t>
+      </w:r>
+      <w:r>
+        <w:t xml:space="preserve"> </w:t>
+      </w:r>
+      <w:r>
+        <w:t xml:space="preserve">three-dimensional D-plane geometry and how Rate of Closure supplies three</w:t>
+      </w:r>
+      <w:r>
+        <w:t xml:space="preserve"> </w:t>
+      </w:r>
+      <w:r>
+        <w:t xml:space="preserve">distinct rigid-body velocity points to that calculation. It is for developers,</w:t>
+      </w:r>
+      <w:r>
+        <w:t xml:space="preserve"> </w:t>
+      </w:r>
+      <w:r>
+        <w:t xml:space="preserve">scientific reviewers, and integrators who need to reproduce the equations and</w:t>
+      </w:r>
+      <w:r>
+        <w:t xml:space="preserve"> </w:t>
+      </w:r>
+      <w:r>
+        <w:t xml:space="preserve">follow every value into code and tests. It covers geometric direction</w:t>
+      </w:r>
+      <w:r>
+        <w:t xml:space="preserve"> </w:t>
+      </w:r>
+      <w:r>
+        <w:t xml:space="preserve">relationships only. It does not predict ball launch, spin magnitude,</w:t>
+      </w:r>
+      <w:r>
+        <w:t xml:space="preserve"> </w:t>
+      </w:r>
+      <w:r>
+        <w:t xml:space="preserve">aerodynamic flight, player outcome, equipment quality, or an operating</w:t>
+      </w:r>
+      <w:r>
+        <w:t xml:space="preserve"> </w:t>
+      </w:r>
+      <w:r>
+        <w:t xml:space="preserve">decision. The calculation and rendered artifacts are verified-unapproved.</w:t>
       </w:r>
     </w:p>
-    <w:bookmarkStart w:id="49" w:name="refs"/>
-    <w:bookmarkStart w:id="46" w:name="ref-pandoc-manual"/>
+    <w:bookmarkEnd w:id="47"/>
+    <w:bookmarkStart w:id="51" w:name="design-by-contract"/>
+    <w:p>
+      <w:pPr>
+        <w:pStyle w:val="Heading2"/>
+      </w:pPr>
+      <w:r>
+        <w:t xml:space="preserve">Design by Contract</w:t>
+      </w:r>
+    </w:p>
+    <w:bookmarkStart w:id="48" w:name="preconditions"/>
+    <w:p>
+      <w:pPr>
+        <w:pStyle w:val="Heading3"/>
+      </w:pPr>
+      <w:r>
+        <w:t xml:space="preserve">Preconditions</w:t>
+      </w:r>
+    </w:p>
+    <w:p>
+      <w:pPr>
+        <w:pStyle w:val="FirstParagraph"/>
+      </w:pPr>
+      <w:r>
+        <w:rPr>
+          <w:rStyle w:val="VerbatimChar"/>
+        </w:rPr>
+        <w:t xml:space="preserve">analyze_dplane</w:t>
+      </w:r>
+      <w:r>
+        <w:t xml:space="preserve"> </w:t>
+      </w:r>
+      <w:r>
+        <w:t xml:space="preserve">accepts travel, face-normal, target, and up vectors with</w:t>
+      </w:r>
+      <w:r>
+        <w:t xml:space="preserve"> </w:t>
+      </w:r>
+      <w:r>
+        <w:t xml:space="preserve">exactly three finite components. Face normal, target, and up must each have</w:t>
+      </w:r>
+      <w:r>
+        <w:t xml:space="preserve"> </w:t>
+      </w:r>
+      <w:r>
+        <w:t xml:space="preserve">Euclidean norm greater than</w:t>
+      </w:r>
+      <w:r>
+        <w:t xml:space="preserve"> </w:t>
+      </w:r>
+      <m:oMath>
+        <m:sSup>
+          <m:e>
+            <m:r>
+              <m:t>10</m:t>
+            </m:r>
+          </m:e>
+          <m:sup>
+            <m:r>
+              <m:rPr>
+                <m:sty m:val="p"/>
+              </m:rPr>
+              <m:t>−</m:t>
+            </m:r>
+            <m:r>
+              <m:t>12</m:t>
+            </m:r>
+          </m:sup>
+        </m:sSup>
+      </m:oMath>
+      <w:r>
+        <w:t xml:space="preserve">. Target and up must be orthogonal to</w:t>
+      </w:r>
+      <w:r>
+        <w:t xml:space="preserve"> </w:t>
+      </w:r>
+      <w:r>
+        <w:t xml:space="preserve">absolute dot product</w:t>
+      </w:r>
+      <w:r>
+        <w:t xml:space="preserve"> </w:t>
+      </w:r>
+      <m:oMath>
+        <m:sSup>
+          <m:e>
+            <m:r>
+              <m:t>10</m:t>
+            </m:r>
+          </m:e>
+          <m:sup>
+            <m:r>
+              <m:rPr>
+                <m:sty m:val="p"/>
+              </m:rPr>
+              <m:t>−</m:t>
+            </m:r>
+            <m:r>
+              <m:t>10</m:t>
+            </m:r>
+          </m:sup>
+        </m:sSup>
+      </m:oMath>
+      <w:r>
+        <w:t xml:space="preserve">. The Rate-of-Closure adapter additionally</w:t>
+      </w:r>
+      <w:r>
+        <w:t xml:space="preserve"> </w:t>
+      </w:r>
+      <w:r>
+        <w:t xml:space="preserve">requires a typed</w:t>
+      </w:r>
+      <w:r>
+        <w:t xml:space="preserve"> </w:t>
+      </w:r>
+      <w:r>
+        <w:rPr>
+          <w:rStyle w:val="VerbatimChar"/>
+        </w:rPr>
+        <w:t xml:space="preserve">SimulationRun</w:t>
+      </w:r>
+      <w:r>
+        <w:t xml:space="preserve"> </w:t>
+      </w:r>
+      <w:r>
+        <w:t xml:space="preserve">with increasing sample times and internally</w:t>
+      </w:r>
+      <w:r>
+        <w:t xml:space="preserve"> </w:t>
+      </w:r>
+      <w:r>
+        <w:t xml:space="preserve">consistent pose, twist, club, scenario, and inspection-event records.</w:t>
+      </w:r>
+    </w:p>
+    <w:bookmarkEnd w:id="48"/>
+    <w:bookmarkStart w:id="49" w:name="postconditions"/>
+    <w:p>
+      <w:pPr>
+        <w:pStyle w:val="Heading3"/>
+      </w:pPr>
+      <w:r>
+        <w:t xml:space="preserve">Postconditions</w:t>
+      </w:r>
+    </w:p>
+    <w:p>
+      <w:pPr>
+        <w:pStyle w:val="FirstParagraph"/>
+      </w:pPr>
+      <w:r>
+        <w:t xml:space="preserve">Every available direction is normalized and every angle is in degrees. Spin</w:t>
+      </w:r>
+      <w:r>
+        <w:t xml:space="preserve"> </w:t>
+      </w:r>
+      <w:r>
+        <w:t xml:space="preserve">loft is the principal angle on</w:t>
+      </w:r>
+      <w:r>
+        <w:t xml:space="preserve"> </w:t>
+      </w:r>
+      <m:oMath>
+        <m:r>
+          <m:rPr>
+            <m:sty m:val="p"/>
+          </m:rPr>
+          <m:t>[</m:t>
+        </m:r>
+        <m:r>
+          <m:t>0</m:t>
+        </m:r>
+        <m:r>
+          <m:rPr>
+            <m:sty m:val="p"/>
+          </m:rPr>
+          <m:t>,</m:t>
+        </m:r>
+        <m:r>
+          <m:t>180</m:t>
+        </m:r>
+        <m:r>
+          <m:rPr>
+            <m:sty m:val="p"/>
+          </m:rPr>
+          <m:t>]</m:t>
+        </m:r>
+      </m:oMath>
+      <w:r>
+        <w:t xml:space="preserve">. A defined D-plane supplies a unit</w:t>
+      </w:r>
+      <w:r>
+        <w:t xml:space="preserve"> </w:t>
+      </w:r>
+      <w:r>
+        <w:t xml:space="preserve">normal perpendicular to travel and face. Zero, parallel, antiparallel, and</w:t>
+      </w:r>
+      <w:r>
+        <w:t xml:space="preserve"> </w:t>
+      </w:r>
+      <w:r>
+        <w:t xml:space="preserve">unprojectable states return explicit status or null fields; they never invent a</w:t>
+      </w:r>
+      <w:r>
+        <w:t xml:space="preserve"> </w:t>
+      </w:r>
+      <w:r>
+        <w:t xml:space="preserve">plane, horizontal heading, or face-to-path result.</w:t>
+      </w:r>
+    </w:p>
+    <w:bookmarkEnd w:id="49"/>
+    <w:bookmarkStart w:id="50" w:name="invariants"/>
+    <w:p>
+      <w:pPr>
+        <w:pStyle w:val="Heading3"/>
+      </w:pPr>
+      <w:r>
+        <w:t xml:space="preserve">Invariants</w:t>
+      </w:r>
+    </w:p>
+    <w:p>
+      <w:pPr>
+        <w:pStyle w:val="FirstParagraph"/>
+      </w:pPr>
+      <w:r>
+        <w:t xml:space="preserve">A common proper rotation of travel, face, target, and up preserves spin loft,</w:t>
+      </w:r>
+      <w:r>
+        <w:t xml:space="preserve"> </w:t>
+      </w:r>
+      <w:r>
+        <w:t xml:space="preserve">planar spin loft, face-to-path, and intrinsic tilt. Reflecting the right axis</w:t>
+      </w:r>
+      <w:r>
+        <w:t xml:space="preserve"> </w:t>
+      </w:r>
+      <w:r>
+        <w:t xml:space="preserve">reverses signed horizontal relationships while preserving spin loft.</w:t>
+      </w:r>
+      <w:r>
+        <w:t xml:space="preserve"> </w:t>
+      </w:r>
+      <w:r>
+        <w:t xml:space="preserve">Multiplying a nonzero travel vector by a positive scalar does not change the</w:t>
+      </w:r>
+      <w:r>
+        <w:t xml:space="preserve"> </w:t>
+      </w:r>
+      <w:r>
+        <w:t xml:space="preserve">geometry because only direction enters the method.</w:t>
+      </w:r>
+    </w:p>
+    <w:bookmarkEnd w:id="50"/>
+    <w:bookmarkEnd w:id="51"/>
+    <w:bookmarkStart w:id="56" w:name="coordinates-frames-and-time"/>
+    <w:p>
+      <w:pPr>
+        <w:pStyle w:val="Heading2"/>
+      </w:pPr>
+      <w:r>
+        <w:t xml:space="preserve">Coordinates, Frames, and Time</w:t>
+      </w:r>
+    </w:p>
+    <w:bookmarkStart w:id="53" w:name="coordinate-frames"/>
+    <w:p>
+      <w:pPr>
+        <w:pStyle w:val="Heading3"/>
+      </w:pPr>
+      <w:r>
+        <w:t xml:space="preserve">Coordinate Frames</w:t>
+      </w:r>
+    </w:p>
+    <w:p>
+      <w:pPr>
+        <w:pStyle w:val="FirstParagraph"/>
+      </w:pPr>
+      <w:bookmarkStart w:id="52" w:name="dplane-coordinate-frame"/>
+      <w:bookmarkEnd w:id="52"/>
+    </w:p>
+    <w:p>
+      <w:pPr>
+        <w:pStyle w:val="BodyText"/>
+      </w:pPr>
+      <w:r>
+        <w:t xml:space="preserve">The default application frame is</w:t>
+      </w:r>
+      <w:r>
+        <w:t xml:space="preserve"> </w:t>
+      </w:r>
+      <w:r>
+        <w:rPr>
+          <w:rStyle w:val="VerbatimChar"/>
+        </w:rPr>
+        <w:t xml:space="preserve">app_frame:x_target,y_up,z_right</w:t>
+      </w:r>
+      <w:r>
+        <w:t xml:space="preserve">. Let</w:t>
+      </w:r>
+      <w:r>
+        <w:t xml:space="preserve"> </w:t>
+      </w:r>
+      <m:oMath>
+        <m:acc>
+          <m:accPr>
+            <m:chr m:val="̂"/>
+          </m:accPr>
+          <m:e>
+            <m:r>
+              <m:rPr>
+                <m:sty m:val="b"/>
+              </m:rPr>
+              <m:t>t</m:t>
+            </m:r>
+          </m:e>
+        </m:acc>
+      </m:oMath>
+      <w:r>
+        <w:t xml:space="preserve"> </w:t>
+      </w:r>
+      <w:r>
+        <w:t xml:space="preserve">be target and</w:t>
+      </w:r>
+      <w:r>
+        <w:t xml:space="preserve"> </w:t>
+      </w:r>
+      <m:oMath>
+        <m:acc>
+          <m:accPr>
+            <m:chr m:val="̂"/>
+          </m:accPr>
+          <m:e>
+            <m:r>
+              <m:rPr>
+                <m:sty m:val="b"/>
+              </m:rPr>
+              <m:t>u</m:t>
+            </m:r>
+          </m:e>
+        </m:acc>
+      </m:oMath>
+      <w:r>
+        <w:t xml:space="preserve"> </w:t>
+      </w:r>
+      <w:r>
+        <w:t xml:space="preserve">be up. The implementation constructs right as</w:t>
+      </w:r>
+    </w:p>
+    <w:p>
+      <w:pPr>
+        <w:pStyle w:val="BodyText"/>
+      </w:pPr>
+      <m:oMathPara>
+        <m:oMathParaPr>
+          <m:jc m:val="center"/>
+        </m:oMathParaPr>
+        <m:oMath>
+          <m:acc>
+            <m:accPr>
+              <m:chr m:val="̂"/>
+            </m:accPr>
+            <m:e>
+              <m:r>
+                <m:rPr>
+                  <m:sty m:val="b"/>
+                </m:rPr>
+                <m:t>r</m:t>
+              </m:r>
+            </m:e>
+          </m:acc>
+          <m:r>
+            <m:rPr>
+              <m:sty m:val="p"/>
+            </m:rPr>
+            <m:t>=</m:t>
+          </m:r>
+          <m:f>
+            <m:fPr>
+              <m:type m:val="bar"/>
+            </m:fPr>
+            <m:num>
+              <m:acc>
+                <m:accPr>
+                  <m:chr m:val="̂"/>
+                </m:accPr>
+                <m:e>
+                  <m:r>
+                    <m:rPr>
+                      <m:sty m:val="b"/>
+                    </m:rPr>
+                    <m:t>t</m:t>
+                  </m:r>
+                </m:e>
+              </m:acc>
+              <m:r>
+                <m:rPr>
+                  <m:sty m:val="p"/>
+                </m:rPr>
+                <m:t>×</m:t>
+              </m:r>
+              <m:acc>
+                <m:accPr>
+                  <m:chr m:val="̂"/>
+                </m:accPr>
+                <m:e>
+                  <m:r>
+                    <m:rPr>
+                      <m:sty m:val="b"/>
+                    </m:rPr>
+                    <m:t>u</m:t>
+                  </m:r>
+                </m:e>
+              </m:acc>
+            </m:num>
+            <m:den>
+              <m:d>
+                <m:dPr>
+                  <m:begChr m:val="‖"/>
+                  <m:sepChr m:val=""/>
+                  <m:endChr m:val="‖"/>
+                  <m:grow/>
+                </m:dPr>
+                <m:e>
+                  <m:acc>
+                    <m:accPr>
+                      <m:chr m:val="̂"/>
+                    </m:accPr>
+                    <m:e>
+                      <m:r>
+                        <m:rPr>
+                          <m:sty m:val="b"/>
+                        </m:rPr>
+                        <m:t>t</m:t>
+                      </m:r>
+                    </m:e>
+                  </m:acc>
+                  <m:r>
+                    <m:rPr>
+                      <m:sty m:val="p"/>
+                    </m:rPr>
+                    <m:t>×</m:t>
+                  </m:r>
+                  <m:acc>
+                    <m:accPr>
+                      <m:chr m:val="̂"/>
+                    </m:accPr>
+                    <m:e>
+                      <m:r>
+                        <m:rPr>
+                          <m:sty m:val="b"/>
+                        </m:rPr>
+                        <m:t>u</m:t>
+                      </m:r>
+                    </m:e>
+                  </m:acc>
+                </m:e>
+              </m:d>
+            </m:den>
+          </m:f>
+          <m:r>
+            <m:rPr>
+              <m:sty m:val="p"/>
+            </m:rPr>
+            <m:t>.</m:t>
+          </m:r>
+        </m:oMath>
+      </m:oMathPara>
+    </w:p>
+    <w:p>
+      <w:pPr>
+        <w:pStyle w:val="FirstParagraph"/>
+      </w:pPr>
+      <w:r>
+        <w:t xml:space="preserve">Rate of Closure interpolates the inspection-event rigid transform and twist,</w:t>
+      </w:r>
+      <w:r>
+        <w:t xml:space="preserve"> </w:t>
+      </w:r>
+      <w:r>
+        <w:t xml:space="preserve">then expresses reference, face-center, and contact vectors in this same frame.</w:t>
+      </w:r>
+    </w:p>
+    <w:bookmarkEnd w:id="53"/>
+    <w:bookmarkStart w:id="54" w:name="axis-and-handedness"/>
+    <w:p>
+      <w:pPr>
+        <w:pStyle w:val="Heading3"/>
+      </w:pPr>
+      <w:r>
+        <w:t xml:space="preserve">Axis and Handedness</w:t>
+      </w:r>
+    </w:p>
+    <w:p>
+      <w:pPr>
+        <w:pStyle w:val="FirstParagraph"/>
+      </w:pPr>
+      <w:r>
+        <w:t xml:space="preserve">Positive path and face headings rotate from target toward right. Elevation is</w:t>
+      </w:r>
+      <w:r>
+        <w:t xml:space="preserve"> </w:t>
+      </w:r>
+      <w:r>
+        <w:t xml:space="preserve">positive toward up. Target-times-up fixes the sign of right; reversing the</w:t>
+      </w:r>
+      <w:r>
+        <w:t xml:space="preserve"> </w:t>
+      </w:r>
+      <w:r>
+        <w:t xml:space="preserve">cross-product order would reverse every signed horizontal result. The D-plane</w:t>
+      </w:r>
+      <w:r>
+        <w:t xml:space="preserve"> </w:t>
+      </w:r>
+      <w:r>
+        <w:t xml:space="preserve">normal is travel-times-face, so its orientation also depends on declared order.</w:t>
+      </w:r>
+    </w:p>
+    <w:bookmarkEnd w:id="54"/>
+    <w:bookmarkStart w:id="55" w:name="time-convention"/>
+    <w:p>
+      <w:pPr>
+        <w:pStyle w:val="Heading3"/>
+      </w:pPr>
+      <w:r>
+        <w:t xml:space="preserve">Time Convention</w:t>
+      </w:r>
+    </w:p>
+    <w:p>
+      <w:pPr>
+        <w:pStyle w:val="FirstParagraph"/>
+      </w:pPr>
+      <w:r>
+        <w:t xml:space="preserve">The geometry is instantaneous and has no integration clock. Rate of Closure</w:t>
+      </w:r>
+      <w:r>
+        <w:t xml:space="preserve"> </w:t>
+      </w:r>
+      <w:r>
+        <w:t xml:space="preserve">evaluates it at</w:t>
+      </w:r>
+      <w:r>
+        <w:t xml:space="preserve"> </w:t>
+      </w:r>
+      <w:r>
+        <w:rPr>
+          <w:rStyle w:val="VerbatimChar"/>
+        </w:rPr>
+        <w:t xml:space="preserve">inspection_time_s</w:t>
+      </w:r>
+      <w:r>
+        <w:t xml:space="preserve">. Pose and twist are interpolated to that</w:t>
+      </w:r>
+      <w:r>
+        <w:t xml:space="preserve"> </w:t>
+      </w:r>
+      <w:r>
+        <w:t xml:space="preserve">event time; the closest sampled index is audit metadata and a bounded tangent</w:t>
+      </w:r>
+      <w:r>
+        <w:t xml:space="preserve"> </w:t>
+      </w:r>
+      <w:r>
+        <w:t xml:space="preserve">fallback. A miss remains a closest-approach event and is not relabeled impact.</w:t>
+      </w:r>
+    </w:p>
+    <w:bookmarkEnd w:id="55"/>
+    <w:bookmarkEnd w:id="56"/>
+    <w:bookmarkStart w:id="59" w:name="units-and-dimensions"/>
+    <w:p>
+      <w:pPr>
+        <w:pStyle w:val="Heading2"/>
+      </w:pPr>
+      <w:r>
+        <w:t xml:space="preserve">Units and Dimensions</w:t>
+      </w:r>
+    </w:p>
+    <w:bookmarkStart w:id="57" w:name="symbol-and-unit-table"/>
+    <w:p>
+      <w:pPr>
+        <w:pStyle w:val="Heading3"/>
+      </w:pPr>
+      <w:r>
+        <w:t xml:space="preserve">Symbol and Unit Table</w:t>
+      </w:r>
+    </w:p>
+    <w:tbl>
+      <w:tblPr>
+        <w:tblStyle w:val="Table"/>
+        <w:tblW w:type="pct" w:w="5000"/>
+        <w:tblLayout w:type="fixed"/>
+        <w:tblLook w:firstRow="1" w:lastRow="0" w:firstColumn="0" w:lastColumn="0" w:noHBand="0" w:noVBand="0" w:val="0020"/>
+      </w:tblPr>
+      <w:tblGrid>
+        <w:gridCol w:w="2640"/>
+        <w:gridCol w:w="2640"/>
+        <w:gridCol w:w="2640"/>
+      </w:tblGrid>
+      <w:tr>
+        <w:trPr>
+          <w:tblHeader w:val="on"/>
+        </w:trPr>
+        <w:tc>
+          <w:tcPr/>
+          <w:p>
+            <w:pPr>
+              <w:pStyle w:val="Compact"/>
+            </w:pPr>
+            <w:r>
+              <w:t xml:space="preserve">Symbol or field</w:t>
+            </w:r>
+          </w:p>
+        </w:tc>
+        <w:tc>
+          <w:tcPr/>
+          <w:p>
+            <w:pPr>
+              <w:pStyle w:val="Compact"/>
+            </w:pPr>
+            <w:r>
+              <w:t xml:space="preserve">Meaning</w:t>
+            </w:r>
+          </w:p>
+        </w:tc>
+        <w:tc>
+          <w:tcPr/>
+          <w:p>
+            <w:pPr>
+              <w:pStyle w:val="Compact"/>
+            </w:pPr>
+            <w:r>
+              <w:t xml:space="preserve">Unit</w:t>
+            </w:r>
+          </w:p>
+        </w:tc>
+      </w:tr>
+      <w:tr>
+        <w:tc>
+          <w:tcPr/>
+          <w:p>
+            <w:pPr>
+              <w:pStyle w:val="Compact"/>
+            </w:pPr>
+            <m:oMath>
+              <m:r>
+                <m:rPr>
+                  <m:sty m:val="b"/>
+                </m:rPr>
+                <m:t>v</m:t>
+              </m:r>
+            </m:oMath>
+          </w:p>
+        </w:tc>
+        <w:tc>
+          <w:tcPr/>
+          <w:p>
+            <w:pPr>
+              <w:pStyle w:val="Compact"/>
+            </w:pPr>
+            <w:r>
+              <w:t xml:space="preserve">reference, face-center, or contact velocity</w:t>
+            </w:r>
+          </w:p>
+        </w:tc>
+        <w:tc>
+          <w:tcPr/>
+          <w:p>
+            <w:pPr>
+              <w:pStyle w:val="Compact"/>
+            </w:pPr>
+            <w:r>
+              <w:t xml:space="preserve">m/s</w:t>
+            </w:r>
+          </w:p>
+        </w:tc>
+      </w:tr>
+      <w:tr>
+        <w:tc>
+          <w:tcPr/>
+          <w:p>
+            <w:pPr>
+              <w:pStyle w:val="Compact"/>
+            </w:pPr>
+            <m:oMath>
+              <m:acc>
+                <m:accPr>
+                  <m:chr m:val="̂"/>
+                </m:accPr>
+                <m:e>
+                  <m:r>
+                    <m:rPr>
+                      <m:sty m:val="b"/>
+                    </m:rPr>
+                    <m:t>n</m:t>
+                  </m:r>
+                </m:e>
+              </m:acc>
+            </m:oMath>
+          </w:p>
+        </w:tc>
+        <w:tc>
+          <w:tcPr/>
+          <w:p>
+            <w:pPr>
+              <w:pStyle w:val="Compact"/>
+            </w:pPr>
+            <w:r>
+              <w:t xml:space="preserve">delivered face normal</w:t>
+            </w:r>
+          </w:p>
+        </w:tc>
+        <w:tc>
+          <w:tcPr/>
+          <w:p>
+            <w:pPr>
+              <w:pStyle w:val="Compact"/>
+            </w:pPr>
+            <w:r>
+              <w:t xml:space="preserve">1</w:t>
+            </w:r>
+          </w:p>
+        </w:tc>
+      </w:tr>
+      <w:tr>
+        <w:tc>
+          <w:tcPr/>
+          <w:p>
+            <w:pPr>
+              <w:pStyle w:val="Compact"/>
+            </w:pPr>
+            <m:oMath>
+              <m:acc>
+                <m:accPr>
+                  <m:chr m:val="̂"/>
+                </m:accPr>
+                <m:e>
+                  <m:r>
+                    <m:rPr>
+                      <m:sty m:val="b"/>
+                    </m:rPr>
+                    <m:t>t</m:t>
+                  </m:r>
+                </m:e>
+              </m:acc>
+              <m:r>
+                <m:rPr>
+                  <m:sty m:val="p"/>
+                </m:rPr>
+                <m:t>,</m:t>
+              </m:r>
+              <m:acc>
+                <m:accPr>
+                  <m:chr m:val="̂"/>
+                </m:accPr>
+                <m:e>
+                  <m:r>
+                    <m:rPr>
+                      <m:sty m:val="b"/>
+                    </m:rPr>
+                    <m:t>u</m:t>
+                  </m:r>
+                </m:e>
+              </m:acc>
+              <m:r>
+                <m:rPr>
+                  <m:sty m:val="p"/>
+                </m:rPr>
+                <m:t>,</m:t>
+              </m:r>
+              <m:acc>
+                <m:accPr>
+                  <m:chr m:val="̂"/>
+                </m:accPr>
+                <m:e>
+                  <m:r>
+                    <m:rPr>
+                      <m:sty m:val="b"/>
+                    </m:rPr>
+                    <m:t>r</m:t>
+                  </m:r>
+                </m:e>
+              </m:acc>
+            </m:oMath>
+          </w:p>
+        </w:tc>
+        <w:tc>
+          <w:tcPr/>
+          <w:p>
+            <w:pPr>
+              <w:pStyle w:val="Compact"/>
+            </w:pPr>
+            <w:r>
+              <w:t xml:space="preserve">target, up, right axes</w:t>
+            </w:r>
+          </w:p>
+        </w:tc>
+        <w:tc>
+          <w:tcPr/>
+          <w:p>
+            <w:pPr>
+              <w:pStyle w:val="Compact"/>
+            </w:pPr>
+            <w:r>
+              <w:t xml:space="preserve">1</w:t>
+            </w:r>
+          </w:p>
+        </w:tc>
+      </w:tr>
+      <w:tr>
+        <w:tc>
+          <w:tcPr/>
+          <w:p>
+            <w:pPr>
+              <w:pStyle w:val="Compact"/>
+            </w:pPr>
+            <m:oMath>
+              <m:r>
+                <m:t>λ</m:t>
+              </m:r>
+            </m:oMath>
+          </w:p>
+        </w:tc>
+        <w:tc>
+          <w:tcPr/>
+          <w:p>
+            <w:pPr>
+              <w:pStyle w:val="Compact"/>
+            </w:pPr>
+            <w:r>
+              <w:t xml:space="preserve">three-dimensional spin loft</w:t>
+            </w:r>
+          </w:p>
+        </w:tc>
+        <w:tc>
+          <w:tcPr/>
+          <w:p>
+            <w:pPr>
+              <w:pStyle w:val="Compact"/>
+            </w:pPr>
+            <w:r>
+              <w:t xml:space="preserve">degree</w:t>
+            </w:r>
+          </w:p>
+        </w:tc>
+      </w:tr>
+      <w:tr>
+        <w:tc>
+          <w:tcPr/>
+          <w:p>
+            <w:pPr>
+              <w:pStyle w:val="Compact"/>
+            </w:pPr>
+            <m:oMath>
+              <m:r>
+                <m:t>p</m:t>
+              </m:r>
+              <m:r>
+                <m:rPr>
+                  <m:sty m:val="p"/>
+                </m:rPr>
+                <m:t>,</m:t>
+              </m:r>
+              <m:r>
+                <m:t>a</m:t>
+              </m:r>
+              <m:r>
+                <m:rPr>
+                  <m:sty m:val="p"/>
+                </m:rPr>
+                <m:t>,</m:t>
+              </m:r>
+              <m:r>
+                <m:t>f</m:t>
+              </m:r>
+              <m:r>
+                <m:rPr>
+                  <m:sty m:val="p"/>
+                </m:rPr>
+                <m:t>,</m:t>
+              </m:r>
+              <m:r>
+                <m:t>ℓ</m:t>
+              </m:r>
+            </m:oMath>
+          </w:p>
+        </w:tc>
+        <w:tc>
+          <w:tcPr/>
+          <w:p>
+            <w:pPr>
+              <w:pStyle w:val="Compact"/>
+            </w:pPr>
+            <w:r>
+              <w:t xml:space="preserve">path, attack, face, and dynamic-loft angles</w:t>
+            </w:r>
+          </w:p>
+        </w:tc>
+        <w:tc>
+          <w:tcPr/>
+          <w:p>
+            <w:pPr>
+              <w:pStyle w:val="Compact"/>
+            </w:pPr>
+            <w:r>
+              <w:t xml:space="preserve">degree</w:t>
+            </w:r>
+          </w:p>
+        </w:tc>
+      </w:tr>
+      <w:tr>
+        <w:tc>
+          <w:tcPr/>
+          <w:p>
+            <w:pPr>
+              <w:pStyle w:val="Compact"/>
+            </w:pPr>
+            <m:oMath>
+              <m:acc>
+                <m:accPr>
+                  <m:chr m:val="̂"/>
+                </m:accPr>
+                <m:e>
+                  <m:r>
+                    <m:rPr>
+                      <m:sty m:val="b"/>
+                    </m:rPr>
+                    <m:t>d</m:t>
+                  </m:r>
+                </m:e>
+              </m:acc>
+            </m:oMath>
+          </w:p>
+        </w:tc>
+        <w:tc>
+          <w:tcPr/>
+          <w:p>
+            <w:pPr>
+              <w:pStyle w:val="Compact"/>
+            </w:pPr>
+            <w:r>
+              <w:t xml:space="preserve">D-plane normal</w:t>
+            </w:r>
+          </w:p>
+        </w:tc>
+        <w:tc>
+          <w:tcPr/>
+          <w:p>
+            <w:pPr>
+              <w:pStyle w:val="Compact"/>
+            </w:pPr>
+            <w:r>
+              <w:t xml:space="preserve">1</w:t>
+            </w:r>
+          </w:p>
+        </w:tc>
+      </w:tr>
+      <w:tr>
+        <w:tc>
+          <w:tcPr/>
+          <w:p>
+            <w:pPr>
+              <w:pStyle w:val="Compact"/>
+            </w:pPr>
+            <w:r>
+              <w:rPr>
+                <w:rStyle w:val="VerbatimChar"/>
+              </w:rPr>
+              <w:t xml:space="preserve">event_time_s</w:t>
+            </w:r>
+          </w:p>
+        </w:tc>
+        <w:tc>
+          <w:tcPr/>
+          <w:p>
+            <w:pPr>
+              <w:pStyle w:val="Compact"/>
+            </w:pPr>
+            <w:r>
+              <w:t xml:space="preserve">interpolation time</w:t>
+            </w:r>
+          </w:p>
+        </w:tc>
+        <w:tc>
+          <w:tcPr/>
+          <w:p>
+            <w:pPr>
+              <w:pStyle w:val="Compact"/>
+            </w:pPr>
+            <w:r>
+              <w:t xml:space="preserve">s</w:t>
+            </w:r>
+          </w:p>
+        </w:tc>
+      </w:tr>
+    </w:tbl>
+    <w:bookmarkEnd w:id="57"/>
+    <w:bookmarkStart w:id="58" w:name="dimensional-checks"/>
+    <w:p>
+      <w:pPr>
+        <w:pStyle w:val="Heading3"/>
+      </w:pPr>
+      <w:r>
+        <w:t xml:space="preserve">Dimensional Checks</w:t>
+      </w:r>
+    </w:p>
+    <w:p>
+      <w:pPr>
+        <w:pStyle w:val="FirstParagraph"/>
+      </w:pPr>
+      <w:r>
+        <w:t xml:space="preserve">Normalizing</w:t>
+      </w:r>
+      <w:r>
+        <w:t xml:space="preserve"> </w:t>
+      </w:r>
+      <m:oMath>
+        <m:r>
+          <m:rPr>
+            <m:sty m:val="b"/>
+          </m:rPr>
+          <m:t>v</m:t>
+        </m:r>
+      </m:oMath>
+      <w:r>
+        <w:t xml:space="preserve"> </w:t>
+      </w:r>
+      <w:r>
+        <w:t xml:space="preserve">divides m/s by m/s, producing a unit direction. Dot and</w:t>
+      </w:r>
+      <w:r>
+        <w:t xml:space="preserve"> </w:t>
+      </w:r>
+      <w:r>
+        <w:t xml:space="preserve">cross products operate on dimensionless directions.</w:t>
+      </w:r>
+      <w:r>
+        <w:t xml:space="preserve"> </w:t>
+      </w:r>
+      <w:r>
+        <w:rPr>
+          <w:rStyle w:val="VerbatimChar"/>
+        </w:rPr>
+        <w:t xml:space="preserve">acos</w:t>
+      </w:r>
+      <w:r>
+        <w:t xml:space="preserve"> </w:t>
+      </w:r>
+      <w:r>
+        <w:t xml:space="preserve">and</w:t>
+      </w:r>
+      <w:r>
+        <w:t xml:space="preserve"> </w:t>
+      </w:r>
+      <w:r>
+        <w:rPr>
+          <w:rStyle w:val="VerbatimChar"/>
+        </w:rPr>
+        <w:t xml:space="preserve">atan2</w:t>
+      </w:r>
+      <w:r>
+        <w:t xml:space="preserve"> </w:t>
+      </w:r>
+      <w:r>
+        <w:t xml:space="preserve">return dimensionless radians, converted to degrees. The rigid-body equation</w:t>
+      </w:r>
+      <w:r>
+        <w:t xml:space="preserve"> </w:t>
+      </w:r>
+      <m:oMath>
+        <m:sSub>
+          <m:e>
+            <m:r>
+              <m:rPr>
+                <m:sty m:val="b"/>
+              </m:rPr>
+              <m:t>v</m:t>
+            </m:r>
+          </m:e>
+          <m:sub>
+            <m:r>
+              <m:t>P</m:t>
+            </m:r>
+          </m:sub>
+        </m:sSub>
+        <m:r>
+          <m:rPr>
+            <m:sty m:val="p"/>
+          </m:rPr>
+          <m:t>=</m:t>
+        </m:r>
+        <m:sSub>
+          <m:e>
+            <m:r>
+              <m:rPr>
+                <m:sty m:val="b"/>
+              </m:rPr>
+              <m:t>v</m:t>
+            </m:r>
+          </m:e>
+          <m:sub>
+            <m:r>
+              <m:t>O</m:t>
+            </m:r>
+          </m:sub>
+        </m:sSub>
+        <m:r>
+          <m:rPr>
+            <m:sty m:val="p"/>
+          </m:rPr>
+          <m:t>+</m:t>
+        </m:r>
+        <m:r>
+          <m:rPr>
+            <m:sty m:val="b"/>
+          </m:rPr>
+          <m:t>ω</m:t>
+        </m:r>
+        <m:r>
+          <m:rPr>
+            <m:sty m:val="p"/>
+          </m:rPr>
+          <m:t>×</m:t>
+        </m:r>
+        <m:sSub>
+          <m:e>
+            <m:r>
+              <m:rPr>
+                <m:sty m:val="b"/>
+              </m:rPr>
+              <m:t>r</m:t>
+            </m:r>
+          </m:e>
+          <m:sub>
+            <m:r>
+              <m:t>O</m:t>
+            </m:r>
+            <m:r>
+              <m:t>P</m:t>
+            </m:r>
+          </m:sub>
+        </m:sSub>
+      </m:oMath>
+      <w:r>
+        <w:t xml:space="preserve"> </w:t>
+      </w:r>
+      <w:r>
+        <w:t xml:space="preserve">is consistent:</w:t>
+      </w:r>
+      <w:r>
+        <w:t xml:space="preserve"> </w:t>
+      </w:r>
+      <w:r>
+        <w:t xml:space="preserve">rad/s is treated as</w:t>
+      </w:r>
+      <w:r>
+        <w:t xml:space="preserve"> </w:t>
+      </w:r>
+      <m:oMath>
+        <m:r>
+          <m:t>1</m:t>
+        </m:r>
+        <m:r>
+          <m:rPr>
+            <m:sty m:val="p"/>
+          </m:rPr>
+          <m:t>/</m:t>
+        </m:r>
+        <m:r>
+          <m:t>s</m:t>
+        </m:r>
+      </m:oMath>
+      <w:r>
+        <w:t xml:space="preserve">, and multiplying by metres produces m/s.</w:t>
+      </w:r>
+    </w:p>
+    <w:bookmarkEnd w:id="58"/>
+    <w:bookmarkEnd w:id="59"/>
+    <w:bookmarkStart w:id="64" w:name="derivation-and-assumptions"/>
+    <w:p>
+      <w:pPr>
+        <w:pStyle w:val="Heading2"/>
+      </w:pPr>
+      <w:r>
+        <w:t xml:space="preserve">Derivation and Assumptions</w:t>
+      </w:r>
+    </w:p>
+    <w:bookmarkStart w:id="60" w:name="assumptions"/>
+    <w:p>
+      <w:pPr>
+        <w:pStyle w:val="Heading3"/>
+      </w:pPr>
+      <w:r>
+        <w:t xml:space="preserve">Assumptions</w:t>
+      </w:r>
+    </w:p>
+    <w:p>
+      <w:pPr>
+        <w:pStyle w:val="FirstParagraph"/>
+      </w:pPr>
+      <w:r>
+        <w:t xml:space="preserve">The calculation assumes Euclidean three-space, a right-handed orthonormal</w:t>
+      </w:r>
+      <w:r>
+        <w:t xml:space="preserve"> </w:t>
+      </w:r>
+      <w:r>
+        <w:t xml:space="preserve">target frame, finite floating-point inputs, and one instantaneous delivered</w:t>
+      </w:r>
+      <w:r>
+        <w:t xml:space="preserve"> </w:t>
+      </w:r>
+      <w:r>
+        <w:t xml:space="preserve">face normal. It treats the D-plane as geometry spanned by travel and face;</w:t>
+      </w:r>
+      <w:r>
+        <w:t xml:space="preserve"> </w:t>
+      </w:r>
+      <w:r>
+        <w:t xml:space="preserve">collision dynamics and aerodynamic response lie outside this method. Rate of</w:t>
+      </w:r>
+      <w:r>
+        <w:t xml:space="preserve"> </w:t>
+      </w:r>
+      <w:r>
+        <w:t xml:space="preserve">Closure assumes its interpolated homogeneous pose is rigid and its twist stores</w:t>
+      </w:r>
+      <w:r>
+        <w:t xml:space="preserve"> </w:t>
+      </w:r>
+      <w:r>
+        <w:t xml:space="preserve">angular components followed by translational components.</w:t>
+      </w:r>
+    </w:p>
+    <w:bookmarkEnd w:id="60"/>
+    <w:bookmarkStart w:id="63" w:name="derivation"/>
+    <w:p>
+      <w:pPr>
+        <w:pStyle w:val="Heading3"/>
+      </w:pPr>
+      <w:r>
+        <w:t xml:space="preserve">Derivation</w:t>
+      </w:r>
+    </w:p>
+    <w:p>
+      <w:pPr>
+        <w:pStyle w:val="FirstParagraph"/>
+      </w:pPr>
+      <w:r>
+        <w:t xml:space="preserve">Normalize travel and face as</w:t>
+      </w:r>
+      <w:r>
+        <w:t xml:space="preserve"> </w:t>
+      </w:r>
+      <m:oMath>
+        <m:acc>
+          <m:accPr>
+            <m:chr m:val="̂"/>
+          </m:accPr>
+          <m:e>
+            <m:r>
+              <m:rPr>
+                <m:sty m:val="b"/>
+              </m:rPr>
+              <m:t>v</m:t>
+            </m:r>
+          </m:e>
+        </m:acc>
+        <m:r>
+          <m:rPr>
+            <m:sty m:val="p"/>
+          </m:rPr>
+          <m:t>=</m:t>
+        </m:r>
+        <m:r>
+          <m:rPr>
+            <m:sty m:val="b"/>
+          </m:rPr>
+          <m:t>v</m:t>
+        </m:r>
+        <m:r>
+          <m:rPr>
+            <m:sty m:val="p"/>
+          </m:rPr>
+          <m:t>/</m:t>
+        </m:r>
+        <m:d>
+          <m:dPr>
+            <m:begChr m:val="‖"/>
+            <m:sepChr m:val=""/>
+            <m:endChr m:val="‖"/>
+            <m:grow/>
+          </m:dPr>
+          <m:e>
+            <m:r>
+              <m:rPr>
+                <m:sty m:val="b"/>
+              </m:rPr>
+              <m:t>v</m:t>
+            </m:r>
+          </m:e>
+        </m:d>
+      </m:oMath>
+      <w:r>
+        <w:t xml:space="preserve"> </w:t>
+      </w:r>
+      <w:r>
+        <w:t xml:space="preserve">and</w:t>
+      </w:r>
+      <w:r>
+        <w:t xml:space="preserve"> </w:t>
+      </w:r>
+      <m:oMath>
+        <m:acc>
+          <m:accPr>
+            <m:chr m:val="̂"/>
+          </m:accPr>
+          <m:e>
+            <m:r>
+              <m:rPr>
+                <m:sty m:val="b"/>
+              </m:rPr>
+              <m:t>n</m:t>
+            </m:r>
+          </m:e>
+        </m:acc>
+        <m:r>
+          <m:rPr>
+            <m:sty m:val="p"/>
+          </m:rPr>
+          <m:t>=</m:t>
+        </m:r>
+        <m:r>
+          <m:rPr>
+            <m:sty m:val="b"/>
+          </m:rPr>
+          <m:t>n</m:t>
+        </m:r>
+        <m:r>
+          <m:rPr>
+            <m:sty m:val="p"/>
+          </m:rPr>
+          <m:t>/</m:t>
+        </m:r>
+        <m:d>
+          <m:dPr>
+            <m:begChr m:val="‖"/>
+            <m:sepChr m:val=""/>
+            <m:endChr m:val="‖"/>
+            <m:grow/>
+          </m:dPr>
+          <m:e>
+            <m:r>
+              <m:rPr>
+                <m:sty m:val="b"/>
+              </m:rPr>
+              <m:t>n</m:t>
+            </m:r>
+          </m:e>
+        </m:d>
+      </m:oMath>
+      <w:r>
+        <w:t xml:space="preserve">. Their dot product is the</w:t>
+      </w:r>
+      <w:r>
+        <w:t xml:space="preserve"> </w:t>
+      </w:r>
+      <w:r>
+        <w:t xml:space="preserve">cosine of the included angle. Clipping protects</w:t>
+      </w:r>
+      <w:r>
+        <w:t xml:space="preserve"> </w:t>
+      </w:r>
+      <w:r>
+        <w:rPr>
+          <w:rStyle w:val="VerbatimChar"/>
+        </w:rPr>
+        <w:t xml:space="preserve">acos</w:t>
+      </w:r>
+      <w:r>
+        <w:t xml:space="preserve"> </w:t>
+      </w:r>
+      <w:r>
+        <w:t xml:space="preserve">from roundoff beyond</w:t>
+      </w:r>
+      <w:r>
+        <w:t xml:space="preserve"> </w:t>
+      </w:r>
+      <w:r>
+        <w:t xml:space="preserve">the mathematical interval.</w:t>
+      </w:r>
+    </w:p>
+    <w:p>
+      <w:pPr>
+        <w:pStyle w:val="BodyText"/>
+      </w:pPr>
+      <w:bookmarkStart w:id="61" w:name="dplane-spin-loft-equation"/>
+      <w:bookmarkEnd w:id="61"/>
+    </w:p>
+    <w:p>
+      <w:pPr>
+        <w:pStyle w:val="BodyText"/>
+      </w:pPr>
+      <m:oMathPara>
+        <m:oMathParaPr>
+          <m:jc m:val="center"/>
+        </m:oMathParaPr>
+        <m:oMath>
+          <m:r>
+            <m:t>λ</m:t>
+          </m:r>
+          <m:r>
+            <m:rPr>
+              <m:sty m:val="p"/>
+            </m:rPr>
+            <m:t>=</m:t>
+          </m:r>
+          <m:f>
+            <m:fPr>
+              <m:type m:val="bar"/>
+            </m:fPr>
+            <m:num>
+              <m:r>
+                <m:t>180</m:t>
+              </m:r>
+            </m:num>
+            <m:den>
+              <m:r>
+                <m:t>π</m:t>
+              </m:r>
+            </m:den>
+          </m:f>
+          <m:sSup>
+            <m:e>
+              <m:r>
+                <m:rPr>
+                  <m:sty m:val="p"/>
+                </m:rPr>
+                <m:t>cos</m:t>
+              </m:r>
+            </m:e>
+            <m:sup>
+              <m:r>
+                <m:rPr>
+                  <m:sty m:val="p"/>
+                </m:rPr>
+                <m:t>−</m:t>
+              </m:r>
+              <m:r>
+                <m:t>1</m:t>
+              </m:r>
+            </m:sup>
+          </m:sSup>
+          <m:r>
+            <m:t>​</m:t>
+          </m:r>
+          <m:d>
+            <m:dPr>
+              <m:begChr m:val="("/>
+              <m:sepChr m:val=""/>
+              <m:endChr m:val=")"/>
+              <m:grow/>
+            </m:dPr>
+            <m:e>
+              <m:r>
+                <m:rPr>
+                  <m:sty m:val="p"/>
+                </m:rPr>
+                <m:t>clip</m:t>
+              </m:r>
+              <m:r>
+                <m:rPr>
+                  <m:sty m:val="p"/>
+                </m:rPr>
+                <m:t>(</m:t>
+              </m:r>
+              <m:acc>
+                <m:accPr>
+                  <m:chr m:val="̂"/>
+                </m:accPr>
+                <m:e>
+                  <m:r>
+                    <m:rPr>
+                      <m:sty m:val="b"/>
+                    </m:rPr>
+                    <m:t>v</m:t>
+                  </m:r>
+                </m:e>
+              </m:acc>
+              <m:r>
+                <m:rPr>
+                  <m:sty m:val="p"/>
+                </m:rPr>
+                <m:t>⋅</m:t>
+              </m:r>
+              <m:acc>
+                <m:accPr>
+                  <m:chr m:val="̂"/>
+                </m:accPr>
+                <m:e>
+                  <m:r>
+                    <m:rPr>
+                      <m:sty m:val="b"/>
+                    </m:rPr>
+                    <m:t>n</m:t>
+                  </m:r>
+                </m:e>
+              </m:acc>
+              <m:r>
+                <m:rPr>
+                  <m:sty m:val="p"/>
+                </m:rPr>
+                <m:t>,</m:t>
+              </m:r>
+              <m:r>
+                <m:rPr>
+                  <m:sty m:val="p"/>
+                </m:rPr>
+                <m:t>−</m:t>
+              </m:r>
+              <m:r>
+                <m:t>1</m:t>
+              </m:r>
+              <m:r>
+                <m:rPr>
+                  <m:sty m:val="p"/>
+                </m:rPr>
+                <m:t>,</m:t>
+              </m:r>
+              <m:r>
+                <m:t>1</m:t>
+              </m:r>
+              <m:r>
+                <m:rPr>
+                  <m:sty m:val="p"/>
+                </m:rPr>
+                <m:t>)</m:t>
+              </m:r>
+            </m:e>
+          </m:d>
+          <m:r>
+            <m:rPr>
+              <m:sty m:val="p"/>
+            </m:rPr>
+            <m:t>.</m:t>
+          </m:r>
+        </m:oMath>
+      </m:oMathPara>
+    </w:p>
+    <w:p>
+      <w:pPr>
+        <w:pStyle w:val="FirstParagraph"/>
+      </w:pPr>
+      <w:r>
+        <w:t xml:space="preserve">When the vectors are not collinear, the oriented plane normal is</w:t>
+      </w:r>
+    </w:p>
+    <w:p>
+      <w:pPr>
+        <w:pStyle w:val="BodyText"/>
+      </w:pPr>
+      <w:bookmarkStart w:id="62" w:name="dplane-normal-equation"/>
+      <w:bookmarkEnd w:id="62"/>
+    </w:p>
+    <w:p>
+      <w:pPr>
+        <w:pStyle w:val="BodyText"/>
+      </w:pPr>
+      <m:oMathPara>
+        <m:oMathParaPr>
+          <m:jc m:val="center"/>
+        </m:oMathParaPr>
+        <m:oMath>
+          <m:acc>
+            <m:accPr>
+              <m:chr m:val="̂"/>
+            </m:accPr>
+            <m:e>
+              <m:r>
+                <m:rPr>
+                  <m:sty m:val="b"/>
+                </m:rPr>
+                <m:t>d</m:t>
+              </m:r>
+            </m:e>
+          </m:acc>
+          <m:r>
+            <m:rPr>
+              <m:sty m:val="p"/>
+            </m:rPr>
+            <m:t>=</m:t>
+          </m:r>
+          <m:f>
+            <m:fPr>
+              <m:type m:val="bar"/>
+            </m:fPr>
+            <m:num>
+              <m:acc>
+                <m:accPr>
+                  <m:chr m:val="̂"/>
+                </m:accPr>
+                <m:e>
+                  <m:r>
+                    <m:rPr>
+                      <m:sty m:val="b"/>
+                    </m:rPr>
+                    <m:t>v</m:t>
+                  </m:r>
+                </m:e>
+              </m:acc>
+              <m:r>
+                <m:rPr>
+                  <m:sty m:val="p"/>
+                </m:rPr>
+                <m:t>×</m:t>
+              </m:r>
+              <m:acc>
+                <m:accPr>
+                  <m:chr m:val="̂"/>
+                </m:accPr>
+                <m:e>
+                  <m:r>
+                    <m:rPr>
+                      <m:sty m:val="b"/>
+                    </m:rPr>
+                    <m:t>n</m:t>
+                  </m:r>
+                </m:e>
+              </m:acc>
+            </m:num>
+            <m:den>
+              <m:d>
+                <m:dPr>
+                  <m:begChr m:val="‖"/>
+                  <m:sepChr m:val=""/>
+                  <m:endChr m:val="‖"/>
+                  <m:grow/>
+                </m:dPr>
+                <m:e>
+                  <m:acc>
+                    <m:accPr>
+                      <m:chr m:val="̂"/>
+                    </m:accPr>
+                    <m:e>
+                      <m:r>
+                        <m:rPr>
+                          <m:sty m:val="b"/>
+                        </m:rPr>
+                        <m:t>v</m:t>
+                      </m:r>
+                    </m:e>
+                  </m:acc>
+                  <m:r>
+                    <m:rPr>
+                      <m:sty m:val="p"/>
+                    </m:rPr>
+                    <m:t>×</m:t>
+                  </m:r>
+                  <m:acc>
+                    <m:accPr>
+                      <m:chr m:val="̂"/>
+                    </m:accPr>
+                    <m:e>
+                      <m:r>
+                        <m:rPr>
+                          <m:sty m:val="b"/>
+                        </m:rPr>
+                        <m:t>n</m:t>
+                      </m:r>
+                    </m:e>
+                  </m:acc>
+                </m:e>
+              </m:d>
+            </m:den>
+          </m:f>
+          <m:r>
+            <m:rPr>
+              <m:sty m:val="p"/>
+            </m:rPr>
+            <m:t>.</m:t>
+          </m:r>
+        </m:oMath>
+      </m:oMathPara>
+    </w:p>
+    <w:p>
+      <w:pPr>
+        <w:pStyle w:val="FirstParagraph"/>
+      </w:pPr>
+      <w:r>
+        <w:t xml:space="preserve">For any direction</w:t>
+      </w:r>
+      <w:r>
+        <w:t xml:space="preserve"> </w:t>
+      </w:r>
+      <m:oMath>
+        <m:r>
+          <m:rPr>
+            <m:sty m:val="b"/>
+          </m:rPr>
+          <m:t>q</m:t>
+        </m:r>
+      </m:oMath>
+      <w:r>
+        <w:t xml:space="preserve">, remove its vertical component:</w:t>
+      </w:r>
+      <w:r>
+        <w:t xml:space="preserve"> </w:t>
+      </w:r>
+      <m:oMath>
+        <m:sSub>
+          <m:e>
+            <m:r>
+              <m:rPr>
+                <m:sty m:val="b"/>
+              </m:rPr>
+              <m:t>q</m:t>
+            </m:r>
+          </m:e>
+          <m:sub>
+            <m:r>
+              <m:t>h</m:t>
+            </m:r>
+          </m:sub>
+        </m:sSub>
+        <m:r>
+          <m:rPr>
+            <m:sty m:val="p"/>
+          </m:rPr>
+          <m:t>=</m:t>
+        </m:r>
+        <m:r>
+          <m:rPr>
+            <m:sty m:val="b"/>
+          </m:rPr>
+          <m:t>q</m:t>
+        </m:r>
+        <m:r>
+          <m:rPr>
+            <m:sty m:val="p"/>
+          </m:rPr>
+          <m:t>−</m:t>
+        </m:r>
+        <m:r>
+          <m:rPr>
+            <m:sty m:val="p"/>
+          </m:rPr>
+          <m:t>(</m:t>
+        </m:r>
+        <m:r>
+          <m:rPr>
+            <m:sty m:val="b"/>
+          </m:rPr>
+          <m:t>q</m:t>
+        </m:r>
+        <m:r>
+          <m:rPr>
+            <m:sty m:val="p"/>
+          </m:rPr>
+          <m:t>⋅</m:t>
+        </m:r>
+        <m:acc>
+          <m:accPr>
+            <m:chr m:val="̂"/>
+          </m:accPr>
+          <m:e>
+            <m:r>
+              <m:rPr>
+                <m:sty m:val="b"/>
+              </m:rPr>
+              <m:t>u</m:t>
+            </m:r>
+          </m:e>
+        </m:acc>
+        <m:r>
+          <m:rPr>
+            <m:sty m:val="p"/>
+          </m:rPr>
+          <m:t>)</m:t>
+        </m:r>
+        <m:acc>
+          <m:accPr>
+            <m:chr m:val="̂"/>
+          </m:accPr>
+          <m:e>
+            <m:r>
+              <m:rPr>
+                <m:sty m:val="b"/>
+              </m:rPr>
+              <m:t>u</m:t>
+            </m:r>
+          </m:e>
+        </m:acc>
+      </m:oMath>
+      <w:r>
+        <w:t xml:space="preserve">.</w:t>
+      </w:r>
+      <w:r>
+        <w:t xml:space="preserve"> </w:t>
+      </w:r>
+      <w:r>
+        <w:t xml:space="preserve">Heading and elevation are</w:t>
+      </w:r>
+      <w:r>
+        <w:t xml:space="preserve"> </w:t>
+      </w:r>
+      <m:oMath>
+        <m:r>
+          <m:rPr>
+            <m:sty m:val="p"/>
+          </m:rPr>
+          <m:t>atan2</m:t>
+        </m:r>
+        <m:r>
+          <m:rPr>
+            <m:sty m:val="p"/>
+          </m:rPr>
+          <m:t>(</m:t>
+        </m:r>
+        <m:sSub>
+          <m:e>
+            <m:r>
+              <m:rPr>
+                <m:sty m:val="b"/>
+              </m:rPr>
+              <m:t>q</m:t>
+            </m:r>
+          </m:e>
+          <m:sub>
+            <m:r>
+              <m:t>h</m:t>
+            </m:r>
+          </m:sub>
+        </m:sSub>
+        <m:r>
+          <m:rPr>
+            <m:sty m:val="p"/>
+          </m:rPr>
+          <m:t>⋅</m:t>
+        </m:r>
+        <m:acc>
+          <m:accPr>
+            <m:chr m:val="̂"/>
+          </m:accPr>
+          <m:e>
+            <m:r>
+              <m:rPr>
+                <m:sty m:val="b"/>
+              </m:rPr>
+              <m:t>r</m:t>
+            </m:r>
+          </m:e>
+        </m:acc>
+        <m:r>
+          <m:rPr>
+            <m:sty m:val="p"/>
+          </m:rPr>
+          <m:t>,</m:t>
+        </m:r>
+        <m:sSub>
+          <m:e>
+            <m:r>
+              <m:rPr>
+                <m:sty m:val="b"/>
+              </m:rPr>
+              <m:t>q</m:t>
+            </m:r>
+          </m:e>
+          <m:sub>
+            <m:r>
+              <m:t>h</m:t>
+            </m:r>
+          </m:sub>
+        </m:sSub>
+        <m:r>
+          <m:rPr>
+            <m:sty m:val="p"/>
+          </m:rPr>
+          <m:t>⋅</m:t>
+        </m:r>
+        <m:acc>
+          <m:accPr>
+            <m:chr m:val="̂"/>
+          </m:accPr>
+          <m:e>
+            <m:r>
+              <m:rPr>
+                <m:sty m:val="b"/>
+              </m:rPr>
+              <m:t>t</m:t>
+            </m:r>
+          </m:e>
+        </m:acc>
+        <m:r>
+          <m:rPr>
+            <m:sty m:val="p"/>
+          </m:rPr>
+          <m:t>)</m:t>
+        </m:r>
+      </m:oMath>
+      <w:r>
+        <w:t xml:space="preserve"> </w:t>
+      </w:r>
+      <w:r>
+        <w:t xml:space="preserve">and</w:t>
+      </w:r>
+      <w:r>
+        <w:t xml:space="preserve"> </w:t>
+      </w:r>
+      <m:oMath>
+        <m:r>
+          <m:rPr>
+            <m:sty m:val="p"/>
+          </m:rPr>
+          <m:t>atan2</m:t>
+        </m:r>
+        <m:r>
+          <m:rPr>
+            <m:sty m:val="p"/>
+          </m:rPr>
+          <m:t>(</m:t>
+        </m:r>
+        <m:r>
+          <m:rPr>
+            <m:sty m:val="b"/>
+          </m:rPr>
+          <m:t>q</m:t>
+        </m:r>
+        <m:r>
+          <m:rPr>
+            <m:sty m:val="p"/>
+          </m:rPr>
+          <m:t>⋅</m:t>
+        </m:r>
+        <m:acc>
+          <m:accPr>
+            <m:chr m:val="̂"/>
+          </m:accPr>
+          <m:e>
+            <m:r>
+              <m:rPr>
+                <m:sty m:val="b"/>
+              </m:rPr>
+              <m:t>u</m:t>
+            </m:r>
+          </m:e>
+        </m:acc>
+        <m:r>
+          <m:rPr>
+            <m:sty m:val="p"/>
+          </m:rPr>
+          <m:t>,</m:t>
+        </m:r>
+        <m:d>
+          <m:dPr>
+            <m:begChr m:val="‖"/>
+            <m:sepChr m:val=""/>
+            <m:endChr m:val="‖"/>
+            <m:grow/>
+          </m:dPr>
+          <m:e>
+            <m:sSub>
+              <m:e>
+                <m:r>
+                  <m:rPr>
+                    <m:sty m:val="b"/>
+                  </m:rPr>
+                  <m:t>q</m:t>
+                </m:r>
+              </m:e>
+              <m:sub>
+                <m:r>
+                  <m:t>h</m:t>
+                </m:r>
+              </m:sub>
+            </m:sSub>
+          </m:e>
+        </m:d>
+        <m:r>
+          <m:rPr>
+            <m:sty m:val="p"/>
+          </m:rPr>
+          <m:t>)</m:t>
+        </m:r>
+      </m:oMath>
+      <w:r>
+        <w:t xml:space="preserve">. Face-to-path wraps</w:t>
+      </w:r>
+      <w:r>
+        <w:t xml:space="preserve"> </w:t>
+      </w:r>
+      <m:oMath>
+        <m:r>
+          <m:t>f</m:t>
+        </m:r>
+        <m:r>
+          <m:rPr>
+            <m:sty m:val="p"/>
+          </m:rPr>
+          <m:t>−</m:t>
+        </m:r>
+        <m:r>
+          <m:t>p</m:t>
+        </m:r>
+      </m:oMath>
+      <w:r>
+        <w:t xml:space="preserve"> </w:t>
+      </w:r>
+      <w:r>
+        <w:t xml:space="preserve">to</w:t>
+      </w:r>
+      <w:r>
+        <w:t xml:space="preserve"> </w:t>
+      </w:r>
+      <m:oMath>
+        <m:r>
+          <m:rPr>
+            <m:sty m:val="p"/>
+          </m:rPr>
+          <m:t>[</m:t>
+        </m:r>
+        <m:r>
+          <m:rPr>
+            <m:sty m:val="p"/>
+          </m:rPr>
+          <m:t>−</m:t>
+        </m:r>
+        <m:r>
+          <m:t>180</m:t>
+        </m:r>
+        <m:r>
+          <m:rPr>
+            <m:sty m:val="p"/>
+          </m:rPr>
+          <m:t>,</m:t>
+        </m:r>
+        <m:r>
+          <m:t>180</m:t>
+        </m:r>
+        <m:r>
+          <m:rPr>
+            <m:sty m:val="p"/>
+          </m:rPr>
+          <m:t>)</m:t>
+        </m:r>
+      </m:oMath>
+      <w:r>
+        <w:t xml:space="preserve">.</w:t>
+      </w:r>
+      <w:r>
+        <w:t xml:space="preserve"> </w:t>
+      </w:r>
+      <w:r>
+        <w:t xml:space="preserve">Rate of Closure obtains face-center velocity from rigid-body kinematics before</w:t>
+      </w:r>
+      <w:r>
+        <w:t xml:space="preserve"> </w:t>
+      </w:r>
+      <w:r>
+        <w:t xml:space="preserve">applying the same geometry.</w:t>
+      </w:r>
+    </w:p>
+    <w:bookmarkEnd w:id="63"/>
+    <w:bookmarkEnd w:id="64"/>
+    <w:bookmarkStart w:id="68" w:name="algorithm"/>
+    <w:p>
+      <w:pPr>
+        <w:pStyle w:val="Heading2"/>
+      </w:pPr>
+      <w:r>
+        <w:t xml:space="preserve">Algorithm</w:t>
+      </w:r>
+    </w:p>
+    <w:bookmarkStart w:id="65" w:name="inputs"/>
+    <w:p>
+      <w:pPr>
+        <w:pStyle w:val="Heading3"/>
+      </w:pPr>
+      <w:r>
+        <w:t xml:space="preserve">Inputs</w:t>
+      </w:r>
+    </w:p>
+    <w:p>
+      <w:pPr>
+        <w:pStyle w:val="FirstParagraph"/>
+      </w:pPr>
+      <w:r>
+        <w:t xml:space="preserve">The standalone calculation consumes</w:t>
+      </w:r>
+      <w:r>
+        <w:t xml:space="preserve"> </w:t>
+      </w:r>
+      <w:r>
+        <w:rPr>
+          <w:rStyle w:val="VerbatimChar"/>
+        </w:rPr>
+        <w:t xml:space="preserve">travel_vector</w:t>
+      </w:r>
+      <w:r>
+        <w:t xml:space="preserve">,</w:t>
+      </w:r>
+      <w:r>
+        <w:t xml:space="preserve"> </w:t>
+      </w:r>
+      <w:r>
+        <w:rPr>
+          <w:rStyle w:val="VerbatimChar"/>
+        </w:rPr>
+        <w:t xml:space="preserve">face_normal</w:t>
+      </w:r>
+      <w:r>
+        <w:t xml:space="preserve">,</w:t>
+      </w:r>
+      <w:r>
+        <w:t xml:space="preserve"> </w:t>
+      </w:r>
+      <w:r>
+        <w:t xml:space="preserve">optional</w:t>
+      </w:r>
+      <w:r>
+        <w:t xml:space="preserve"> </w:t>
+      </w:r>
+      <w:r>
+        <w:rPr>
+          <w:rStyle w:val="VerbatimChar"/>
+        </w:rPr>
+        <w:t xml:space="preserve">target</w:t>
+      </w:r>
+      <w:r>
+        <w:t xml:space="preserve"> </w:t>
+      </w:r>
+      <w:r>
+        <w:t xml:space="preserve">and</w:t>
+      </w:r>
+      <w:r>
+        <w:t xml:space="preserve"> </w:t>
+      </w:r>
+      <w:r>
+        <w:rPr>
+          <w:rStyle w:val="VerbatimChar"/>
+        </w:rPr>
+        <w:t xml:space="preserve">up</w:t>
+      </w:r>
+      <w:r>
+        <w:t xml:space="preserve">, and descriptive</w:t>
+      </w:r>
+      <w:r>
+        <w:t xml:space="preserve"> </w:t>
+      </w:r>
+      <w:r>
+        <w:rPr>
+          <w:rStyle w:val="VerbatimChar"/>
+        </w:rPr>
+        <w:t xml:space="preserve">frame_id</w:t>
+      </w:r>
+      <w:r>
+        <w:t xml:space="preserve">. The consumer</w:t>
+      </w:r>
+      <w:r>
+        <w:t xml:space="preserve"> </w:t>
+      </w:r>
+      <w:r>
+        <w:t xml:space="preserve">accepts one immutable</w:t>
+      </w:r>
+      <w:r>
+        <w:t xml:space="preserve"> </w:t>
+      </w:r>
+      <w:r>
+        <w:rPr>
+          <w:rStyle w:val="VerbatimChar"/>
+        </w:rPr>
+        <w:t xml:space="preserve">SimulationRun</w:t>
+      </w:r>
+      <w:r>
+        <w:t xml:space="preserve"> </w:t>
+      </w:r>
+      <w:r>
+        <w:t xml:space="preserve">and derives inspection pose, twist,</w:t>
+      </w:r>
+      <w:r>
+        <w:t xml:space="preserve"> </w:t>
+      </w:r>
+      <w:r>
+        <w:t xml:space="preserve">shaft geometry, contact lever, face normal, leading-edge tangent, and arc</w:t>
+      </w:r>
+      <w:r>
+        <w:t xml:space="preserve"> </w:t>
+      </w:r>
+      <w:r>
+        <w:t xml:space="preserve">tangent rather than asking callers to assemble those values.</w:t>
+      </w:r>
+    </w:p>
+    <w:bookmarkEnd w:id="65"/>
+    <w:bookmarkStart w:id="66" w:name="procedure"/>
+    <w:p>
+      <w:pPr>
+        <w:pStyle w:val="Heading3"/>
+      </w:pPr>
+      <w:r>
+        <w:t xml:space="preserve">Procedure</w:t>
+      </w:r>
+    </w:p>
+    <w:p>
+      <w:pPr>
+        <w:pStyle w:val="Compact"/>
+        <w:numPr>
+          <w:ilvl w:val="0"/>
+          <w:numId w:val="1003"/>
+        </w:numPr>
+      </w:pPr>
+      <w:r>
+        <w:t xml:space="preserve">Convert each vector to a finite three-component array and validate the frame.</w:t>
+      </w:r>
+    </w:p>
+    <w:p>
+      <w:pPr>
+        <w:pStyle w:val="Compact"/>
+        <w:numPr>
+          <w:ilvl w:val="0"/>
+          <w:numId w:val="1003"/>
+        </w:numPr>
+      </w:pPr>
+      <w:r>
+        <w:t xml:space="preserve">Normalize face, target, and up; derive right from target-times-up.</w:t>
+      </w:r>
+    </w:p>
+    <w:p>
+      <w:pPr>
+        <w:pStyle w:val="Compact"/>
+        <w:numPr>
+          <w:ilvl w:val="0"/>
+          <w:numId w:val="1003"/>
+        </w:numPr>
+      </w:pPr>
+      <w:r>
+        <w:t xml:space="preserve">Compute face heading and dynamic loft even if travel is zero.</w:t>
+      </w:r>
+    </w:p>
+    <w:p>
+      <w:pPr>
+        <w:pStyle w:val="Compact"/>
+        <w:numPr>
+          <w:ilvl w:val="0"/>
+          <w:numId w:val="1003"/>
+        </w:numPr>
+      </w:pPr>
+      <w:r>
+        <w:t xml:space="preserve">Return</w:t>
+      </w:r>
+      <w:r>
+        <w:t xml:space="preserve"> </w:t>
+      </w:r>
+      <w:r>
+        <w:rPr>
+          <w:rStyle w:val="VerbatimChar"/>
+        </w:rPr>
+        <w:t xml:space="preserve">zero_travel</w:t>
+      </w:r>
+      <w:r>
+        <w:t xml:space="preserve"> </w:t>
+      </w:r>
+      <w:r>
+        <w:t xml:space="preserve">when travel norm is at most</w:t>
+      </w:r>
+      <w:r>
+        <w:t xml:space="preserve"> </w:t>
+      </w:r>
+      <m:oMath>
+        <m:sSup>
+          <m:e>
+            <m:r>
+              <m:t>10</m:t>
+            </m:r>
+          </m:e>
+          <m:sup>
+            <m:r>
+              <m:rPr>
+                <m:sty m:val="p"/>
+              </m:rPr>
+              <m:t>−</m:t>
+            </m:r>
+            <m:r>
+              <m:t>12</m:t>
+            </m:r>
+          </m:sup>
+        </m:sSup>
+      </m:oMath>
+      <w:r>
+        <w:t xml:space="preserve">.</w:t>
+      </w:r>
+    </w:p>
+    <w:p>
+      <w:pPr>
+        <w:pStyle w:val="Compact"/>
+        <w:numPr>
+          <w:ilvl w:val="0"/>
+          <w:numId w:val="1003"/>
+        </w:numPr>
+      </w:pPr>
+      <w:r>
+        <w:t xml:space="preserve">Normalize travel; compute path, attack, face-to-path, and spin loft.</w:t>
+      </w:r>
+    </w:p>
+    <w:p>
+      <w:pPr>
+        <w:pStyle w:val="Compact"/>
+        <w:numPr>
+          <w:ilvl w:val="0"/>
+          <w:numId w:val="1003"/>
+        </w:numPr>
+      </w:pPr>
+      <w:r>
+        <w:t xml:space="preserve">Return</w:t>
+      </w:r>
+      <w:r>
+        <w:t xml:space="preserve"> </w:t>
+      </w:r>
+      <w:r>
+        <w:rPr>
+          <w:rStyle w:val="VerbatimChar"/>
+        </w:rPr>
+        <w:t xml:space="preserve">parallel</w:t>
+      </w:r>
+      <w:r>
+        <w:t xml:space="preserve"> </w:t>
+      </w:r>
+      <w:r>
+        <w:t xml:space="preserve">or</w:t>
+      </w:r>
+      <w:r>
+        <w:t xml:space="preserve"> </w:t>
+      </w:r>
+      <w:r>
+        <w:rPr>
+          <w:rStyle w:val="VerbatimChar"/>
+        </w:rPr>
+        <w:t xml:space="preserve">antiparallel</w:t>
+      </w:r>
+      <w:r>
+        <w:t xml:space="preserve"> </w:t>
+      </w:r>
+      <w:r>
+        <w:t xml:space="preserve">for a singular cross product.</w:t>
+      </w:r>
+    </w:p>
+    <w:p>
+      <w:pPr>
+        <w:pStyle w:val="Compact"/>
+        <w:numPr>
+          <w:ilvl w:val="0"/>
+          <w:numId w:val="1003"/>
+        </w:numPr>
+      </w:pPr>
+      <w:r>
+        <w:t xml:space="preserve">Otherwise derive plane normal, tilt, inclination, and ground intersection.</w:t>
+      </w:r>
+    </w:p>
+    <w:p>
+      <w:pPr>
+        <w:pStyle w:val="Compact"/>
+        <w:numPr>
+          <w:ilvl w:val="0"/>
+          <w:numId w:val="1003"/>
+        </w:numPr>
+      </w:pPr>
+      <w:r>
+        <w:t xml:space="preserve">Rate of Closure repeats the calculation for reference, face center, and</w:t>
+      </w:r>
+      <w:r>
+        <w:t xml:space="preserve"> </w:t>
+      </w:r>
+      <w:r>
+        <w:t xml:space="preserve">contact so a consumer cannot silently confuse those datums.</w:t>
+      </w:r>
+    </w:p>
+    <w:p>
+      <w:pPr>
+        <w:pStyle w:val="FirstParagraph"/>
+      </w:pPr>
+      <w:r>
+        <w:t xml:space="preserve">Standalone work is constant time and memory. Sector rendering is linear in the</w:t>
+      </w:r>
+      <w:r>
+        <w:t xml:space="preserve"> </w:t>
+      </w:r>
+      <w:r>
+        <w:t xml:space="preserve">caller-bounded segment count and returns</w:t>
+      </w:r>
+      <w:r>
+        <w:t xml:space="preserve"> </w:t>
+      </w:r>
+      <w:r>
+        <w:rPr>
+          <w:rStyle w:val="VerbatimChar"/>
+        </w:rPr>
+        <w:t xml:space="preserve">segments + 1</w:t>
+      </w:r>
+      <w:r>
+        <w:t xml:space="preserve"> </w:t>
+      </w:r>
+      <w:r>
+        <w:t xml:space="preserve">unit directions.</w:t>
+      </w:r>
+    </w:p>
+    <w:bookmarkEnd w:id="66"/>
+    <w:bookmarkStart w:id="67" w:name="outputs"/>
+    <w:p>
+      <w:pPr>
+        <w:pStyle w:val="Heading3"/>
+      </w:pPr>
+      <w:r>
+        <w:t xml:space="preserve">Outputs</w:t>
+      </w:r>
+    </w:p>
+    <w:p>
+      <w:pPr>
+        <w:pStyle w:val="FirstParagraph"/>
+      </w:pPr>
+      <w:r>
+        <w:rPr>
+          <w:rStyle w:val="VerbatimChar"/>
+        </w:rPr>
+        <w:t xml:space="preserve">DPlaneAnalysis</w:t>
+      </w:r>
+      <w:r>
+        <w:t xml:space="preserve"> </w:t>
+      </w:r>
+      <w:r>
+        <w:t xml:space="preserve">returns status, frame, normalized basis vectors, optional</w:t>
+      </w:r>
+      <w:r>
+        <w:t xml:space="preserve"> </w:t>
+      </w:r>
+      <w:r>
+        <w:t xml:space="preserve">plane and ground-intersection directions, three-dimensional and planar spin</w:t>
+      </w:r>
+      <w:r>
+        <w:t xml:space="preserve"> </w:t>
+      </w:r>
+      <w:r>
+        <w:t xml:space="preserve">loft, residual, path, attack, face, dynamic loft, face-to-path, azimuth, tilt,</w:t>
+      </w:r>
+      <w:r>
+        <w:t xml:space="preserve"> </w:t>
+      </w:r>
+      <w:r>
+        <w:t xml:space="preserve">and inclination.</w:t>
+      </w:r>
+      <w:r>
+        <w:t xml:space="preserve"> </w:t>
+      </w:r>
+      <w:r>
+        <w:rPr>
+          <w:rStyle w:val="VerbatimChar"/>
+        </w:rPr>
+        <w:t xml:space="preserve">ImpactKinematicSnapshot</w:t>
+      </w:r>
+      <w:r>
+        <w:t xml:space="preserve"> </w:t>
+      </w:r>
+      <w:r>
+        <w:t xml:space="preserve">wraps three analyses with event,</w:t>
+      </w:r>
+      <w:r>
+        <w:t xml:space="preserve"> </w:t>
+      </w:r>
+      <w:r>
+        <w:t xml:space="preserve">geometry basis, limitations, pose, and wedge-kinematics evidence.</w:t>
+      </w:r>
+    </w:p>
+    <w:bookmarkEnd w:id="67"/>
+    <w:bookmarkEnd w:id="68"/>
+    <w:bookmarkStart w:id="71" w:name="implementation-symbols"/>
+    <w:p>
+      <w:pPr>
+        <w:pStyle w:val="Heading2"/>
+      </w:pPr>
+      <w:r>
+        <w:t xml:space="preserve">Implementation Symbols</w:t>
+      </w:r>
+    </w:p>
+    <w:bookmarkStart w:id="69" w:name="public-symbols"/>
+    <w:p>
+      <w:pPr>
+        <w:pStyle w:val="Heading3"/>
+      </w:pPr>
+      <w:r>
+        <w:t xml:space="preserve">Public Symbols</w:t>
+      </w:r>
+    </w:p>
+    <w:p>
+      <w:pPr>
+        <w:pStyle w:val="FirstParagraph"/>
+      </w:pPr>
+      <w:r>
+        <w:t xml:space="preserve">The stable</w:t>
+      </w:r>
+      <w:r>
+        <w:t xml:space="preserve"> </w:t>
+      </w:r>
+      <w:r>
+        <w:rPr>
+          <w:rStyle w:val="VerbatimChar"/>
+        </w:rPr>
+        <w:t xml:space="preserve">shared.python.swing_sim.impact</w:t>
+      </w:r>
+      <w:r>
+        <w:t xml:space="preserve"> </w:t>
+      </w:r>
+      <w:r>
+        <w:t xml:space="preserve">facade exports</w:t>
+      </w:r>
+      <w:r>
+        <w:t xml:space="preserve"> </w:t>
+      </w:r>
+      <w:r>
+        <w:rPr>
+          <w:rStyle w:val="VerbatimChar"/>
+        </w:rPr>
+        <w:t xml:space="preserve">DPlaneStatus</w:t>
+      </w:r>
+      <w:r>
+        <w:t xml:space="preserve">,</w:t>
+      </w:r>
+      <w:r>
+        <w:t xml:space="preserve"> </w:t>
+      </w:r>
+      <w:r>
+        <w:rPr>
+          <w:rStyle w:val="VerbatimChar"/>
+        </w:rPr>
+        <w:t xml:space="preserve">DPlaneAnalysis</w:t>
+      </w:r>
+      <w:r>
+        <w:t xml:space="preserve">,</w:t>
+      </w:r>
+      <w:r>
+        <w:t xml:space="preserve"> </w:t>
+      </w:r>
+      <w:r>
+        <w:rPr>
+          <w:rStyle w:val="VerbatimChar"/>
+        </w:rPr>
+        <w:t xml:space="preserve">analyze_dplane</w:t>
+      </w:r>
+      <w:r>
+        <w:t xml:space="preserve">, and</w:t>
+      </w:r>
+      <w:r>
+        <w:t xml:space="preserve"> </w:t>
+      </w:r>
+      <w:r>
+        <w:rPr>
+          <w:rStyle w:val="VerbatimChar"/>
+        </w:rPr>
+        <w:t xml:space="preserve">spin_loft_sector_directions</w:t>
+      </w:r>
+      <w:r>
+        <w:t xml:space="preserve">. Rate of Closure exports</w:t>
+      </w:r>
+      <w:r>
+        <w:t xml:space="preserve"> </w:t>
+      </w:r>
+      <w:r>
+        <w:rPr>
+          <w:rStyle w:val="VerbatimChar"/>
+        </w:rPr>
+        <w:t xml:space="preserve">ImpactKinematicSnapshot</w:t>
+      </w:r>
+      <w:r>
+        <w:t xml:space="preserve"> </w:t>
+      </w:r>
+      <w:r>
+        <w:t xml:space="preserve">and</w:t>
+      </w:r>
+      <w:r>
+        <w:t xml:space="preserve"> </w:t>
+      </w:r>
+      <w:r>
+        <w:rPr>
+          <w:rStyle w:val="VerbatimChar"/>
+        </w:rPr>
+        <w:t xml:space="preserve">impact_kinematics_for_run</w:t>
+      </w:r>
+      <w:r>
+        <w:t xml:space="preserve">. Consumers should</w:t>
+      </w:r>
+      <w:r>
+        <w:t xml:space="preserve"> </w:t>
+      </w:r>
+      <w:r>
+        <w:t xml:space="preserve">not import private helpers such as</w:t>
+      </w:r>
+      <w:r>
+        <w:t xml:space="preserve"> </w:t>
+      </w:r>
+      <w:r>
+        <w:rPr>
+          <w:rStyle w:val="VerbatimChar"/>
+        </w:rPr>
+        <w:t xml:space="preserve">_heading_deg</w:t>
+      </w:r>
+      <w:r>
+        <w:t xml:space="preserve"> </w:t>
+      </w:r>
+      <w:r>
+        <w:t xml:space="preserve">or</w:t>
+      </w:r>
+      <w:r>
+        <w:t xml:space="preserve"> </w:t>
+      </w:r>
+      <w:r>
+        <w:rPr>
+          <w:rStyle w:val="VerbatimChar"/>
+        </w:rPr>
+        <w:t xml:space="preserve">_shaft_geometry</w:t>
+      </w:r>
+      <w:r>
+        <w:t xml:space="preserve">.</w:t>
+      </w:r>
+    </w:p>
+    <w:bookmarkEnd w:id="69"/>
+    <w:bookmarkStart w:id="70" w:name="source-mapping"/>
+    <w:p>
+      <w:pPr>
+        <w:pStyle w:val="Heading3"/>
+      </w:pPr>
+      <w:r>
+        <w:t xml:space="preserve">Source Mapping</w:t>
+      </w:r>
+    </w:p>
+    <w:p>
+      <w:pPr>
+        <w:pStyle w:val="FirstParagraph"/>
+      </w:pPr>
+      <w:r>
+        <w:t xml:space="preserve">Calculation</w:t>
+      </w:r>
+      <w:r>
+        <w:t xml:space="preserve"> </w:t>
+      </w:r>
+      <w:r>
+        <w:rPr>
+          <w:rStyle w:val="VerbatimChar"/>
+        </w:rPr>
+        <w:t xml:space="preserve">TOOLS-DPLANE-GEOMETRY</w:t>
+      </w:r>
+      <w:r>
+        <w:t xml:space="preserve"> </w:t>
+      </w:r>
+      <w:r>
+        <w:t xml:space="preserve">maps spin loft, normal, heading,</w:t>
+      </w:r>
+      <w:r>
+        <w:t xml:space="preserve"> </w:t>
+      </w:r>
+      <w:r>
+        <w:t xml:space="preserve">elevation, singular states, and sectors to</w:t>
+      </w:r>
+      <w:r>
+        <w:t xml:space="preserve"> </w:t>
+      </w:r>
+      <w:r>
+        <w:rPr>
+          <w:rStyle w:val="VerbatimChar"/>
+        </w:rPr>
+        <w:t xml:space="preserve">src/shared/python/swing_sim/impact/dplane.py</w:t>
+      </w:r>
+      <w:r>
+        <w:t xml:space="preserve">. The Rate-of-Closure datum and</w:t>
+      </w:r>
+      <w:r>
+        <w:t xml:space="preserve"> </w:t>
+      </w:r>
+      <w:r>
+        <w:t xml:space="preserve">point-velocity mapping lives in</w:t>
+      </w:r>
+      <w:r>
+        <w:t xml:space="preserve"> </w:t>
+      </w:r>
+      <w:r>
+        <w:rPr>
+          <w:rStyle w:val="VerbatimChar"/>
+        </w:rPr>
+        <w:t xml:space="preserve">src/rate_of_closure/simulation/impact_kinematics.py</w:t>
+      </w:r>
+      <w:r>
+        <w:t xml:space="preserve">. Both are pinned to D3</w:t>
+      </w:r>
+      <w:r>
+        <w:t xml:space="preserve"> </w:t>
+      </w:r>
+      <w:r>
+        <w:t xml:space="preserve">base</w:t>
+      </w:r>
+      <w:r>
+        <w:t xml:space="preserve"> </w:t>
+      </w:r>
+      <w:r>
+        <w:rPr>
+          <w:rStyle w:val="VerbatimChar"/>
+        </w:rPr>
+        <w:t xml:space="preserve">916fb9f27f486486f0c071dcc6f15f81f68ecb18</w:t>
+      </w:r>
+      <w:r>
+        <w:t xml:space="preserve">; their provisional module</w:t>
+      </w:r>
+      <w:r>
+        <w:t xml:space="preserve"> </w:t>
+      </w:r>
+      <w:r>
+        <w:t xml:space="preserve">IDs and public symbols remain recorded in the module inventory.</w:t>
+      </w:r>
+    </w:p>
+    <w:bookmarkEnd w:id="70"/>
+    <w:bookmarkEnd w:id="71"/>
+    <w:bookmarkStart w:id="74" w:name="error-and-failure-semantics"/>
+    <w:p>
+      <w:pPr>
+        <w:pStyle w:val="Heading2"/>
+      </w:pPr>
+      <w:r>
+        <w:t xml:space="preserve">Error and Failure Semantics</w:t>
+      </w:r>
+    </w:p>
+    <w:bookmarkStart w:id="72" w:name="error-conditions"/>
+    <w:p>
+      <w:pPr>
+        <w:pStyle w:val="Heading3"/>
+      </w:pPr>
+      <w:r>
+        <w:t xml:space="preserve">Error Conditions</w:t>
+      </w:r>
+    </w:p>
+    <w:p>
+      <w:pPr>
+        <w:pStyle w:val="FirstParagraph"/>
+      </w:pPr>
+      <w:r>
+        <w:t xml:space="preserve">Wrong vector shape, non-finite values, zero face/target/up, or a nonorthogonal</w:t>
+      </w:r>
+      <w:r>
+        <w:t xml:space="preserve"> </w:t>
+      </w:r>
+      <w:r>
+        <w:t xml:space="preserve">frame raises</w:t>
+      </w:r>
+      <w:r>
+        <w:t xml:space="preserve"> </w:t>
+      </w:r>
+      <w:r>
+        <w:rPr>
+          <w:rStyle w:val="VerbatimChar"/>
+        </w:rPr>
+        <w:t xml:space="preserve">ValueError</w:t>
+      </w:r>
+      <w:r>
+        <w:t xml:space="preserve">. A non-</w:t>
+      </w:r>
+      <w:r>
+        <w:rPr>
+          <w:rStyle w:val="VerbatimChar"/>
+        </w:rPr>
+        <w:t xml:space="preserve">SimulationRun</w:t>
+      </w:r>
+      <w:r>
+        <w:t xml:space="preserve"> </w:t>
+      </w:r>
+      <w:r>
+        <w:t xml:space="preserve">input raises</w:t>
+      </w:r>
+      <w:r>
+        <w:t xml:space="preserve"> </w:t>
+      </w:r>
+      <w:r>
+        <w:rPr>
+          <w:rStyle w:val="VerbatimChar"/>
+        </w:rPr>
+        <w:t xml:space="preserve">TypeError</w:t>
+      </w:r>
+      <w:r>
+        <w:t xml:space="preserve">.</w:t>
+      </w:r>
+      <w:r>
+        <w:t xml:space="preserve"> </w:t>
+      </w:r>
+      <w:r>
+        <w:t xml:space="preserve">Nonincreasing times, zero shaft geometry, zero path fallback, or degenerate</w:t>
+      </w:r>
+      <w:r>
+        <w:t xml:space="preserve"> </w:t>
+      </w:r>
+      <w:r>
+        <w:t xml:space="preserve">projected leading edge also fail preconditions. These failures are distinct</w:t>
+      </w:r>
+      <w:r>
+        <w:t xml:space="preserve"> </w:t>
+      </w:r>
+      <w:r>
+        <w:t xml:space="preserve">from valid singular geometry.</w:t>
+      </w:r>
+    </w:p>
+    <w:bookmarkEnd w:id="72"/>
+    <w:bookmarkStart w:id="73" w:name="recovery-and-cancellation"/>
+    <w:p>
+      <w:pPr>
+        <w:pStyle w:val="Heading3"/>
+      </w:pPr>
+      <w:r>
+        <w:t xml:space="preserve">Recovery and Cancellation</w:t>
+      </w:r>
+    </w:p>
+    <w:p>
+      <w:pPr>
+        <w:pStyle w:val="FirstParagraph"/>
+      </w:pPr>
+      <w:r>
+        <w:t xml:space="preserve">Callers recover by correcting source data or frame; the method does not coerce,</w:t>
+      </w:r>
+      <w:r>
+        <w:t xml:space="preserve"> </w:t>
+      </w:r>
+      <w:r>
+        <w:t xml:space="preserve">interpolate missing vectors, or substitute a default. Valid singular statuses</w:t>
+      </w:r>
+      <w:r>
+        <w:t xml:space="preserve"> </w:t>
+      </w:r>
+      <w:r>
+        <w:t xml:space="preserve">may be displayed with null fields intact. The synchronous calculation is</w:t>
+      </w:r>
+      <w:r>
+        <w:t xml:space="preserve"> </w:t>
+      </w:r>
+      <w:r>
+        <w:t xml:space="preserve">bounded and has no external I/O, so it has no mid-operation cancellation seam.</w:t>
+      </w:r>
+      <w:r>
+        <w:t xml:space="preserve"> </w:t>
+      </w:r>
+      <w:r>
+        <w:t xml:space="preserve">Higher-level cancellation occurs before calls or between complete runs.</w:t>
+      </w:r>
+    </w:p>
+    <w:bookmarkEnd w:id="73"/>
+    <w:bookmarkEnd w:id="74"/>
+    <w:bookmarkStart w:id="77" w:name="uncertainty-and-sensitivity"/>
+    <w:p>
+      <w:pPr>
+        <w:pStyle w:val="Heading2"/>
+      </w:pPr>
+      <w:r>
+        <w:t xml:space="preserve">Uncertainty and Sensitivity</w:t>
+      </w:r>
+    </w:p>
+    <w:bookmarkStart w:id="75" w:name="uncertainty-sources"/>
+    <w:p>
+      <w:pPr>
+        <w:pStyle w:val="Heading3"/>
+      </w:pPr>
+      <w:r>
+        <w:t xml:space="preserve">Uncertainty Sources</w:t>
+      </w:r>
+    </w:p>
+    <w:p>
+      <w:pPr>
+        <w:pStyle w:val="FirstParagraph"/>
+      </w:pPr>
+      <w:r>
+        <w:t xml:space="preserve">The implementation does not estimate covariance. Uncertainty can enter through</w:t>
+      </w:r>
+      <w:r>
+        <w:t xml:space="preserve"> </w:t>
+      </w:r>
+      <w:r>
+        <w:t xml:space="preserve">travel, face orientation, coordinate transform, event interpolation, club</w:t>
+      </w:r>
+      <w:r>
+        <w:t xml:space="preserve"> </w:t>
+      </w:r>
+      <w:r>
+        <w:t xml:space="preserve">geometry, or the choice of reference versus contact datum. Floating-point</w:t>
+      </w:r>
+      <w:r>
+        <w:t xml:space="preserve"> </w:t>
+      </w:r>
+      <w:r>
+        <w:t xml:space="preserve">clipping addresses numerical roundoff only; it is not a measurement uncertainty</w:t>
+      </w:r>
+      <w:r>
+        <w:t xml:space="preserve"> </w:t>
+      </w:r>
+      <w:r>
+        <w:t xml:space="preserve">model. Angles therefore remain model-conditioned rather than observed truth.</w:t>
+      </w:r>
+    </w:p>
+    <w:bookmarkEnd w:id="75"/>
+    <w:bookmarkStart w:id="76" w:name="sensitivity"/>
+    <w:p>
+      <w:pPr>
+        <w:pStyle w:val="Heading3"/>
+      </w:pPr>
+      <w:r>
+        <w:t xml:space="preserve">Sensitivity</w:t>
+      </w:r>
+    </w:p>
+    <w:p>
+      <w:pPr>
+        <w:pStyle w:val="FirstParagraph"/>
+      </w:pPr>
+      <w:r>
+        <w:t xml:space="preserve">Small perturbations are smooth away from singular states. Sensitivity rises</w:t>
+      </w:r>
+      <w:r>
+        <w:t xml:space="preserve"> </w:t>
+      </w:r>
+      <w:r>
+        <w:t xml:space="preserve">when horizontal projection approaches zero because heading becomes undefined,</w:t>
+      </w:r>
+      <w:r>
+        <w:t xml:space="preserve"> </w:t>
+      </w:r>
+      <w:r>
+        <w:t xml:space="preserve">and when travel and face approach parallel or antiparallel because a small cross</w:t>
+      </w:r>
+      <w:r>
+        <w:t xml:space="preserve"> </w:t>
+      </w:r>
+      <w:r>
+        <w:t xml:space="preserve">product cannot define a stable normal. The API exposes these limits as null or</w:t>
+      </w:r>
+      <w:r>
+        <w:t xml:space="preserve"> </w:t>
+      </w:r>
+      <w:r>
+        <w:t xml:space="preserve">typed status; downstream code must not carry forward a prior frame’s plane.</w:t>
+      </w:r>
+    </w:p>
+    <w:bookmarkEnd w:id="76"/>
+    <w:bookmarkEnd w:id="77"/>
+    <w:bookmarkStart w:id="80" w:name="verification-and-validation"/>
+    <w:p>
+      <w:pPr>
+        <w:pStyle w:val="Heading2"/>
+      </w:pPr>
+      <w:r>
+        <w:t xml:space="preserve">Verification and Validation</w:t>
+      </w:r>
+    </w:p>
+    <w:bookmarkStart w:id="78" w:name="test-evidence"/>
+    <w:p>
+      <w:pPr>
+        <w:pStyle w:val="Heading3"/>
+      </w:pPr>
+      <w:r>
+        <w:t xml:space="preserve">Test Evidence</w:t>
+      </w:r>
+    </w:p>
+    <w:p>
+      <w:pPr>
+        <w:pStyle w:val="FirstParagraph"/>
+      </w:pPr>
+      <w:r>
+        <w:rPr>
+          <w:rStyle w:val="VerbatimChar"/>
+        </w:rPr>
+        <w:t xml:space="preserve">test_matches_cross_client_golden_contract</w:t>
+      </w:r>
+      <w:r>
+        <w:t xml:space="preserve"> </w:t>
+      </w:r>
+      <w:r>
+        <w:t xml:space="preserve">executes three analytical cases</w:t>
+      </w:r>
+      <w:r>
+        <w:t xml:space="preserve"> </w:t>
+      </w:r>
+      <w:r>
+        <w:t xml:space="preserve">from</w:t>
+      </w:r>
+      <w:r>
+        <w:t xml:space="preserve"> </w:t>
+      </w:r>
+      <w:r>
+        <w:rPr>
+          <w:rStyle w:val="VerbatimChar"/>
+        </w:rPr>
+        <w:t xml:space="preserve">dplane_golden_v1.json</w:t>
+      </w:r>
+      <w:r>
+        <w:t xml:space="preserve"> </w:t>
+      </w:r>
+      <w:r>
+        <w:t xml:space="preserve">at absolute tolerance</w:t>
+      </w:r>
+      <w:r>
+        <w:t xml:space="preserve"> </w:t>
+      </w:r>
+      <m:oMath>
+        <m:sSup>
+          <m:e>
+            <m:r>
+              <m:t>10</m:t>
+            </m:r>
+          </m:e>
+          <m:sup>
+            <m:r>
+              <m:rPr>
+                <m:sty m:val="p"/>
+              </m:rPr>
+              <m:t>−</m:t>
+            </m:r>
+            <m:r>
+              <m:t>9</m:t>
+            </m:r>
+          </m:sup>
+        </m:sSup>
+      </m:oMath>
+      <w:r>
+        <w:t xml:space="preserve"> </w:t>
+      </w:r>
+      <w:r>
+        <w:t xml:space="preserve">degree.</w:t>
+      </w:r>
+      <w:r>
+        <w:t xml:space="preserve"> </w:t>
+      </w:r>
+      <w:r>
+        <w:t xml:space="preserve">Singular-state tests cover zero travel, parallel, antiparallel, vertical</w:t>
+      </w:r>
+      <w:r>
+        <w:t xml:space="preserve"> </w:t>
+      </w:r>
+      <w:r>
+        <w:t xml:space="preserve">projection, and invalid frames. Rotation and reflection tests pin invariants.</w:t>
+      </w:r>
+      <w:r>
+        <w:t xml:space="preserve"> </w:t>
+      </w:r>
+      <w:r>
+        <w:t xml:space="preserve">The Rate-of-Closure integration test derives face-center velocity independently</w:t>
+      </w:r>
+      <w:r>
+        <w:t xml:space="preserve"> </w:t>
+      </w:r>
+      <w:r>
+        <w:t xml:space="preserve">as</w:t>
+      </w:r>
+      <w:r>
+        <w:t xml:space="preserve"> </w:t>
+      </w:r>
+      <m:oMath>
+        <m:sSub>
+          <m:e>
+            <m:r>
+              <m:rPr>
+                <m:sty m:val="b"/>
+              </m:rPr>
+              <m:t>v</m:t>
+            </m:r>
+          </m:e>
+          <m:sub>
+            <m:r>
+              <m:t>O</m:t>
+            </m:r>
+          </m:sub>
+        </m:sSub>
+        <m:r>
+          <m:rPr>
+            <m:sty m:val="p"/>
+          </m:rPr>
+          <m:t>+</m:t>
+        </m:r>
+        <m:r>
+          <m:rPr>
+            <m:sty m:val="b"/>
+          </m:rPr>
+          <m:t>ω</m:t>
+        </m:r>
+        <m:r>
+          <m:rPr>
+            <m:sty m:val="p"/>
+          </m:rPr>
+          <m:t>×</m:t>
+        </m:r>
+        <m:r>
+          <m:rPr>
+            <m:sty m:val="b"/>
+          </m:rPr>
+          <m:t>r</m:t>
+        </m:r>
+      </m:oMath>
+      <w:r>
+        <w:t xml:space="preserve">, then proves the consumer</w:t>
+      </w:r>
+      <w:r>
+        <w:t xml:space="preserve"> </w:t>
+      </w:r>
+      <w:r>
+        <w:t xml:space="preserve">normalizes that value for its face-center D-plane.</w:t>
+      </w:r>
+    </w:p>
+    <w:bookmarkEnd w:id="78"/>
+    <w:bookmarkStart w:id="79" w:name="acceptance-criteria"/>
+    <w:p>
+      <w:pPr>
+        <w:pStyle w:val="Heading3"/>
+      </w:pPr>
+      <w:r>
+        <w:t xml:space="preserve">Acceptance Criteria</w:t>
+      </w:r>
+    </w:p>
+    <w:p>
+      <w:pPr>
+        <w:pStyle w:val="FirstParagraph"/>
+      </w:pPr>
+      <w:r>
+        <w:t xml:space="preserve">The exemplar passes only when strict JSON Schema and typed loader agree;</w:t>
+      </w:r>
+      <w:r>
+        <w:t xml:space="preserve"> </w:t>
+      </w:r>
+      <w:r>
+        <w:t xml:space="preserve">calculation, chapter, module, source, consumer, test, and golden-fixture links</w:t>
+      </w:r>
+      <w:r>
+        <w:t xml:space="preserve"> </w:t>
+      </w:r>
+      <w:r>
+        <w:t xml:space="preserve">all resolve; the fourteen-section linter and focused tests pass; and HTML,</w:t>
+      </w:r>
+      <w:r>
+        <w:t xml:space="preserve"> </w:t>
+      </w:r>
+      <w:r>
+        <w:t xml:space="preserve">LaTeX, PDF, and DOCX share the governed semantic digest. This evidence verifies</w:t>
+      </w:r>
+      <w:r>
+        <w:t xml:space="preserve"> </w:t>
+      </w:r>
+      <w:r>
+        <w:t xml:space="preserve">reproduction, not scientific or publication approval.</w:t>
+      </w:r>
+    </w:p>
+    <w:bookmarkEnd w:id="79"/>
+    <w:bookmarkEnd w:id="80"/>
+    <w:bookmarkStart w:id="83" w:name="limits-and-applicability"/>
+    <w:p>
+      <w:pPr>
+        <w:pStyle w:val="Heading2"/>
+      </w:pPr>
+      <w:r>
+        <w:t xml:space="preserve">Limits and Applicability</w:t>
+      </w:r>
+    </w:p>
+    <w:bookmarkStart w:id="81" w:name="validity-range"/>
+    <w:p>
+      <w:pPr>
+        <w:pStyle w:val="Heading3"/>
+      </w:pPr>
+      <w:r>
+        <w:t xml:space="preserve">Validity Range</w:t>
+      </w:r>
+    </w:p>
+    <w:p>
+      <w:pPr>
+        <w:pStyle w:val="FirstParagraph"/>
+      </w:pPr>
+      <w:r>
+        <w:t xml:space="preserve">Finite vectors may have any representable scale, but face and frame axes must</w:t>
+      </w:r>
+      <w:r>
+        <w:t xml:space="preserve"> </w:t>
+      </w:r>
+      <w:r>
+        <w:t xml:space="preserve">exceed norm</w:t>
+      </w:r>
+      <w:r>
+        <w:t xml:space="preserve"> </w:t>
+      </w:r>
+      <m:oMath>
+        <m:sSup>
+          <m:e>
+            <m:r>
+              <m:t>10</m:t>
+            </m:r>
+          </m:e>
+          <m:sup>
+            <m:r>
+              <m:rPr>
+                <m:sty m:val="p"/>
+              </m:rPr>
+              <m:t>−</m:t>
+            </m:r>
+            <m:r>
+              <m:t>12</m:t>
+            </m:r>
+          </m:sup>
+        </m:sSup>
+      </m:oMath>
+      <w:r>
+        <w:t xml:space="preserve">, and target/up orthogonality must satisfy</w:t>
+      </w:r>
+      <w:r>
+        <w:t xml:space="preserve"> </w:t>
+      </w:r>
+      <m:oMath>
+        <m:sSup>
+          <m:e>
+            <m:r>
+              <m:t>10</m:t>
+            </m:r>
+          </m:e>
+          <m:sup>
+            <m:r>
+              <m:rPr>
+                <m:sty m:val="p"/>
+              </m:rPr>
+              <m:t>−</m:t>
+            </m:r>
+            <m:r>
+              <m:t>10</m:t>
+            </m:r>
+          </m:sup>
+        </m:sSup>
+      </m:oMath>
+      <w:r>
+        <w:t xml:space="preserve">.</w:t>
+      </w:r>
+      <w:r>
+        <w:t xml:space="preserve"> </w:t>
+      </w:r>
+      <w:r>
+        <w:t xml:space="preserve">Spin loft spans</w:t>
+      </w:r>
+      <w:r>
+        <w:t xml:space="preserve"> </w:t>
+      </w:r>
+      <m:oMath>
+        <m:r>
+          <m:t>0</m:t>
+        </m:r>
+      </m:oMath>
+      <w:r>
+        <w:t xml:space="preserve"> </w:t>
+      </w:r>
+      <w:r>
+        <w:t xml:space="preserve">through</w:t>
+      </w:r>
+      <w:r>
+        <w:t xml:space="preserve"> </w:t>
+      </w:r>
+      <m:oMath>
+        <m:r>
+          <m:t>180</m:t>
+        </m:r>
+      </m:oMath>
+      <w:r>
+        <w:t xml:space="preserve"> </w:t>
+      </w:r>
+      <w:r>
+        <w:t xml:space="preserve">degrees. Signed relationships wrap to</w:t>
+      </w:r>
+      <w:r>
+        <w:t xml:space="preserve"> </w:t>
+      </w:r>
+      <m:oMath>
+        <m:r>
+          <m:rPr>
+            <m:sty m:val="p"/>
+          </m:rPr>
+          <m:t>[</m:t>
+        </m:r>
+        <m:r>
+          <m:rPr>
+            <m:sty m:val="p"/>
+          </m:rPr>
+          <m:t>−</m:t>
+        </m:r>
+        <m:r>
+          <m:t>180</m:t>
+        </m:r>
+        <m:r>
+          <m:rPr>
+            <m:sty m:val="p"/>
+          </m:rPr>
+          <m:t>,</m:t>
+        </m:r>
+        <m:r>
+          <m:t>180</m:t>
+        </m:r>
+        <m:r>
+          <m:rPr>
+            <m:sty m:val="p"/>
+          </m:rPr>
+          <m:t>)</m:t>
+        </m:r>
+      </m:oMath>
+      <w:r>
+        <w:t xml:space="preserve">. The golden fixture qualifies only its declared cases and</w:t>
+      </w:r>
+      <w:r>
+        <w:t xml:space="preserve"> </w:t>
+      </w:r>
+      <m:oMath>
+        <m:sSup>
+          <m:e>
+            <m:r>
+              <m:t>10</m:t>
+            </m:r>
+          </m:e>
+          <m:sup>
+            <m:r>
+              <m:rPr>
+                <m:sty m:val="p"/>
+              </m:rPr>
+              <m:t>−</m:t>
+            </m:r>
+            <m:r>
+              <m:t>9</m:t>
+            </m:r>
+          </m:sup>
+        </m:sSup>
+      </m:oMath>
+      <w:r>
+        <w:t xml:space="preserve">-degree tolerance.</w:t>
+      </w:r>
+    </w:p>
+    <w:bookmarkEnd w:id="81"/>
+    <w:bookmarkStart w:id="82" w:name="known-limitations"/>
+    <w:p>
+      <w:pPr>
+        <w:pStyle w:val="Heading3"/>
+      </w:pPr>
+      <w:r>
+        <w:t xml:space="preserve">Known Limitations</w:t>
+      </w:r>
+    </w:p>
+    <w:p>
+      <w:pPr>
+        <w:pStyle w:val="FirstParagraph"/>
+      </w:pPr>
+      <w:r>
+        <w:t xml:space="preserve">The method does not compute ball response, impulse, spin rate, lift, drag,</w:t>
+      </w:r>
+      <w:r>
+        <w:t xml:space="preserve"> </w:t>
+      </w:r>
+      <w:r>
+        <w:t xml:space="preserve">landing, biomechanics, or camera-derived pose. It does not establish that an</w:t>
+      </w:r>
+      <w:r>
+        <w:t xml:space="preserve"> </w:t>
+      </w:r>
+      <w:r>
+        <w:t xml:space="preserve">external device’s axes, timestamps, or face normal match this contract. Rate of</w:t>
+      </w:r>
+      <w:r>
+        <w:t xml:space="preserve"> </w:t>
+      </w:r>
+      <w:r>
+        <w:t xml:space="preserve">Closure downstream flight currently consumes reference-point translation;</w:t>
+      </w:r>
+      <w:r>
+        <w:t xml:space="preserve"> </w:t>
+      </w:r>
+      <w:r>
+        <w:t xml:space="preserve">shaft-induced contact velocity remains analysis. The markerless-mocap exemplar</w:t>
+      </w:r>
+      <w:r>
+        <w:t xml:space="preserve"> </w:t>
+      </w:r>
+      <w:r>
+        <w:t xml:space="preserve">is deliberately absent because TOOLS-M0 issue #4708 and PR #4734 are open and</w:t>
+      </w:r>
+      <w:r>
+        <w:t xml:space="preserve"> </w:t>
+      </w:r>
+      <w:r>
+        <w:t xml:space="preserve">no markerless module exists on this D3 base. Unmerged content is not promoted.</w:t>
+      </w:r>
+    </w:p>
+    <w:bookmarkEnd w:id="82"/>
+    <w:bookmarkEnd w:id="83"/>
+    <w:bookmarkStart w:id="86" w:name="worked-examples"/>
+    <w:p>
+      <w:pPr>
+        <w:pStyle w:val="Heading2"/>
+      </w:pPr>
+      <w:r>
+        <w:t xml:space="preserve">Worked Examples</w:t>
+      </w:r>
+    </w:p>
+    <w:bookmarkStart w:id="84" w:name="example-inputs"/>
+    <w:p>
+      <w:pPr>
+        <w:pStyle w:val="Heading3"/>
+      </w:pPr>
+      <w:r>
+        <w:t xml:space="preserve">Example Inputs</w:t>
+      </w:r>
+    </w:p>
+    <w:p>
+      <w:pPr>
+        <w:pStyle w:val="FirstParagraph"/>
+      </w:pPr>
+      <w:r>
+        <w:t xml:space="preserve">The governed</w:t>
+      </w:r>
+      <w:r>
+        <w:t xml:space="preserve"> </w:t>
+      </w:r>
+      <w:r>
+        <w:rPr>
+          <w:rStyle w:val="VerbatimChar"/>
+        </w:rPr>
+        <w:t xml:space="preserve">square-descending</w:t>
+      </w:r>
+      <w:r>
+        <w:t xml:space="preserve"> </w:t>
+      </w:r>
+      <w:r>
+        <w:t xml:space="preserve">fixture supplies</w:t>
+      </w:r>
+      <w:r>
+        <w:t xml:space="preserve"> </w:t>
+      </w:r>
+      <m:oMath>
+        <m:r>
+          <m:rPr>
+            <m:sty m:val="b"/>
+          </m:rPr>
+          <m:t>v</m:t>
+        </m:r>
+        <m:r>
+          <m:rPr>
+            <m:sty m:val="p"/>
+          </m:rPr>
+          <m:t>=</m:t>
+        </m:r>
+        <m:r>
+          <m:rPr>
+            <m:sty m:val="p"/>
+          </m:rPr>
+          <m:t>(</m:t>
+        </m:r>
+        <m:r>
+          <m:t>0.9986295347545738</m:t>
+        </m:r>
+        <m:r>
+          <m:rPr>
+            <m:sty m:val="p"/>
+          </m:rPr>
+          <m:t>,</m:t>
+        </m:r>
+        <m:r>
+          <m:rPr>
+            <m:sty m:val="p"/>
+          </m:rPr>
+          <m:t>−</m:t>
+        </m:r>
+        <m:r>
+          <m:t>0.052335956242943835</m:t>
+        </m:r>
+        <m:r>
+          <m:rPr>
+            <m:sty m:val="p"/>
+          </m:rPr>
+          <m:t>,</m:t>
+        </m:r>
+        <m:r>
+          <m:t>0</m:t>
+        </m:r>
+        <m:r>
+          <m:rPr>
+            <m:sty m:val="p"/>
+          </m:rPr>
+          <m:t>)</m:t>
+        </m:r>
+      </m:oMath>
+      <w:r>
+        <w:t xml:space="preserve">, with path</w:t>
+      </w:r>
+      <w:r>
+        <w:t xml:space="preserve"> </w:t>
+      </w:r>
+      <m:oMath>
+        <m:sSup>
+          <m:e>
+            <m:r>
+              <m:t>0</m:t>
+            </m:r>
+          </m:e>
+          <m:sup>
+            <m:r>
+              <m:rPr>
+                <m:sty m:val="p"/>
+              </m:rPr>
+              <m:t>∘</m:t>
+            </m:r>
+          </m:sup>
+        </m:sSup>
+      </m:oMath>
+      <w:r>
+        <w:t xml:space="preserve"> </w:t>
+      </w:r>
+      <w:r>
+        <w:t xml:space="preserve">and attack</w:t>
+      </w:r>
+      <w:r>
+        <w:t xml:space="preserve"> </w:t>
+      </w:r>
+      <m:oMath>
+        <m:r>
+          <m:rPr>
+            <m:sty m:val="p"/>
+          </m:rPr>
+          <m:t>−</m:t>
+        </m:r>
+        <m:sSup>
+          <m:e>
+            <m:r>
+              <m:t>3</m:t>
+            </m:r>
+          </m:e>
+          <m:sup>
+            <m:r>
+              <m:rPr>
+                <m:sty m:val="p"/>
+              </m:rPr>
+              <m:t>∘</m:t>
+            </m:r>
+          </m:sup>
+        </m:sSup>
+      </m:oMath>
+      <w:r>
+        <w:t xml:space="preserve">. Its face normal is</w:t>
+      </w:r>
+      <w:r>
+        <w:t xml:space="preserve"> </w:t>
+      </w:r>
+      <m:oMath>
+        <m:r>
+          <m:rPr>
+            <m:sty m:val="b"/>
+          </m:rPr>
+          <m:t>n</m:t>
+        </m:r>
+        <m:r>
+          <m:rPr>
+            <m:sty m:val="p"/>
+          </m:rPr>
+          <m:t>=</m:t>
+        </m:r>
+        <m:r>
+          <m:rPr>
+            <m:sty m:val="p"/>
+          </m:rPr>
+          <m:t>(</m:t>
+        </m:r>
+        <m:r>
+          <m:t>0.9781476007338057</m:t>
+        </m:r>
+        <m:r>
+          <m:rPr>
+            <m:sty m:val="p"/>
+          </m:rPr>
+          <m:t>,</m:t>
+        </m:r>
+        <m:r>
+          <m:t>0.20791169081775934</m:t>
+        </m:r>
+        <m:r>
+          <m:rPr>
+            <m:sty m:val="p"/>
+          </m:rPr>
+          <m:t>,</m:t>
+        </m:r>
+        <m:r>
+          <m:t>0</m:t>
+        </m:r>
+        <m:r>
+          <m:rPr>
+            <m:sty m:val="p"/>
+          </m:rPr>
+          <m:t>)</m:t>
+        </m:r>
+      </m:oMath>
+      <w:r>
+        <w:t xml:space="preserve">, with face</w:t>
+      </w:r>
+      <w:r>
+        <w:t xml:space="preserve"> </w:t>
+      </w:r>
+      <m:oMath>
+        <m:sSup>
+          <m:e>
+            <m:r>
+              <m:t>0</m:t>
+            </m:r>
+          </m:e>
+          <m:sup>
+            <m:r>
+              <m:rPr>
+                <m:sty m:val="p"/>
+              </m:rPr>
+              <m:t>∘</m:t>
+            </m:r>
+          </m:sup>
+        </m:sSup>
+      </m:oMath>
+      <w:r>
+        <w:t xml:space="preserve"> </w:t>
+      </w:r>
+      <w:r>
+        <w:t xml:space="preserve">and dynamic loft</w:t>
+      </w:r>
+      <w:r>
+        <w:t xml:space="preserve"> </w:t>
+      </w:r>
+      <m:oMath>
+        <m:sSup>
+          <m:e>
+            <m:r>
+              <m:t>12</m:t>
+            </m:r>
+          </m:e>
+          <m:sup>
+            <m:r>
+              <m:rPr>
+                <m:sty m:val="p"/>
+              </m:rPr>
+              <m:t>∘</m:t>
+            </m:r>
+          </m:sup>
+        </m:sSup>
+      </m:oMath>
+      <w:r>
+        <w:t xml:space="preserve">. Target and up use default unit axes.</w:t>
+      </w:r>
+      <w:r>
+        <w:t xml:space="preserve"> </w:t>
+      </w:r>
+      <w:r>
+        <w:t xml:space="preserve">The fixture tolerance is</w:t>
+      </w:r>
+      <w:r>
+        <w:t xml:space="preserve"> </w:t>
+      </w:r>
+      <m:oMath>
+        <m:sSup>
+          <m:e>
+            <m:r>
+              <m:t>10</m:t>
+            </m:r>
+          </m:e>
+          <m:sup>
+            <m:r>
+              <m:rPr>
+                <m:sty m:val="p"/>
+              </m:rPr>
+              <m:t>−</m:t>
+            </m:r>
+            <m:r>
+              <m:t>9</m:t>
+            </m:r>
+          </m:sup>
+        </m:sSup>
+      </m:oMath>
+      <w:r>
+        <w:t xml:space="preserve"> </w:t>
+      </w:r>
+      <w:r>
+        <w:t xml:space="preserve">degree.</w:t>
+      </w:r>
+    </w:p>
+    <w:bookmarkEnd w:id="84"/>
+    <w:bookmarkStart w:id="85" w:name="example-results"/>
+    <w:p>
+      <w:pPr>
+        <w:pStyle w:val="Heading3"/>
+      </w:pPr>
+      <w:r>
+        <w:t xml:space="preserve">Example Results</w:t>
+      </w:r>
+    </w:p>
+    <w:p>
+      <w:pPr>
+        <w:pStyle w:val="FirstParagraph"/>
+      </w:pPr>
+      <w:r>
+        <w:t xml:space="preserve">The dot product is</w:t>
+      </w:r>
+      <w:r>
+        <w:t xml:space="preserve"> </w:t>
+      </w:r>
+      <m:oMath>
+        <m:r>
+          <m:rPr>
+            <m:sty m:val="p"/>
+          </m:rPr>
+          <m:t>cos</m:t>
+        </m:r>
+        <m:sSup>
+          <m:e>
+            <m:r>
+              <m:t>15</m:t>
+            </m:r>
+          </m:e>
+          <m:sup>
+            <m:r>
+              <m:rPr>
+                <m:sty m:val="p"/>
+              </m:rPr>
+              <m:t>∘</m:t>
+            </m:r>
+          </m:sup>
+        </m:sSup>
+      </m:oMath>
+      <w:r>
+        <w:t xml:space="preserve">, so spin loft is</w:t>
+      </w:r>
+      <w:r>
+        <w:t xml:space="preserve"> </w:t>
+      </w:r>
+      <m:oMath>
+        <m:sSup>
+          <m:e>
+            <m:r>
+              <m:t>15</m:t>
+            </m:r>
+          </m:e>
+          <m:sup>
+            <m:r>
+              <m:rPr>
+                <m:sty m:val="p"/>
+              </m:rPr>
+              <m:t>∘</m:t>
+            </m:r>
+          </m:sup>
+        </m:sSup>
+      </m:oMath>
+      <w:r>
+        <w:t xml:space="preserve">. Dynamic loft</w:t>
+      </w:r>
+      <w:r>
+        <w:t xml:space="preserve"> </w:t>
+      </w:r>
+      <w:r>
+        <w:t xml:space="preserve">minus attack is</w:t>
+      </w:r>
+      <w:r>
+        <w:t xml:space="preserve"> </w:t>
+      </w:r>
+      <m:oMath>
+        <m:r>
+          <m:t>12</m:t>
+        </m:r>
+        <m:r>
+          <m:rPr>
+            <m:sty m:val="p"/>
+          </m:rPr>
+          <m:t>−</m:t>
+        </m:r>
+        <m:r>
+          <m:rPr>
+            <m:sty m:val="p"/>
+          </m:rPr>
+          <m:t>(</m:t>
+        </m:r>
+        <m:r>
+          <m:rPr>
+            <m:sty m:val="p"/>
+          </m:rPr>
+          <m:t>−</m:t>
+        </m:r>
+        <m:r>
+          <m:t>3</m:t>
+        </m:r>
+        <m:r>
+          <m:rPr>
+            <m:sty m:val="p"/>
+          </m:rPr>
+          <m:t>)</m:t>
+        </m:r>
+        <m:r>
+          <m:rPr>
+            <m:sty m:val="p"/>
+          </m:rPr>
+          <m:t>=</m:t>
+        </m:r>
+        <m:sSup>
+          <m:e>
+            <m:r>
+              <m:t>15</m:t>
+            </m:r>
+          </m:e>
+          <m:sup>
+            <m:r>
+              <m:rPr>
+                <m:sty m:val="p"/>
+              </m:rPr>
+              <m:t>∘</m:t>
+            </m:r>
+          </m:sup>
+        </m:sSup>
+      </m:oMath>
+      <w:r>
+        <w:t xml:space="preserve">, making planar residual zero.</w:t>
+      </w:r>
+      <w:r>
+        <w:t xml:space="preserve"> </w:t>
+      </w:r>
+      <w:r>
+        <w:t xml:space="preserve">Travel-times-face points along right, giving</w:t>
+      </w:r>
+      <w:r>
+        <w:t xml:space="preserve"> </w:t>
+      </w:r>
+      <m:oMath>
+        <m:acc>
+          <m:accPr>
+            <m:chr m:val="̂"/>
+          </m:accPr>
+          <m:e>
+            <m:r>
+              <m:rPr>
+                <m:sty m:val="b"/>
+              </m:rPr>
+              <m:t>d</m:t>
+            </m:r>
+          </m:e>
+        </m:acc>
+        <m:r>
+          <m:rPr>
+            <m:sty m:val="p"/>
+          </m:rPr>
+          <m:t>=</m:t>
+        </m:r>
+        <m:r>
+          <m:rPr>
+            <m:sty m:val="p"/>
+          </m:rPr>
+          <m:t>(</m:t>
+        </m:r>
+        <m:r>
+          <m:t>0</m:t>
+        </m:r>
+        <m:r>
+          <m:rPr>
+            <m:sty m:val="p"/>
+          </m:rPr>
+          <m:t>,</m:t>
+        </m:r>
+        <m:r>
+          <m:t>0</m:t>
+        </m:r>
+        <m:r>
+          <m:rPr>
+            <m:sty m:val="p"/>
+          </m:rPr>
+          <m:t>,</m:t>
+        </m:r>
+        <m:r>
+          <m:t>1</m:t>
+        </m:r>
+        <m:r>
+          <m:rPr>
+            <m:sty m:val="p"/>
+          </m:rPr>
+          <m:t>)</m:t>
+        </m:r>
+      </m:oMath>
+      <w:r>
+        <w:t xml:space="preserve">, tilt</w:t>
+      </w:r>
+      <w:r>
+        <w:t xml:space="preserve"> </w:t>
+      </w:r>
+      <m:oMath>
+        <m:sSup>
+          <m:e>
+            <m:r>
+              <m:t>0</m:t>
+            </m:r>
+          </m:e>
+          <m:sup>
+            <m:r>
+              <m:rPr>
+                <m:sty m:val="p"/>
+              </m:rPr>
+              <m:t>∘</m:t>
+            </m:r>
+          </m:sup>
+        </m:sSup>
+      </m:oMath>
+      <w:r>
+        <w:t xml:space="preserve">, inclination</w:t>
+      </w:r>
+      <w:r>
+        <w:t xml:space="preserve"> </w:t>
+      </w:r>
+      <m:oMath>
+        <m:sSup>
+          <m:e>
+            <m:r>
+              <m:t>90</m:t>
+            </m:r>
+          </m:e>
+          <m:sup>
+            <m:r>
+              <m:rPr>
+                <m:sty m:val="p"/>
+              </m:rPr>
+              <m:t>∘</m:t>
+            </m:r>
+          </m:sup>
+        </m:sSup>
+      </m:oMath>
+      <w:r>
+        <w:t xml:space="preserve">, and ground</w:t>
+      </w:r>
+      <w:r>
+        <w:t xml:space="preserve"> </w:t>
+      </w:r>
+      <w:r>
+        <w:t xml:space="preserve">intersection at</w:t>
+      </w:r>
+      <w:r>
+        <w:t xml:space="preserve"> </w:t>
+      </w:r>
+      <m:oMath>
+        <m:sSup>
+          <m:e>
+            <m:r>
+              <m:t>0</m:t>
+            </m:r>
+          </m:e>
+          <m:sup>
+            <m:r>
+              <m:rPr>
+                <m:sty m:val="p"/>
+              </m:rPr>
+              <m:t>∘</m:t>
+            </m:r>
+          </m:sup>
+        </m:sSup>
+      </m:oMath>
+      <w:r>
+        <w:t xml:space="preserve">. Status is</w:t>
+      </w:r>
+      <w:r>
+        <w:t xml:space="preserve"> </w:t>
+      </w:r>
+      <w:r>
+        <w:rPr>
+          <w:rStyle w:val="VerbatimChar"/>
+        </w:rPr>
+        <w:t xml:space="preserve">defined</w:t>
+      </w:r>
+      <w:r>
+        <w:t xml:space="preserve">. Values come from the</w:t>
+      </w:r>
+      <w:r>
+        <w:t xml:space="preserve"> </w:t>
+      </w:r>
+      <w:r>
+        <w:t xml:space="preserve">cross-client golden fixture and executable Python test, not renderer-only text.</w:t>
+      </w:r>
+    </w:p>
+    <w:bookmarkEnd w:id="85"/>
+    <w:bookmarkEnd w:id="86"/>
+    <w:bookmarkStart w:id="89" w:name="references-and-provenance"/>
+    <w:p>
+      <w:pPr>
+        <w:pStyle w:val="Heading2"/>
+      </w:pPr>
+      <w:r>
+        <w:t xml:space="preserve">References and Provenance</w:t>
+      </w:r>
+    </w:p>
+    <w:bookmarkStart w:id="87" w:name="references-1"/>
+    <w:p>
+      <w:pPr>
+        <w:pStyle w:val="Heading3"/>
+      </w:pPr>
+      <w:r>
+        <w:t xml:space="preserve">References</w:t>
+      </w:r>
+    </w:p>
+    <w:p>
+      <w:pPr>
+        <w:pStyle w:val="FirstParagraph"/>
+      </w:pPr>
+      <w:r>
+        <w:t xml:space="preserve">Primary implementation authority is exact source at</w:t>
+      </w:r>
+      <w:r>
+        <w:t xml:space="preserve"> </w:t>
+      </w:r>
+      <w:r>
+        <w:rPr>
+          <w:rStyle w:val="VerbatimChar"/>
+        </w:rPr>
+        <w:t xml:space="preserve">916fb9f27f486486f0c071dcc6f15f81f68ecb18</w:t>
+      </w:r>
+      <w:r>
+        <w:t xml:space="preserve">. Numerical expectations come</w:t>
+      </w:r>
+      <w:r>
+        <w:t xml:space="preserve"> </w:t>
+      </w:r>
+      <w:r>
+        <w:t xml:space="preserve">from</w:t>
+      </w:r>
+      <w:r>
+        <w:t xml:space="preserve"> </w:t>
+      </w:r>
+      <w:r>
+        <w:rPr>
+          <w:rStyle w:val="VerbatimChar"/>
+        </w:rPr>
+        <w:t xml:space="preserve">dplane-golden-v1</w:t>
+      </w:r>
+      <w:r>
+        <w:t xml:space="preserve">, with independent behavior exercised by the tests in</w:t>
+      </w:r>
+      <w:r>
+        <w:t xml:space="preserve"> </w:t>
+      </w:r>
+      <w:r>
+        <w:t xml:space="preserve">the registry. External scientific literature has not completed review, so this</w:t>
+      </w:r>
+      <w:r>
+        <w:t xml:space="preserve"> </w:t>
+      </w:r>
+      <w:r>
+        <w:t xml:space="preserve">chapter makes no literature-backed ball-flight or equipment-performance claim.</w:t>
+      </w:r>
+    </w:p>
+    <w:bookmarkEnd w:id="87"/>
+    <w:bookmarkStart w:id="88" w:name="provenance"/>
+    <w:p>
+      <w:pPr>
+        <w:pStyle w:val="Heading3"/>
+      </w:pPr>
+      <w:r>
+        <w:t xml:space="preserve">Provenance</w:t>
+      </w:r>
+    </w:p>
+    <w:p>
+      <w:pPr>
+        <w:pStyle w:val="FirstParagraph"/>
+      </w:pPr>
+      <w:r>
+        <w:t xml:space="preserve">The calculation registry records method version</w:t>
+      </w:r>
+      <w:r>
+        <w:t xml:space="preserve"> </w:t>
+      </w:r>
+      <w:r>
+        <w:rPr>
+          <w:rStyle w:val="VerbatimChar"/>
+        </w:rPr>
+        <w:t xml:space="preserve">1.0.0</w:t>
+      </w:r>
+      <w:r>
+        <w:t xml:space="preserve">, symbols and commit,</w:t>
+      </w:r>
+      <w:r>
+        <w:t xml:space="preserve"> </w:t>
+      </w:r>
+      <w:r>
+        <w:t xml:space="preserve">source digest, inputs, units, contracts, equation anchors, tests, artifacts,</w:t>
+      </w:r>
+      <w:r>
+        <w:t xml:space="preserve"> </w:t>
+      </w:r>
+      <w:r>
+        <w:t xml:space="preserve">limitations, and approval blockers. D4 coverage separately records markerless</w:t>
+      </w:r>
+      <w:r>
+        <w:t xml:space="preserve"> </w:t>
+      </w:r>
+      <w:r>
+        <w:t xml:space="preserve">as blocked. Generated HTML, LaTeX, PDF, and DOCX derive from canonical QMD via</w:t>
+      </w:r>
+      <w:r>
+        <w:t xml:space="preserve"> </w:t>
+      </w:r>
+      <w:r>
+        <w:t xml:space="preserve">the pinned D2 toolchain and remain</w:t>
+      </w:r>
+      <w:r>
+        <w:t xml:space="preserve"> </w:t>
+      </w:r>
+      <w:r>
+        <w:rPr>
+          <w:rStyle w:val="VerbatimChar"/>
+        </w:rPr>
+        <w:t xml:space="preserve">generated-unapproved</w:t>
+      </w:r>
+      <w:r>
+        <w:t xml:space="preserve">.</w:t>
+      </w:r>
+    </w:p>
+    <w:bookmarkEnd w:id="88"/>
+    <w:bookmarkEnd w:id="89"/>
+    <w:bookmarkStart w:id="96" w:name="revision-history"/>
+    <w:p>
+      <w:pPr>
+        <w:pStyle w:val="Heading2"/>
+      </w:pPr>
+      <w:r>
+        <w:t xml:space="preserve">Revision History</w:t>
+      </w:r>
+    </w:p>
+    <w:bookmarkStart w:id="95" w:name="revision-record"/>
+    <w:p>
+      <w:pPr>
+        <w:pStyle w:val="Heading3"/>
+      </w:pPr>
+      <w:r>
+        <w:t xml:space="preserve">Revision Record</w:t>
+      </w:r>
+    </w:p>
+    <w:p>
+      <w:pPr>
+        <w:pStyle w:val="FirstParagraph"/>
+      </w:pPr>
+      <w:r>
+        <w:t xml:space="preserve">Version 1.0.0, dated 2026-08-26, registers the first Tools textbook exemplar:</w:t>
+      </w:r>
+      <w:r>
+        <w:t xml:space="preserve"> </w:t>
+      </w:r>
+      <w:r>
+        <w:t xml:space="preserve">frame-explicit D-plane geometry shared by swing simulation and Rate of Closure,</w:t>
+      </w:r>
+      <w:r>
+        <w:t xml:space="preserve"> </w:t>
+      </w:r>
+      <w:r>
+        <w:t xml:space="preserve">with executable golden values and fail-closed markerless dependency status.</w:t>
+      </w:r>
+      <w:r>
+        <w:t xml:space="preserve"> </w:t>
+      </w:r>
+      <w:r>
+        <w:t xml:space="preserve">Later revisions must update the descriptor, method version when mathematics or</w:t>
+      </w:r>
+      <w:r>
+        <w:t xml:space="preserve"> </w:t>
+      </w:r>
+      <w:r>
+        <w:t xml:space="preserve">behavior changes, tests, provenance, limitations, and every generated artifact.</w:t>
+      </w:r>
+    </w:p>
+    <w:bookmarkStart w:id="94" w:name="refs"/>
+    <w:bookmarkStart w:id="91" w:name="ref-pandoc-manual"/>
     <w:p>
       <w:pPr>
         <w:pStyle w:val="Bibliography"/>
@@ -2217,7 +6574,7 @@
       <w:r>
         <w:t xml:space="preserve"> </w:t>
       </w:r>
-      <w:hyperlink r:id="rId45">
+      <w:hyperlink r:id="rId90">
         <w:r>
           <w:rPr>
             <w:rStyle w:val="Hyperlink"/>
@@ -2229,8 +6586,8 @@
         <w:t xml:space="preserve">.</w:t>
       </w:r>
     </w:p>
-    <w:bookmarkEnd w:id="46"/>
-    <w:bookmarkStart w:id="48" w:name="ref-quarto-guide"/>
+    <w:bookmarkEnd w:id="91"/>
+    <w:bookmarkStart w:id="93" w:name="ref-quarto-guide"/>
     <w:p>
       <w:pPr>
         <w:pStyle w:val="Bibliography"/>
@@ -2254,7 +6611,7 @@
       <w:r>
         <w:t xml:space="preserve"> </w:t>
       </w:r>
-      <w:hyperlink r:id="rId47">
+      <w:hyperlink r:id="rId92">
         <w:r>
           <w:rPr>
             <w:rStyle w:val="Hyperlink"/>
@@ -2266,10 +6623,11 @@
         <w:t xml:space="preserve">.</w:t>
       </w:r>
     </w:p>
-    <w:bookmarkEnd w:id="48"/>
-    <w:bookmarkEnd w:id="49"/>
-    <w:bookmarkEnd w:id="50"/>
-    <w:bookmarkEnd w:id="51"/>
+    <w:bookmarkEnd w:id="93"/>
+    <w:bookmarkEnd w:id="94"/>
+    <w:bookmarkEnd w:id="95"/>
+    <w:bookmarkEnd w:id="96"/>
+    <w:bookmarkEnd w:id="97"/>
     <w:sectPr>
       <w:headerReference r:id="rId9" w:type="default"/>
       <w:footerReference r:id="rId10" w:type="default"/>
@@ -2686,6 +7044,91 @@
       <w:rPr>
         <w:rFonts w:ascii="Wingdings" w:hAnsi="Wingdings" w:cs="Wingdings" w:hint="default"/>
       </w:rPr>
+    </w:lvl>
+  </w:abstractNum>
+  <w:abstractNum w:abstractNumId="99411">
+    <w:nsid w:val="00A99411"/>
+    <w:multiLevelType w:val="multilevel"/>
+    <w:lvl w:ilvl="0">
+      <w:start w:val="1"/>
+      <w:numFmt w:val="decimal"/>
+      <w:lvlText w:val="%1."/>
+      <w:lvlJc w:val="left"/>
+      <w:pPr>
+        <w:ind w:left="720" w:hanging="360"/>
+      </w:pPr>
+    </w:lvl>
+    <w:lvl w:ilvl="1">
+      <w:start w:val="1"/>
+      <w:numFmt w:val="decimal"/>
+      <w:lvlText w:val="%2."/>
+      <w:lvlJc w:val="left"/>
+      <w:pPr>
+        <w:ind w:left="1440" w:hanging="360"/>
+      </w:pPr>
+    </w:lvl>
+    <w:lvl w:ilvl="2">
+      <w:start w:val="1"/>
+      <w:numFmt w:val="decimal"/>
+      <w:lvlText w:val="%3."/>
+      <w:lvlJc w:val="left"/>
+      <w:pPr>
+        <w:ind w:left="2160" w:hanging="360"/>
+      </w:pPr>
+    </w:lvl>
+    <w:lvl w:ilvl="3">
+      <w:start w:val="1"/>
+      <w:numFmt w:val="decimal"/>
+      <w:lvlText w:val="%4."/>
+      <w:lvlJc w:val="left"/>
+      <w:pPr>
+        <w:ind w:left="2880" w:hanging="360"/>
+      </w:pPr>
+    </w:lvl>
+    <w:lvl w:ilvl="4">
+      <w:start w:val="1"/>
+      <w:numFmt w:val="decimal"/>
+      <w:lvlText w:val="%5."/>
+      <w:lvlJc w:val="left"/>
+      <w:pPr>
+        <w:ind w:left="3600" w:hanging="360"/>
+      </w:pPr>
+    </w:lvl>
+    <w:lvl w:ilvl="5">
+      <w:start w:val="1"/>
+      <w:numFmt w:val="decimal"/>
+      <w:lvlText w:val="%6."/>
+      <w:lvlJc w:val="left"/>
+      <w:pPr>
+        <w:ind w:left="4320" w:hanging="360"/>
+      </w:pPr>
+    </w:lvl>
+    <w:lvl w:ilvl="6">
+      <w:start w:val="1"/>
+      <w:numFmt w:val="decimal"/>
+      <w:lvlText w:val="%7."/>
+      <w:lvlJc w:val="left"/>
+      <w:pPr>
+        <w:ind w:left="5040" w:hanging="360"/>
+      </w:pPr>
+    </w:lvl>
+    <w:lvl w:ilvl="7">
+      <w:start w:val="1"/>
+      <w:numFmt w:val="decimal"/>
+      <w:lvlText w:val="%8."/>
+      <w:lvlJc w:val="left"/>
+      <w:pPr>
+        <w:ind w:left="5760" w:hanging="360"/>
+      </w:pPr>
+    </w:lvl>
+    <w:lvl w:ilvl="8">
+      <w:start w:val="1"/>
+      <w:numFmt w:val="decimal"/>
+      <w:lvlText w:val="%9."/>
+      <w:lvlJc w:val="left"/>
+      <w:pPr>
+        <w:ind w:left="6480" w:hanging="360"/>
+      </w:pPr>
     </w:lvl>
   </w:abstractNum>
   <w:num w:numId="1">
@@ -2720,6 +7163,66 @@
   </w:num>
   <w:num w:numId="1001">
     <w:abstractNumId w:val="991"/>
+  </w:num>
+  <w:num w:numId="1002">
+    <w:abstractNumId w:val="99411"/>
+    <w:lvlOverride w:ilvl="0">
+      <w:startOverride w:val="1"/>
+    </w:lvlOverride>
+    <w:lvlOverride w:ilvl="1">
+      <w:startOverride w:val="1"/>
+    </w:lvlOverride>
+    <w:lvlOverride w:ilvl="2">
+      <w:startOverride w:val="1"/>
+    </w:lvlOverride>
+    <w:lvlOverride w:ilvl="3">
+      <w:startOverride w:val="1"/>
+    </w:lvlOverride>
+    <w:lvlOverride w:ilvl="4">
+      <w:startOverride w:val="1"/>
+    </w:lvlOverride>
+    <w:lvlOverride w:ilvl="5">
+      <w:startOverride w:val="1"/>
+    </w:lvlOverride>
+    <w:lvlOverride w:ilvl="6">
+      <w:startOverride w:val="1"/>
+    </w:lvlOverride>
+    <w:lvlOverride w:ilvl="7">
+      <w:startOverride w:val="1"/>
+    </w:lvlOverride>
+    <w:lvlOverride w:ilvl="8">
+      <w:startOverride w:val="1"/>
+    </w:lvlOverride>
+  </w:num>
+  <w:num w:numId="1003">
+    <w:abstractNumId w:val="99411"/>
+    <w:lvlOverride w:ilvl="0">
+      <w:startOverride w:val="1"/>
+    </w:lvlOverride>
+    <w:lvlOverride w:ilvl="1">
+      <w:startOverride w:val="1"/>
+    </w:lvlOverride>
+    <w:lvlOverride w:ilvl="2">
+      <w:startOverride w:val="1"/>
+    </w:lvlOverride>
+    <w:lvlOverride w:ilvl="3">
+      <w:startOverride w:val="1"/>
+    </w:lvlOverride>
+    <w:lvlOverride w:ilvl="4">
+      <w:startOverride w:val="1"/>
+    </w:lvlOverride>
+    <w:lvlOverride w:ilvl="5">
+      <w:startOverride w:val="1"/>
+    </w:lvlOverride>
+    <w:lvlOverride w:ilvl="6">
+      <w:startOverride w:val="1"/>
+    </w:lvlOverride>
+    <w:lvlOverride w:ilvl="7">
+      <w:startOverride w:val="1"/>
+    </w:lvlOverride>
+    <w:lvlOverride w:ilvl="8">
+      <w:startOverride w:val="1"/>
+    </w:lvlOverride>
   </w:num>
 </w:numbering>
 </file>

</xml_diff>